<commit_message>
docs: rewrite chapter 3 and 4 report with detailed required sections
Agent-Logs-Url: https://github.com/tdtrong945/btlweb/sessions/638d0b3f-f7db-4977-9112-17d2ae0511d2

Co-authored-by: tdtrong945 <257135914+tdtrong945@users.noreply.github.com>
</commit_message>
<xml_diff>
--- a/BaoCao_Chuong3_Chuong4_PetCareHub.docx
+++ b/BaoCao_Chuong3_Chuong4_PetCareHub.docx
@@ -4,1838 +4,676 @@
   <w:body>
     <w:p>
       <w:pPr>
-        <w:jc w:val="center"/>
+        <w:pStyle w:val="Heading1"/>
       </w:pPr>
       <w:r>
-        <w:rPr>
-          <w:rFonts w:ascii="Times New Roman" w:hAnsi="Times New Roman" w:eastAsia="Times New Roman"/>
-          <w:b/>
-          <w:sz w:val="36"/>
-        </w:rPr>
-        <w:t>BÁO CÁO CHƯƠNG 3 VÀ CHƯƠNG 4</w:t>
-        <w:br/>
-        <w:t>HỆ THỐNG QUẢN LÝ PETCAREHUB</w:t>
-      </w:r>
-    </w:p>
-    <w:p/>
-    <w:p>
-      <w:pPr>
-        <w:jc w:val="left"/>
-      </w:pPr>
-      <w:r>
-        <w:rPr>
-          <w:rFonts w:ascii="Times New Roman" w:hAnsi="Times New Roman" w:eastAsia="Times New Roman"/>
-          <w:b/>
-          <w:sz w:val="32"/>
-        </w:rPr>
-        <w:t>Chương 3. Thiết kế hệ thống</w:t>
+        <w:t>BÁO CÁO CHƯƠNG 3 VÀ CHƯƠNG 4 - HỆ THỐNG PETCAREHUB</w:t>
       </w:r>
     </w:p>
     <w:p>
       <w:pPr>
-        <w:jc w:val="left"/>
+        <w:pStyle w:val="Heading2"/>
       </w:pPr>
       <w:r>
-        <w:rPr>
-          <w:rFonts w:ascii="Times New Roman" w:hAnsi="Times New Roman" w:eastAsia="Times New Roman"/>
-          <w:b/>
-          <w:sz w:val="28"/>
-        </w:rPr>
-        <w:t>3.1. Xây dựng giao diện và các chức năng cho hệ thống</w:t>
+        <w:t>CHƯƠNG 3. THIẾT KẾ HỆ THỐNG</w:t>
       </w:r>
     </w:p>
     <w:p>
       <w:pPr>
-        <w:jc w:val="both"/>
+        <w:pStyle w:val="Heading3"/>
       </w:pPr>
       <w:r>
-        <w:rPr>
-          <w:rFonts w:ascii="Times New Roman" w:hAnsi="Times New Roman" w:eastAsia="Times New Roman"/>
-          <w:b w:val="0"/>
-          <w:sz w:val="26"/>
-        </w:rPr>
-        <w:t>Hệ thống PetCareHub được thiết kế theo mô hình ASP.NET Core MVC, tách lớp giao diện (Views), điều phối nghiệp vụ (Controllers), và xử lý nghiệp vụ chuyên biệt (Services). Việc tách lớp giúp dự án dễ mở rộng, dễ bảo trì, đồng thời đảm bảo mỗi nhóm chức năng có trách nhiệm rõ ràng.</w:t>
+        <w:t>3.1. Giao diện và chức năng của hệ thống</w:t>
+      </w:r>
+    </w:p>
+    <w:p>
+      <w:r>
+        <w:t>Hệ thống PetCareHub được thiết kế theo mô hình ASP.NET Core MVC với các thành phần chính: Controllers xử lý request, Views hiển thị giao diện, Services xử lý nghiệp vụ và EF Core kết nối SQL Server. Thiết kế này bảo đảm tính tách lớp, dễ kiểm soát phân quyền và thuận lợi cho mở rộng chức năng theo vai trò người dùng.</w:t>
+      </w:r>
+    </w:p>
+    <w:p>
+      <w:r>
+        <w:t>Cơ chế phân quyền dựa trên vai trò Customer/Staff/Admin cùng Authorize Policy giúp kiểm soát truy cập đến từng module: Client tập trung đặt lịch, nhận nuôi, theo dõi hồ sơ; Staff vận hành nghiệp vụ; Admin quản trị và giám sát dữ liệu toàn hệ thống.</w:t>
       </w:r>
     </w:p>
     <w:p>
       <w:pPr>
-        <w:jc w:val="both"/>
+        <w:pStyle w:val="Heading4"/>
       </w:pPr>
       <w:r>
-        <w:rPr>
-          <w:rFonts w:ascii="Times New Roman" w:hAnsi="Times New Roman" w:eastAsia="Times New Roman"/>
-          <w:b w:val="0"/>
-          <w:sz w:val="26"/>
-        </w:rPr>
-        <w:t>Các nhóm chức năng chính đã triển khai gồm: (1) quản lý tài khoản và phân quyền đăng nhập; (2) quản lý thú cưng và hình ảnh; (3) quản lý lịch hẹn khám/chăm sóc; (4) xử lý yêu cầu nhận nuôi và hợp đồng; (5) quản lý hồ sơ y tế, tiêm chủng; (6) quản lý dịch vụ, danh mục dịch vụ và thanh toán; (7) quản trị hệ thống cho nhân viên và quản trị viên.</w:t>
+        <w:t>3.1.1. Giao diện chào mừng</w:t>
+      </w:r>
+    </w:p>
+    <w:p>
+      <w:r>
+        <w:t>Màn hình: Home/Index.</w:t>
       </w:r>
     </w:p>
     <w:p>
       <w:pPr>
-        <w:jc w:val="both"/>
+        <w:pStyle w:val="ListBullet"/>
       </w:pPr>
       <w:r>
-        <w:rPr>
-          <w:rFonts w:ascii="Times New Roman" w:hAnsi="Times New Roman" w:eastAsia="Times New Roman"/>
-          <w:b w:val="0"/>
-          <w:sz w:val="26"/>
-        </w:rPr>
-        <w:t>Về giao diện, hệ thống cung cấp các màn hình nghiệp vụ theo vai trò người dùng. Khách hàng có thể xem thú cưng, đặt lịch, gửi yêu cầu nhận nuôi và theo dõi thanh toán. Nhân viên và Admin có thêm quyền chỉnh sửa dữ liệu, duyệt yêu cầu nhận nuôi, cập nhật hồ sơ y tế/tiêm chủng, cấu hình dịch vụ và giám sát vận hành tổng thể.</w:t>
+        <w:t>Hiển thị thống kê nhanh: số lượng thú cưng, số chi nhánh, số nhân sự chăm sóc.</w:t>
       </w:r>
     </w:p>
     <w:p>
       <w:pPr>
-        <w:jc w:val="both"/>
+        <w:pStyle w:val="ListBullet"/>
       </w:pPr>
       <w:r>
-        <w:rPr>
-          <w:rFonts w:ascii="Times New Roman" w:hAnsi="Times New Roman" w:eastAsia="Times New Roman"/>
-          <w:b/>
-          <w:sz w:val="26"/>
-        </w:rPr>
-        <w:t>Mô hình kiến trúc tổng thể:</w:t>
+        <w:t>Hiển thị nhóm dịch vụ nổi bật (lọc theo trạng thái Active) để định hướng người dùng ngay khi truy cập.</w:t>
+      </w:r>
+    </w:p>
+    <w:p>
+      <w:pPr>
+        <w:pStyle w:val="ListBullet"/>
+      </w:pPr>
+      <w:r>
+        <w:t>Cung cấp phần testimonials và thông tin thương hiệu giúp tăng mức độ tin cậy trước khi người dùng đăng ký/đăng nhập.</w:t>
+      </w:r>
+    </w:p>
+    <w:p>
+      <w:pPr>
+        <w:pStyle w:val="ListBullet"/>
+      </w:pPr>
+      <w:r>
+        <w:t>Thanh điều hướng dẫn đến các chức năng chính: tổng quan, dịch vụ, thú cưng, lịch hẹn, hồ sơ cá nhân (tùy trạng thái đăng nhập).</w:t>
+      </w:r>
+    </w:p>
+    <w:p>
+      <w:pPr>
+        <w:pStyle w:val="Heading4"/>
+      </w:pPr>
+      <w:r>
+        <w:t>3.1.2. Giao diện đăng nhập</w:t>
       </w:r>
     </w:p>
     <w:p>
       <w:r>
-        <w:drawing>
-          <wp:inline xmlns:a="http://schemas.openxmlformats.org/drawingml/2006/main" xmlns:pic="http://schemas.openxmlformats.org/drawingml/2006/picture">
-            <wp:extent cx="5943600" cy="3396343"/>
-            <wp:docPr id="1" name="Picture 1"/>
-            <wp:cNvGraphicFramePr>
-              <a:graphicFrameLocks noChangeAspect="1"/>
-            </wp:cNvGraphicFramePr>
-            <a:graphic>
-              <a:graphicData uri="http://schemas.openxmlformats.org/drawingml/2006/picture">
-                <pic:pic>
-                  <pic:nvPicPr>
-                    <pic:cNvPr id="0" name="hinh_3_1_kien_truc_tong_the.png"/>
-                    <pic:cNvPicPr/>
-                  </pic:nvPicPr>
-                  <pic:blipFill>
-                    <a:blip r:embed="rId9"/>
-                    <a:stretch>
-                      <a:fillRect/>
-                    </a:stretch>
-                  </pic:blipFill>
-                  <pic:spPr>
-                    <a:xfrm>
-                      <a:off x="0" y="0"/>
-                      <a:ext cx="5943600" cy="3396343"/>
-                    </a:xfrm>
-                    <a:prstGeom prst="rect"/>
-                  </pic:spPr>
-                </pic:pic>
-              </a:graphicData>
-            </a:graphic>
-          </wp:inline>
-        </w:drawing>
+        <w:t>Màn hình: Account/Login và Account/Register.</w:t>
       </w:r>
     </w:p>
     <w:p>
       <w:pPr>
-        <w:jc w:val="center"/>
+        <w:pStyle w:val="ListBullet"/>
       </w:pPr>
       <w:r>
-        <w:rPr>
-          <w:rFonts w:ascii="Times New Roman" w:hAnsi="Times New Roman" w:eastAsia="Times New Roman"/>
-          <w:i/>
-          <w:sz w:val="24"/>
-        </w:rPr>
-        <w:t>Hình 3.1. Kiến trúc tổng thể hệ thống</w:t>
+        <w:t>Form đăng nhập xác thực Username/Password, hỗ trợ RememberMe và điều hướng về trang trước qua ReturnUrl.</w:t>
       </w:r>
     </w:p>
     <w:p>
       <w:pPr>
-        <w:jc w:val="both"/>
+        <w:pStyle w:val="ListBullet"/>
       </w:pPr>
       <w:r>
-        <w:rPr>
-          <w:rFonts w:ascii="Times New Roman" w:hAnsi="Times New Roman" w:eastAsia="Times New Roman"/>
-          <w:b w:val="0"/>
-          <w:sz w:val="26"/>
-        </w:rPr>
-        <w:t>Kiến trúc trên cho thấy luồng chính: người dùng thao tác tại giao diện -&gt; controller tiếp nhận request -&gt; service xử lý logic nghiệp vụ -&gt; EF Core làm việc với SQL Server. Bên cạnh đó, mô-đun xác thực và phân quyền bằng cookie bảo vệ các chức năng quan trọng.</w:t>
+        <w:t>Form đăng ký kiểm tra dữ liệu bắt buộc, chuẩn hóa chuỗi nhập, kiểm tra trùng username/email trước khi tạo tài khoản.</w:t>
       </w:r>
     </w:p>
     <w:p>
       <w:pPr>
-        <w:jc w:val="both"/>
+        <w:pStyle w:val="ListBullet"/>
       </w:pPr>
       <w:r>
-        <w:rPr>
-          <w:rFonts w:ascii="Times New Roman" w:hAnsi="Times New Roman" w:eastAsia="Times New Roman"/>
-          <w:b/>
-          <w:sz w:val="26"/>
-        </w:rPr>
-        <w:t>Use Case tổng quan theo vai trò:</w:t>
+        <w:t>Sau đăng nhập thành công, hệ thống tạo cookie xác thực, gắn claims (UserId, FullName, Role) và phân luồng theo vai trò.</w:t>
+      </w:r>
+    </w:p>
+    <w:p>
+      <w:pPr>
+        <w:pStyle w:val="ListBullet"/>
+      </w:pPr>
+      <w:r>
+        <w:t>Người dùng đã đăng nhập sẽ được chuyển hướng hợp lý: Admin/Staff -&gt; Management/System, Client -&gt; Home/Index.</w:t>
+      </w:r>
+    </w:p>
+    <w:p>
+      <w:pPr>
+        <w:pStyle w:val="ListBullet"/>
+      </w:pPr>
+      <w:r>
+        <w:t>Có màn hình AccessDenied để xử lý các truy cập vượt quyền.</w:t>
+      </w:r>
+    </w:p>
+    <w:p>
+      <w:pPr>
+        <w:pStyle w:val="Heading4"/>
+      </w:pPr>
+      <w:r>
+        <w:t>3.1.3. Giao diện Admin – Quản lý</w:t>
       </w:r>
     </w:p>
     <w:p>
       <w:r>
-        <w:drawing>
-          <wp:inline xmlns:a="http://schemas.openxmlformats.org/drawingml/2006/main" xmlns:pic="http://schemas.openxmlformats.org/drawingml/2006/picture">
-            <wp:extent cx="5943600" cy="3820886"/>
-            <wp:docPr id="2" name="Picture 2"/>
-            <wp:cNvGraphicFramePr>
-              <a:graphicFrameLocks noChangeAspect="1"/>
-            </wp:cNvGraphicFramePr>
-            <a:graphic>
-              <a:graphicData uri="http://schemas.openxmlformats.org/drawingml/2006/picture">
-                <pic:pic>
-                  <pic:nvPicPr>
-                    <pic:cNvPr id="0" name="hinh_3_2_use_case_tong_quan.png"/>
-                    <pic:cNvPicPr/>
-                  </pic:nvPicPr>
-                  <pic:blipFill>
-                    <a:blip r:embed="rId10"/>
-                    <a:stretch>
-                      <a:fillRect/>
-                    </a:stretch>
-                  </pic:blipFill>
-                  <pic:spPr>
-                    <a:xfrm>
-                      <a:off x="0" y="0"/>
-                      <a:ext cx="5943600" cy="3820886"/>
-                    </a:xfrm>
-                    <a:prstGeom prst="rect"/>
-                  </pic:spPr>
-                </pic:pic>
-              </a:graphicData>
-            </a:graphic>
-          </wp:inline>
-        </w:drawing>
+        <w:t>Màn hình chính: Management/System, Services, ServiceCategories, Pets, Appointments, AdoptionRequests, Payments.</w:t>
       </w:r>
     </w:p>
     <w:p>
       <w:pPr>
-        <w:jc w:val="center"/>
+        <w:pStyle w:val="ListBullet"/>
       </w:pPr>
       <w:r>
-        <w:rPr>
-          <w:rFonts w:ascii="Times New Roman" w:hAnsi="Times New Roman" w:eastAsia="Times New Roman"/>
-          <w:i/>
-          <w:sz w:val="24"/>
-        </w:rPr>
-        <w:t>Hình 3.2. Use Case tổng quan các vai trò trong hệ thống</w:t>
+        <w:t>Quản trị người dùng và nhân sự: theo dõi danh sách tài khoản, vai trò, trạng thái hoạt động và thông tin nhân sự.</w:t>
       </w:r>
     </w:p>
     <w:p>
       <w:pPr>
-        <w:jc w:val="both"/>
+        <w:pStyle w:val="ListBullet"/>
       </w:pPr>
       <w:r>
-        <w:rPr>
-          <w:rFonts w:ascii="Times New Roman" w:hAnsi="Times New Roman" w:eastAsia="Times New Roman"/>
-          <w:b w:val="0"/>
-          <w:sz w:val="26"/>
-        </w:rPr>
-        <w:t>Trong đó, khách hàng tập trung vào thao tác sử dụng dịch vụ (đặt lịch, nhận nuôi, theo dõi thông tin). Nhân viên đảm nhiệm vận hành nghiệp vụ (hồ sơ y tế, tiêm chủng, xét duyệt). Admin chịu trách nhiệm kiểm soát hệ thống, điều phối dịch vụ và giám sát dữ liệu vận hành.</w:t>
+        <w:t>Quản lý dịch vụ và danh mục dịch vụ: tạo/sửa/xóa dịch vụ, gắn nhóm dịch vụ, giá, thời lượng, trạng thái kích hoạt.</w:t>
       </w:r>
     </w:p>
     <w:p>
       <w:pPr>
-        <w:jc w:val="both"/>
+        <w:pStyle w:val="ListBullet"/>
       </w:pPr>
       <w:r>
-        <w:rPr>
-          <w:rFonts w:ascii="Times New Roman" w:hAnsi="Times New Roman" w:eastAsia="Times New Roman"/>
-          <w:b/>
-          <w:sz w:val="26"/>
-        </w:rPr>
-        <w:t>Sơ đồ lớp (class diagram rút gọn) của các thực thể lõi:</w:t>
+        <w:t>Quản lý thú cưng toàn hệ thống: CRUD hồ sơ thú cưng, ảnh thú cưng, lọc theo chi nhánh/trạng thái/đặc điểm.</w:t>
+      </w:r>
+    </w:p>
+    <w:p>
+      <w:pPr>
+        <w:pStyle w:val="ListBullet"/>
+      </w:pPr>
+      <w:r>
+        <w:t>Quản lý lịch hẹn: xem chi tiết, cập nhật trạng thái, xóa lịch hẹn, theo dõi dịch vụ gắn kèm và tổng chi phí.</w:t>
+      </w:r>
+    </w:p>
+    <w:p>
+      <w:pPr>
+        <w:pStyle w:val="ListBullet"/>
+      </w:pPr>
+      <w:r>
+        <w:t>Quản lý nhận nuôi: duyệt/từ chối yêu cầu nhận nuôi, theo dõi thông tin đánh giá và hợp đồng nhận nuôi.</w:t>
+      </w:r>
+    </w:p>
+    <w:p>
+      <w:pPr>
+        <w:pStyle w:val="ListBullet"/>
+      </w:pPr>
+      <w:r>
+        <w:t>Quản lý thanh toán: tạo giao dịch cho lịch hẹn/hợp đồng, xem trạng thái thanh toán và thông tin đối tượng liên quan.</w:t>
+      </w:r>
+    </w:p>
+    <w:p>
+      <w:pPr>
+        <w:pStyle w:val="ListBullet"/>
+      </w:pPr>
+      <w:r>
+        <w:t>Đặc trưng giao diện Admin là độ bao quát dữ liệu cao, ưu tiên thao tác quản trị và giám sát vận hành liên phòng ban.</w:t>
+      </w:r>
+    </w:p>
+    <w:p>
+      <w:pPr>
+        <w:pStyle w:val="Heading4"/>
+      </w:pPr>
+      <w:r>
+        <w:t>3.1.4. Giao diện Staff – Nhân viên</w:t>
       </w:r>
     </w:p>
     <w:p>
       <w:r>
-        <w:drawing>
-          <wp:inline xmlns:a="http://schemas.openxmlformats.org/drawingml/2006/main" xmlns:pic="http://schemas.openxmlformats.org/drawingml/2006/picture">
-            <wp:extent cx="5943600" cy="3820886"/>
-            <wp:docPr id="3" name="Picture 3"/>
-            <wp:cNvGraphicFramePr>
-              <a:graphicFrameLocks noChangeAspect="1"/>
-            </wp:cNvGraphicFramePr>
-            <a:graphic>
-              <a:graphicData uri="http://schemas.openxmlformats.org/drawingml/2006/picture">
-                <pic:pic>
-                  <pic:nvPicPr>
-                    <pic:cNvPr id="0" name="hinh_3_3_class_diagram.png"/>
-                    <pic:cNvPicPr/>
-                  </pic:nvPicPr>
-                  <pic:blipFill>
-                    <a:blip r:embed="rId11"/>
-                    <a:stretch>
-                      <a:fillRect/>
-                    </a:stretch>
-                  </pic:blipFill>
-                  <pic:spPr>
-                    <a:xfrm>
-                      <a:off x="0" y="0"/>
-                      <a:ext cx="5943600" cy="3820886"/>
-                    </a:xfrm>
-                    <a:prstGeom prst="rect"/>
-                  </pic:spPr>
-                </pic:pic>
-              </a:graphicData>
-            </a:graphic>
-          </wp:inline>
-        </w:drawing>
+        <w:t>Màn hình chính: gần tương đồng Admin ở tầng nghiệp vụ vận hành, giới hạn theo chính sách StaffOrAdmin.</w:t>
       </w:r>
     </w:p>
     <w:p>
       <w:pPr>
-        <w:jc w:val="center"/>
+        <w:pStyle w:val="ListBullet"/>
       </w:pPr>
       <w:r>
-        <w:rPr>
-          <w:rFonts w:ascii="Times New Roman" w:hAnsi="Times New Roman" w:eastAsia="Times New Roman"/>
-          <w:i/>
-          <w:sz w:val="24"/>
-        </w:rPr>
-        <w:t>Hình 3.3. Class diagram rút gọn của các thực thể nghiệp vụ chính</w:t>
+        <w:t>Vận hành lịch hẹn: xác nhận, đổi trạng thái (Pending/Confirmed/Completed/Cancelled), xử lý các tình huống phát sinh.</w:t>
       </w:r>
     </w:p>
     <w:p>
       <w:pPr>
-        <w:jc w:val="both"/>
+        <w:pStyle w:val="ListBullet"/>
       </w:pPr>
       <w:r>
-        <w:rPr>
-          <w:rFonts w:ascii="Times New Roman" w:hAnsi="Times New Roman" w:eastAsia="Times New Roman"/>
-          <w:b w:val="0"/>
-          <w:sz w:val="26"/>
-        </w:rPr>
-        <w:t>Thiết kế dữ liệu tập trung quanh các thực thể User, Pet, Appointment, AdoptionRequest, Payment, MedicalRecord và Vaccination. Các mối quan hệ 1-N/N-1 giúp biểu diễn chính xác nghiệp vụ: một người dùng có thể sở hữu nhiều thú cưng, một thú cưng có nhiều lịch hẹn/hồ sơ y tế/tiêm chủng, và mỗi giao dịch thanh toán liên kết với lịch hẹn hoặc hợp đồng nhận nuôi.</w:t>
+        <w:t>Vận hành hồ sơ y tế: tạo/sửa/xóa medical records cho thú cưng, theo dõi lịch sử khám và phác đồ điều trị.</w:t>
       </w:r>
     </w:p>
     <w:p>
       <w:pPr>
-        <w:jc w:val="both"/>
+        <w:pStyle w:val="ListBullet"/>
       </w:pPr>
       <w:r>
-        <w:rPr>
-          <w:rFonts w:ascii="Times New Roman" w:hAnsi="Times New Roman" w:eastAsia="Times New Roman"/>
-          <w:b/>
-          <w:sz w:val="26"/>
-        </w:rPr>
-        <w:t>Luồng hoạt động chức năng tạo lịch hẹn:</w:t>
+        <w:t>Vận hành tiêm chủng: tạo/sửa/xóa vaccination records, quản lý ngày tiêm và ngày hẹn mũi kế tiếp.</w:t>
+      </w:r>
+    </w:p>
+    <w:p>
+      <w:pPr>
+        <w:pStyle w:val="ListBullet"/>
+      </w:pPr>
+      <w:r>
+        <w:t>Xử lý yêu cầu nhận nuôi: review hồ sơ, ghi nhận quyết định duyệt/từ chối, cập nhật trạng thái nghiệp vụ.</w:t>
+      </w:r>
+    </w:p>
+    <w:p>
+      <w:pPr>
+        <w:pStyle w:val="ListBullet"/>
+      </w:pPr>
+      <w:r>
+        <w:t>Hỗ trợ dữ liệu dịch vụ và thú cưng trong phạm vi vận hành, bảo đảm dữ liệu đầu vào đầy đủ trước khi xử lý.</w:t>
+      </w:r>
+    </w:p>
+    <w:p>
+      <w:pPr>
+        <w:pStyle w:val="ListBullet"/>
+      </w:pPr>
+      <w:r>
+        <w:t>Đặc trưng giao diện Staff là tập trung tốc độ thao tác nghiệp vụ và tính chính xác dữ liệu thực địa.</w:t>
+      </w:r>
+    </w:p>
+    <w:p>
+      <w:pPr>
+        <w:pStyle w:val="Heading4"/>
+      </w:pPr>
+      <w:r>
+        <w:t>3.1.5. Giao diện Client – Khách hàng</w:t>
       </w:r>
     </w:p>
     <w:p>
       <w:r>
-        <w:drawing>
-          <wp:inline xmlns:a="http://schemas.openxmlformats.org/drawingml/2006/main" xmlns:pic="http://schemas.openxmlformats.org/drawingml/2006/picture">
-            <wp:extent cx="5486400" cy="4572000"/>
-            <wp:docPr id="4" name="Picture 4"/>
-            <wp:cNvGraphicFramePr>
-              <a:graphicFrameLocks noChangeAspect="1"/>
-            </wp:cNvGraphicFramePr>
-            <a:graphic>
-              <a:graphicData uri="http://schemas.openxmlformats.org/drawingml/2006/picture">
-                <pic:pic>
-                  <pic:nvPicPr>
-                    <pic:cNvPr id="0" name="hinh_3_4_activity_dat_lich.png"/>
-                    <pic:cNvPicPr/>
-                  </pic:nvPicPr>
-                  <pic:blipFill>
-                    <a:blip r:embed="rId12"/>
-                    <a:stretch>
-                      <a:fillRect/>
-                    </a:stretch>
-                  </pic:blipFill>
-                  <pic:spPr>
-                    <a:xfrm>
-                      <a:off x="0" y="0"/>
-                      <a:ext cx="5486400" cy="4572000"/>
-                    </a:xfrm>
-                    <a:prstGeom prst="rect"/>
-                  </pic:spPr>
-                </pic:pic>
-              </a:graphicData>
-            </a:graphic>
-          </wp:inline>
-        </w:drawing>
+        <w:t>Màn hình chính: Home/Index, Services/Catalog, Management/Pets, Home/Dashboard, Home/Profile, Appointments, AdoptionRequests, Payments.</w:t>
       </w:r>
     </w:p>
     <w:p>
       <w:pPr>
-        <w:jc w:val="center"/>
+        <w:pStyle w:val="ListBullet"/>
       </w:pPr>
       <w:r>
-        <w:rPr>
-          <w:rFonts w:ascii="Times New Roman" w:hAnsi="Times New Roman" w:eastAsia="Times New Roman"/>
-          <w:i/>
-          <w:sz w:val="24"/>
-        </w:rPr>
-        <w:t>Hình 3.4. Activity diagram cho chức năng tạo lịch hẹn</w:t>
+        <w:t>Tra cứu thông tin thú cưng và chi nhánh: xem danh sách, lọc nhanh, xem chi tiết từng thú cưng.</w:t>
       </w:r>
     </w:p>
     <w:p>
       <w:pPr>
-        <w:jc w:val="both"/>
+        <w:pStyle w:val="ListBullet"/>
       </w:pPr>
       <w:r>
-        <w:rPr>
-          <w:rFonts w:ascii="Times New Roman" w:hAnsi="Times New Roman" w:eastAsia="Times New Roman"/>
-          <w:b/>
-          <w:sz w:val="26"/>
-        </w:rPr>
-        <w:t>Sequence diagram cho luồng tạo yêu cầu nhận nuôi:</w:t>
+        <w:t>Đặt lịch dịch vụ: tạo lịch hẹn cho thú cưng của mình, chọn chi nhánh, dịch vụ, ghi chú, theo dõi trạng thái lịch hẹn.</w:t>
+      </w:r>
+    </w:p>
+    <w:p>
+      <w:pPr>
+        <w:pStyle w:val="ListBullet"/>
+      </w:pPr>
+      <w:r>
+        <w:t>Gửi yêu cầu nhận nuôi: chọn thú cưng đang Available, gửi thông điệp, theo dõi tiến trình xét duyệt.</w:t>
+      </w:r>
+    </w:p>
+    <w:p>
+      <w:pPr>
+        <w:pStyle w:val="ListBullet"/>
+      </w:pPr>
+      <w:r>
+        <w:t>Theo dõi thanh toán: xem danh sách thanh toán liên quan lịch hẹn/hợp đồng của chính mình.</w:t>
+      </w:r>
+    </w:p>
+    <w:p>
+      <w:pPr>
+        <w:pStyle w:val="ListBullet"/>
+      </w:pPr>
+      <w:r>
+        <w:t>Quản lý hồ sơ cá nhân: cập nhật họ tên, email, số điện thoại, avatar URL.</w:t>
+      </w:r>
+    </w:p>
+    <w:p>
+      <w:pPr>
+        <w:pStyle w:val="ListBullet"/>
+      </w:pPr>
+      <w:r>
+        <w:t>Dashboard cá nhân tổng hợp thú cưng và lịch hẹn sắp tới giúp khách hàng theo dõi hành trình chăm sóc thú cưng liên tục.</w:t>
+      </w:r>
+    </w:p>
+    <w:p>
+      <w:pPr>
+        <w:pStyle w:val="Heading2"/>
+      </w:pPr>
+      <w:r>
+        <w:t>CHƯƠNG 4. KIỂM THỬ</w:t>
+      </w:r>
+    </w:p>
+    <w:p>
+      <w:pPr>
+        <w:pStyle w:val="Heading3"/>
+      </w:pPr>
+      <w:r>
+        <w:t>4.1. Mục tiêu kiểm thử</w:t>
       </w:r>
     </w:p>
     <w:p>
       <w:r>
-        <w:drawing>
-          <wp:inline xmlns:a="http://schemas.openxmlformats.org/drawingml/2006/main" xmlns:pic="http://schemas.openxmlformats.org/drawingml/2006/picture">
-            <wp:extent cx="5943600" cy="3396343"/>
-            <wp:docPr id="5" name="Picture 5"/>
-            <wp:cNvGraphicFramePr>
-              <a:graphicFrameLocks noChangeAspect="1"/>
-            </wp:cNvGraphicFramePr>
-            <a:graphic>
-              <a:graphicData uri="http://schemas.openxmlformats.org/drawingml/2006/picture">
-                <pic:pic>
-                  <pic:nvPicPr>
-                    <pic:cNvPr id="0" name="hinh_3_5_sequence_adoption.png"/>
-                    <pic:cNvPicPr/>
-                  </pic:nvPicPr>
-                  <pic:blipFill>
-                    <a:blip r:embed="rId13"/>
-                    <a:stretch>
-                      <a:fillRect/>
-                    </a:stretch>
-                  </pic:blipFill>
-                  <pic:spPr>
-                    <a:xfrm>
-                      <a:off x="0" y="0"/>
-                      <a:ext cx="5943600" cy="3396343"/>
-                    </a:xfrm>
-                    <a:prstGeom prst="rect"/>
-                  </pic:spPr>
-                </pic:pic>
-              </a:graphicData>
-            </a:graphic>
-          </wp:inline>
-        </w:drawing>
+        <w:t>Mục tiêu kiểm thử là bảo đảm hệ thống hoạt động đúng theo yêu cầu nghiệp vụ, hạn chế lỗi dữ liệu và sai quyền truy cập trước triển khai. Các nhóm mục tiêu chính: (1) đúng chức năng; (2) đúng ràng buộc dữ liệu đầu vào; (3) đúng phân quyền theo vai trò; (4) đúng luồng nghiệp vụ liên phòng ban; (5) ổn định và nhất quán dữ liệu sau thao tác Create/Update/Delete.</w:t>
       </w:r>
     </w:p>
     <w:p>
       <w:pPr>
-        <w:jc w:val="center"/>
+        <w:pStyle w:val="Heading3"/>
       </w:pPr>
       <w:r>
-        <w:rPr>
-          <w:rFonts w:ascii="Times New Roman" w:hAnsi="Times New Roman" w:eastAsia="Times New Roman"/>
-          <w:i/>
-          <w:sz w:val="24"/>
-        </w:rPr>
-        <w:t>Hình 3.5. Sequence diagram của chức năng gửi yêu cầu nhận nuôi</w:t>
+        <w:t>4.2. Phạm vi kiểm thử</w:t>
       </w:r>
     </w:p>
     <w:p>
       <w:pPr>
-        <w:jc w:val="left"/>
+        <w:pStyle w:val="ListBullet"/>
       </w:pPr>
       <w:r>
-        <w:rPr>
-          <w:rFonts w:ascii="Times New Roman" w:hAnsi="Times New Roman" w:eastAsia="Times New Roman"/>
-          <w:b/>
-          <w:sz w:val="28"/>
-        </w:rPr>
-        <w:t>3.2. Mô tả kết quả đạt được bằng cách dán các hình ảnh và giải thích về từng chức năng trong hệ thống</w:t>
+        <w:t>Kiểm thử chức năng web MVC theo vai trò Admin, Staff, Client.</w:t>
       </w:r>
     </w:p>
     <w:p>
       <w:pPr>
-        <w:jc w:val="both"/>
+        <w:pStyle w:val="ListBullet"/>
       </w:pPr>
       <w:r>
-        <w:rPr>
-          <w:rFonts w:ascii="Times New Roman" w:hAnsi="Times New Roman" w:eastAsia="Times New Roman"/>
-          <w:b w:val="0"/>
-          <w:sz w:val="26"/>
-        </w:rPr>
-        <w:t>- Nhóm chức năng tài khoản và bảo mật: Đã triển khai đăng ký/đăng nhập, phân quyền theo vai trò Customer/Staff/Admin, chặn truy cập trái phép bằng Authorize Policy. Kết quả là người dùng chỉ nhìn thấy đúng chức năng theo quyền, giảm rủi ro thao tác sai nghiệp vụ.</w:t>
+        <w:t>Kiểm thử các luồng nghiệp vụ lõi: đăng nhập/đăng ký, quản lý thú cưng, lịch hẹn, nhận nuôi, hồ sơ y tế, tiêm chủng, dịch vụ, thanh toán.</w:t>
       </w:r>
     </w:p>
     <w:p>
       <w:pPr>
-        <w:jc w:val="both"/>
+        <w:pStyle w:val="ListBullet"/>
       </w:pPr>
       <w:r>
-        <w:rPr>
-          <w:rFonts w:ascii="Times New Roman" w:hAnsi="Times New Roman" w:eastAsia="Times New Roman"/>
-          <w:b w:val="0"/>
-          <w:sz w:val="26"/>
-        </w:rPr>
-        <w:t>- Nhóm chức năng quản lý thú cưng: Hệ thống cho phép tạo/sửa/xem/xóa hồ sơ thú cưng, tải ảnh và quản lý trạng thái nhận nuôi. Kết quả đạt được là dữ liệu thú cưng được chuẩn hóa, dễ tra cứu theo tên, loài, chi nhánh và trạng thái.</w:t>
+        <w:t>Kiểm thử phân quyền ở controller/action level thông qua Authorize Policy và giới hạn dữ liệu theo người dùng.</w:t>
       </w:r>
     </w:p>
     <w:p>
       <w:pPr>
-        <w:jc w:val="both"/>
+        <w:pStyle w:val="ListBullet"/>
       </w:pPr>
       <w:r>
-        <w:rPr>
-          <w:rFonts w:ascii="Times New Roman" w:hAnsi="Times New Roman" w:eastAsia="Times New Roman"/>
-          <w:b w:val="0"/>
-          <w:sz w:val="26"/>
-        </w:rPr>
-        <w:t>- Nhóm chức năng đặt lịch dịch vụ: Người dùng có thể tạo lịch hẹn theo thú cưng, chi nhánh và dịch vụ; hệ thống kiểm tra ràng buộc thời gian và tính hợp lệ dịch vụ trước khi lưu. Kết quả là giảm lịch hẹn lỗi dữ liệu và hỗ trợ theo dõi vòng đời lịch hẹn rõ ràng.</w:t>
+        <w:t>Kiểm thử dữ liệu đầu vào (null/empty/sai định dạng/sai trạng thái nghiệp vụ).</w:t>
       </w:r>
     </w:p>
     <w:p>
       <w:pPr>
-        <w:jc w:val="both"/>
+        <w:pStyle w:val="ListBullet"/>
       </w:pPr>
       <w:r>
-        <w:rPr>
-          <w:rFonts w:ascii="Times New Roman" w:hAnsi="Times New Roman" w:eastAsia="Times New Roman"/>
-          <w:b w:val="0"/>
-          <w:sz w:val="26"/>
-        </w:rPr>
-        <w:t>- Nhóm chức năng nhận nuôi: Khách hàng gửi yêu cầu nhận nuôi, nhân viên xét duyệt, hệ thống cập nhật trạng thái pet và sinh hợp đồng nhận nuôi khi duyệt thành công. Kết quả là quy trình nhận nuôi được số hóa đầy đủ, có khả năng truy vết.</w:t>
+        <w:t>Không bao gồm kiểm thử hiệu năng tải cao và kiểm thử bảo mật chuyên sâu (penetration testing) trong phạm vi báo cáo này.</w:t>
       </w:r>
     </w:p>
     <w:p>
       <w:pPr>
-        <w:jc w:val="both"/>
+        <w:pStyle w:val="Heading3"/>
       </w:pPr>
       <w:r>
-        <w:rPr>
-          <w:rFonts w:ascii="Times New Roman" w:hAnsi="Times New Roman" w:eastAsia="Times New Roman"/>
-          <w:b w:val="0"/>
-          <w:sz w:val="26"/>
-        </w:rPr>
-        <w:t>- Nhóm chức năng hồ sơ y tế và tiêm chủng: Nhân viên cập nhật lịch sử khám, chẩn đoán, điều trị và mũi tiêm, có thể theo dõi lịch tiêm tiếp theo. Kết quả là hồ sơ chăm sóc sức khỏe của thú cưng được quản lý liên tục và có căn cứ chuyên môn.</w:t>
+        <w:t>4.3. Môi trường kiểm thử</w:t>
       </w:r>
     </w:p>
     <w:p>
       <w:pPr>
-        <w:jc w:val="both"/>
+        <w:pStyle w:val="ListBullet"/>
       </w:pPr>
       <w:r>
-        <w:rPr>
-          <w:rFonts w:ascii="Times New Roman" w:hAnsi="Times New Roman" w:eastAsia="Times New Roman"/>
-          <w:b w:val="0"/>
-          <w:sz w:val="26"/>
-        </w:rPr>
-        <w:t>- Nhóm chức năng dịch vụ và thanh toán: Hệ thống quản lý danh mục dịch vụ, giá dịch vụ và tạo thanh toán cho lịch hẹn/hợp đồng. Kết quả đạt được là chuẩn hóa doanh thu và theo dõi giao dịch có trạng thái rõ ràng.</w:t>
+        <w:t>Nền tảng: ASP.NET Core MVC (.NET 10), EF Core, SQL Server.</w:t>
       </w:r>
     </w:p>
     <w:p>
       <w:pPr>
-        <w:jc w:val="both"/>
+        <w:pStyle w:val="ListBullet"/>
       </w:pPr>
       <w:r>
-        <w:rPr>
-          <w:rFonts w:ascii="Times New Roman" w:hAnsi="Times New Roman" w:eastAsia="Times New Roman"/>
-          <w:b w:val="0"/>
-          <w:sz w:val="26"/>
-        </w:rPr>
-        <w:t>- Nhóm chức năng quản trị hệ thống: Admin theo dõi người dùng, nhân sự, thanh toán và tình trạng vận hành tổng hợp. Kết quả là hỗ trợ kiểm soát dữ liệu toàn cục và ra quyết định quản trị nhanh hơn.</w:t>
+        <w:t>Môi trường thực thi kiểm thử tự động: dotnet CLI (build/test).</w:t>
       </w:r>
     </w:p>
     <w:p>
       <w:pPr>
-        <w:jc w:val="both"/>
+        <w:pStyle w:val="ListBullet"/>
       </w:pPr>
       <w:r>
-        <w:rPr>
-          <w:rFonts w:ascii="Times New Roman" w:hAnsi="Times New Roman" w:eastAsia="Times New Roman"/>
-          <w:b w:val="0"/>
-          <w:sz w:val="26"/>
-        </w:rPr>
-        <w:t>Tổng hợp kết quả Chương 3: hệ thống đã hình thành đầy đủ các phân hệ chính theo yêu cầu nghiệp vụ, có cơ chế phân quyền rõ ràng, xử lý luồng nghiệp vụ trọng tâm (đặt lịch, nhận nuôi, y tế, thanh toán), đồng thời cung cấp cơ sở dữ liệu nhất quán để phục vụ vận hành thực tế.</w:t>
+        <w:t>Kết quả unit test hiện tại trong repository: 19/19 test passed (BTL_WEB.Tests).</w:t>
       </w:r>
     </w:p>
     <w:p>
       <w:pPr>
-        <w:jc w:val="left"/>
+        <w:pStyle w:val="ListBullet"/>
       </w:pPr>
       <w:r>
-        <w:rPr>
-          <w:rFonts w:ascii="Times New Roman" w:hAnsi="Times New Roman" w:eastAsia="Times New Roman"/>
-          <w:b/>
-          <w:sz w:val="32"/>
-        </w:rPr>
-        <w:t>Chương 4. Kiểm thử</w:t>
+        <w:t>Nhóm test chính hiện có: AppointmentWorkflowServiceTests, AdoptionWorkflowServiceTests, PaginatedListTests, PasswordHasherTests, HttpRequestExtensionsTests.</w:t>
       </w:r>
     </w:p>
     <w:p>
       <w:pPr>
-        <w:jc w:val="left"/>
+        <w:pStyle w:val="ListBullet"/>
       </w:pPr>
       <w:r>
-        <w:rPr>
-          <w:rFonts w:ascii="Times New Roman" w:hAnsi="Times New Roman" w:eastAsia="Times New Roman"/>
-          <w:b/>
-          <w:sz w:val="28"/>
-        </w:rPr>
-        <w:t>4.1. Mục tiêu phát hiện lỗi trong quá trình xây dựng hệ thống</w:t>
+        <w:t>Dữ liệu kiểm thử thủ công sử dụng các role Customer/Staff/Admin và các bản ghi mẫu Pet/Appointment/Service/AdoptionRequest/Payment.</w:t>
       </w:r>
     </w:p>
     <w:p>
       <w:pPr>
-        <w:jc w:val="both"/>
+        <w:pStyle w:val="Heading3"/>
       </w:pPr>
       <w:r>
-        <w:rPr>
-          <w:rFonts w:ascii="Times New Roman" w:hAnsi="Times New Roman" w:eastAsia="Times New Roman"/>
-          <w:b w:val="0"/>
-          <w:sz w:val="26"/>
-        </w:rPr>
-        <w:t>Mục tiêu kiểm thử là phát hiện sớm lỗi chức năng, lỗi dữ liệu, lỗi phân quyền và lỗi luồng nghiệp vụ trước khi triển khai thực tế. Trọng tâm kiểm thử gồm: (1) tính đúng đắn của chức năng; (2) tính hợp lệ dữ liệu đầu vào; (3) tính toàn vẹn dữ liệu sau thao tác; (4) khả năng kiểm soát truy cập theo vai trò; (5) độ ổn định các luồng nghiệp vụ chính như đặt lịch và nhận nuôi.</w:t>
+        <w:t>4.4. Danh sách Test Case</w:t>
+      </w:r>
+    </w:p>
+    <w:p>
+      <w:r>
+        <w:t>Định dạng mô tả mỗi test case: Mã TC | Mục tiêu | Tiền điều kiện | Bước thực hiện | Kết quả mong đợi.</w:t>
       </w:r>
     </w:p>
     <w:p>
       <w:pPr>
-        <w:jc w:val="both"/>
+        <w:pStyle w:val="Heading4"/>
       </w:pPr>
       <w:r>
-        <w:rPr>
-          <w:rFonts w:ascii="Times New Roman" w:hAnsi="Times New Roman" w:eastAsia="Times New Roman"/>
-          <w:b w:val="0"/>
-          <w:sz w:val="26"/>
-        </w:rPr>
-        <w:t>Bên cạnh kiểm thử pass/fail thông thường, nhóm cũng theo dõi các tình huống lỗi nghiệp vụ (ví dụ trạng thái pet không hợp lệ, lịch hẹn quá khứ, dữ liệu bắt buộc bị thiếu) để đề xuất hướng xử lý và quy trình fix lỗi có thể tái sử dụng.</w:t>
+        <w:t>4.4.1. Kiểm thử chức năng của lớp Admin (Quản lý)</w:t>
       </w:r>
     </w:p>
     <w:p>
       <w:pPr>
-        <w:jc w:val="left"/>
+        <w:pStyle w:val="ListBullet"/>
       </w:pPr>
       <w:r>
-        <w:rPr>
-          <w:rFonts w:ascii="Times New Roman" w:hAnsi="Times New Roman" w:eastAsia="Times New Roman"/>
-          <w:b/>
-          <w:sz w:val="28"/>
-        </w:rPr>
-        <w:t>4.2. Cách thức: xây dựng danh mục các test case</w:t>
+        <w:t>TC-ADM-01 | Đăng nhập Admin thành công | Có tài khoản Admin active | Nhập đúng username/password | Điều hướng tới Management/System, hiển thị dữ liệu quản trị.</w:t>
       </w:r>
     </w:p>
     <w:p>
       <w:pPr>
-        <w:jc w:val="both"/>
+        <w:pStyle w:val="ListBullet"/>
       </w:pPr>
       <w:r>
-        <w:rPr>
-          <w:rFonts w:ascii="Times New Roman" w:hAnsi="Times New Roman" w:eastAsia="Times New Roman"/>
-          <w:b w:val="0"/>
-          <w:sz w:val="26"/>
-        </w:rPr>
-        <w:t>Mỗi test case trong danh mục đều mô tả đủ 5 thành phần: mục tiêu test, dữ liệu đầu vào/ràng buộc, đầu ra dự kiến, đầu ra thực tế và kết quả pass/fail.</w:t>
-      </w:r>
-    </w:p>
-    <w:tbl>
-      <w:tblPr>
-        <w:tblStyle w:val="TableGrid"/>
-        <w:tblW w:type="auto" w:w="0"/>
-        <w:tblLook w:firstColumn="1" w:firstRow="1" w:lastColumn="0" w:lastRow="0" w:noHBand="0" w:noVBand="1" w:val="04A0"/>
-      </w:tblPr>
-      <w:tblGrid>
-        <w:gridCol w:w="1440"/>
-        <w:gridCol w:w="1440"/>
-        <w:gridCol w:w="1440"/>
-        <w:gridCol w:w="1440"/>
-        <w:gridCol w:w="1440"/>
-        <w:gridCol w:w="1440"/>
-      </w:tblGrid>
-      <w:tr>
-        <w:tc>
-          <w:tcPr>
-            <w:tcW w:type="dxa" w:w="1440"/>
-          </w:tcPr>
-          <w:p>
-            <w:r>
-              <w:rPr>
-                <w:rFonts w:ascii="Times New Roman" w:hAnsi="Times New Roman" w:eastAsia="Times New Roman"/>
-                <w:sz w:val="22"/>
-              </w:rPr>
-              <w:t>Test case</w:t>
-            </w:r>
-          </w:p>
-        </w:tc>
-        <w:tc>
-          <w:tcPr>
-            <w:tcW w:type="dxa" w:w="1440"/>
-          </w:tcPr>
-          <w:p>
-            <w:r>
-              <w:rPr>
-                <w:rFonts w:ascii="Times New Roman" w:hAnsi="Times New Roman" w:eastAsia="Times New Roman"/>
-                <w:sz w:val="22"/>
-              </w:rPr>
-              <w:t>Mục tiêu test</w:t>
-            </w:r>
-          </w:p>
-        </w:tc>
-        <w:tc>
-          <w:tcPr>
-            <w:tcW w:type="dxa" w:w="1440"/>
-          </w:tcPr>
-          <w:p>
-            <w:r>
-              <w:rPr>
-                <w:rFonts w:ascii="Times New Roman" w:hAnsi="Times New Roman" w:eastAsia="Times New Roman"/>
-                <w:sz w:val="22"/>
-              </w:rPr>
-              <w:t>Dữ liệu đầu vào, ràng buộc</w:t>
-            </w:r>
-          </w:p>
-        </w:tc>
-        <w:tc>
-          <w:tcPr>
-            <w:tcW w:type="dxa" w:w="1440"/>
-          </w:tcPr>
-          <w:p>
-            <w:r>
-              <w:rPr>
-                <w:rFonts w:ascii="Times New Roman" w:hAnsi="Times New Roman" w:eastAsia="Times New Roman"/>
-                <w:sz w:val="22"/>
-              </w:rPr>
-              <w:t>Đầu ra dự kiến</w:t>
-            </w:r>
-          </w:p>
-        </w:tc>
-        <w:tc>
-          <w:tcPr>
-            <w:tcW w:type="dxa" w:w="1440"/>
-          </w:tcPr>
-          <w:p>
-            <w:r>
-              <w:rPr>
-                <w:rFonts w:ascii="Times New Roman" w:hAnsi="Times New Roman" w:eastAsia="Times New Roman"/>
-                <w:sz w:val="22"/>
-              </w:rPr>
-              <w:t>Đầu ra thực tế</w:t>
-            </w:r>
-          </w:p>
-        </w:tc>
-        <w:tc>
-          <w:tcPr>
-            <w:tcW w:type="dxa" w:w="1440"/>
-          </w:tcPr>
-          <w:p>
-            <w:r>
-              <w:rPr>
-                <w:rFonts w:ascii="Times New Roman" w:hAnsi="Times New Roman" w:eastAsia="Times New Roman"/>
-                <w:sz w:val="22"/>
-              </w:rPr>
-              <w:t>Kết quả</w:t>
-            </w:r>
-          </w:p>
-        </w:tc>
-      </w:tr>
-      <w:tr>
-        <w:tc>
-          <w:tcPr>
-            <w:tcW w:type="dxa" w:w="1440"/>
-          </w:tcPr>
-          <w:p>
-            <w:r>
-              <w:rPr>
-                <w:rFonts w:ascii="Times New Roman" w:hAnsi="Times New Roman" w:eastAsia="Times New Roman"/>
-                <w:sz w:val="22"/>
-              </w:rPr>
-              <w:t>TC01 - Đăng ký tài khoản mới</w:t>
-            </w:r>
-          </w:p>
-        </w:tc>
-        <w:tc>
-          <w:tcPr>
-            <w:tcW w:type="dxa" w:w="1440"/>
-          </w:tcPr>
-          <w:p>
-            <w:r>
-              <w:rPr>
-                <w:rFonts w:ascii="Times New Roman" w:hAnsi="Times New Roman" w:eastAsia="Times New Roman"/>
-                <w:sz w:val="22"/>
-              </w:rPr>
-              <w:t>Xác nhận tạo tài khoản khách hàng hợp lệ</w:t>
-            </w:r>
-          </w:p>
-        </w:tc>
-        <w:tc>
-          <w:tcPr>
-            <w:tcW w:type="dxa" w:w="1440"/>
-          </w:tcPr>
-          <w:p>
-            <w:r>
-              <w:rPr>
-                <w:rFonts w:ascii="Times New Roman" w:hAnsi="Times New Roman" w:eastAsia="Times New Roman"/>
-                <w:sz w:val="22"/>
-              </w:rPr>
-              <w:t>Username/Email chưa tồn tại; mật khẩu hợp lệ</w:t>
-            </w:r>
-          </w:p>
-        </w:tc>
-        <w:tc>
-          <w:tcPr>
-            <w:tcW w:type="dxa" w:w="1440"/>
-          </w:tcPr>
-          <w:p>
-            <w:r>
-              <w:rPr>
-                <w:rFonts w:ascii="Times New Roman" w:hAnsi="Times New Roman" w:eastAsia="Times New Roman"/>
-                <w:sz w:val="22"/>
-              </w:rPr>
-              <w:t>Tạo tài khoản thành công, chuyển sang trang đăng nhập</w:t>
-            </w:r>
-          </w:p>
-        </w:tc>
-        <w:tc>
-          <w:tcPr>
-            <w:tcW w:type="dxa" w:w="1440"/>
-          </w:tcPr>
-          <w:p>
-            <w:r>
-              <w:rPr>
-                <w:rFonts w:ascii="Times New Roman" w:hAnsi="Times New Roman" w:eastAsia="Times New Roman"/>
-                <w:sz w:val="22"/>
-              </w:rPr>
-              <w:t>Tài khoản được tạo, thông báo thành công hiển thị</w:t>
-            </w:r>
-          </w:p>
-        </w:tc>
-        <w:tc>
-          <w:tcPr>
-            <w:tcW w:type="dxa" w:w="1440"/>
-          </w:tcPr>
-          <w:p>
-            <w:r>
-              <w:rPr>
-                <w:rFonts w:ascii="Times New Roman" w:hAnsi="Times New Roman" w:eastAsia="Times New Roman"/>
-                <w:sz w:val="22"/>
-              </w:rPr>
-              <w:t>PASS</w:t>
-            </w:r>
-          </w:p>
-        </w:tc>
-      </w:tr>
-      <w:tr>
-        <w:tc>
-          <w:tcPr>
-            <w:tcW w:type="dxa" w:w="1440"/>
-          </w:tcPr>
-          <w:p>
-            <w:r>
-              <w:rPr>
-                <w:rFonts w:ascii="Times New Roman" w:hAnsi="Times New Roman" w:eastAsia="Times New Roman"/>
-                <w:sz w:val="22"/>
-              </w:rPr>
-              <w:t>TC02 - Đăng nhập sai mật khẩu</w:t>
-            </w:r>
-          </w:p>
-        </w:tc>
-        <w:tc>
-          <w:tcPr>
-            <w:tcW w:type="dxa" w:w="1440"/>
-          </w:tcPr>
-          <w:p>
-            <w:r>
-              <w:rPr>
-                <w:rFonts w:ascii="Times New Roman" w:hAnsi="Times New Roman" w:eastAsia="Times New Roman"/>
-                <w:sz w:val="22"/>
-              </w:rPr>
-              <w:t>Kiểm tra bảo mật đăng nhập</w:t>
-            </w:r>
-          </w:p>
-        </w:tc>
-        <w:tc>
-          <w:tcPr>
-            <w:tcW w:type="dxa" w:w="1440"/>
-          </w:tcPr>
-          <w:p>
-            <w:r>
-              <w:rPr>
-                <w:rFonts w:ascii="Times New Roman" w:hAnsi="Times New Roman" w:eastAsia="Times New Roman"/>
-                <w:sz w:val="22"/>
-              </w:rPr>
-              <w:t>Username tồn tại, mật khẩu sai</w:t>
-            </w:r>
-          </w:p>
-        </w:tc>
-        <w:tc>
-          <w:tcPr>
-            <w:tcW w:type="dxa" w:w="1440"/>
-          </w:tcPr>
-          <w:p>
-            <w:r>
-              <w:rPr>
-                <w:rFonts w:ascii="Times New Roman" w:hAnsi="Times New Roman" w:eastAsia="Times New Roman"/>
-                <w:sz w:val="22"/>
-              </w:rPr>
-              <w:t>Không đăng nhập, hiển thị lỗi xác thực</w:t>
-            </w:r>
-          </w:p>
-        </w:tc>
-        <w:tc>
-          <w:tcPr>
-            <w:tcW w:type="dxa" w:w="1440"/>
-          </w:tcPr>
-          <w:p>
-            <w:r>
-              <w:rPr>
-                <w:rFonts w:ascii="Times New Roman" w:hAnsi="Times New Roman" w:eastAsia="Times New Roman"/>
-                <w:sz w:val="22"/>
-              </w:rPr>
-              <w:t>Không tạo session, báo lỗi đúng</w:t>
-            </w:r>
-          </w:p>
-        </w:tc>
-        <w:tc>
-          <w:tcPr>
-            <w:tcW w:type="dxa" w:w="1440"/>
-          </w:tcPr>
-          <w:p>
-            <w:r>
-              <w:rPr>
-                <w:rFonts w:ascii="Times New Roman" w:hAnsi="Times New Roman" w:eastAsia="Times New Roman"/>
-                <w:sz w:val="22"/>
-              </w:rPr>
-              <w:t>PASS</w:t>
-            </w:r>
-          </w:p>
-        </w:tc>
-      </w:tr>
-      <w:tr>
-        <w:tc>
-          <w:tcPr>
-            <w:tcW w:type="dxa" w:w="1440"/>
-          </w:tcPr>
-          <w:p>
-            <w:r>
-              <w:rPr>
-                <w:rFonts w:ascii="Times New Roman" w:hAnsi="Times New Roman" w:eastAsia="Times New Roman"/>
-                <w:sz w:val="22"/>
-              </w:rPr>
-              <w:t>TC03 - Đặt lịch với thời gian quá khứ</w:t>
-            </w:r>
-          </w:p>
-        </w:tc>
-        <w:tc>
-          <w:tcPr>
-            <w:tcW w:type="dxa" w:w="1440"/>
-          </w:tcPr>
-          <w:p>
-            <w:r>
-              <w:rPr>
-                <w:rFonts w:ascii="Times New Roman" w:hAnsi="Times New Roman" w:eastAsia="Times New Roman"/>
-                <w:sz w:val="22"/>
-              </w:rPr>
-              <w:t>Chặn dữ liệu lịch hẹn không hợp lệ</w:t>
-            </w:r>
-          </w:p>
-        </w:tc>
-        <w:tc>
-          <w:tcPr>
-            <w:tcW w:type="dxa" w:w="1440"/>
-          </w:tcPr>
-          <w:p>
-            <w:r>
-              <w:rPr>
-                <w:rFonts w:ascii="Times New Roman" w:hAnsi="Times New Roman" w:eastAsia="Times New Roman"/>
-                <w:sz w:val="22"/>
-              </w:rPr>
-              <w:t>AppointmentDateTime &lt; thời điểm hiện tại</w:t>
-            </w:r>
-          </w:p>
-        </w:tc>
-        <w:tc>
-          <w:tcPr>
-            <w:tcW w:type="dxa" w:w="1440"/>
-          </w:tcPr>
-          <w:p>
-            <w:r>
-              <w:rPr>
-                <w:rFonts w:ascii="Times New Roman" w:hAnsi="Times New Roman" w:eastAsia="Times New Roman"/>
-                <w:sz w:val="22"/>
-              </w:rPr>
-              <w:t>Từ chối lưu lịch hẹn và báo lỗi</w:t>
-            </w:r>
-          </w:p>
-        </w:tc>
-        <w:tc>
-          <w:tcPr>
-            <w:tcW w:type="dxa" w:w="1440"/>
-          </w:tcPr>
-          <w:p>
-            <w:r>
-              <w:rPr>
-                <w:rFonts w:ascii="Times New Roman" w:hAnsi="Times New Roman" w:eastAsia="Times New Roman"/>
-                <w:sz w:val="22"/>
-              </w:rPr>
-              <w:t>Hệ thống từ chối, trả thông báo đúng</w:t>
-            </w:r>
-          </w:p>
-        </w:tc>
-        <w:tc>
-          <w:tcPr>
-            <w:tcW w:type="dxa" w:w="1440"/>
-          </w:tcPr>
-          <w:p>
-            <w:r>
-              <w:rPr>
-                <w:rFonts w:ascii="Times New Roman" w:hAnsi="Times New Roman" w:eastAsia="Times New Roman"/>
-                <w:sz w:val="22"/>
-              </w:rPr>
-              <w:t>PASS</w:t>
-            </w:r>
-          </w:p>
-        </w:tc>
-      </w:tr>
-      <w:tr>
-        <w:tc>
-          <w:tcPr>
-            <w:tcW w:type="dxa" w:w="1440"/>
-          </w:tcPr>
-          <w:p>
-            <w:r>
-              <w:rPr>
-                <w:rFonts w:ascii="Times New Roman" w:hAnsi="Times New Roman" w:eastAsia="Times New Roman"/>
-                <w:sz w:val="22"/>
-              </w:rPr>
-              <w:t>TC04 - Khách hàng đặt lịch cho pet không sở hữu</w:t>
-            </w:r>
-          </w:p>
-        </w:tc>
-        <w:tc>
-          <w:tcPr>
-            <w:tcW w:type="dxa" w:w="1440"/>
-          </w:tcPr>
-          <w:p>
-            <w:r>
-              <w:rPr>
-                <w:rFonts w:ascii="Times New Roman" w:hAnsi="Times New Roman" w:eastAsia="Times New Roman"/>
-                <w:sz w:val="22"/>
-              </w:rPr>
-              <w:t>Đảm bảo phân quyền dữ liệu</w:t>
-            </w:r>
-          </w:p>
-        </w:tc>
-        <w:tc>
-          <w:tcPr>
-            <w:tcW w:type="dxa" w:w="1440"/>
-          </w:tcPr>
-          <w:p>
-            <w:r>
-              <w:rPr>
-                <w:rFonts w:ascii="Times New Roman" w:hAnsi="Times New Roman" w:eastAsia="Times New Roman"/>
-                <w:sz w:val="22"/>
-              </w:rPr>
-              <w:t>User khách hàng + PetId của người khác</w:t>
-            </w:r>
-          </w:p>
-        </w:tc>
-        <w:tc>
-          <w:tcPr>
-            <w:tcW w:type="dxa" w:w="1440"/>
-          </w:tcPr>
-          <w:p>
-            <w:r>
-              <w:rPr>
-                <w:rFonts w:ascii="Times New Roman" w:hAnsi="Times New Roman" w:eastAsia="Times New Roman"/>
-                <w:sz w:val="22"/>
-              </w:rPr>
-              <w:t>Từ chối thao tác</w:t>
-            </w:r>
-          </w:p>
-        </w:tc>
-        <w:tc>
-          <w:tcPr>
-            <w:tcW w:type="dxa" w:w="1440"/>
-          </w:tcPr>
-          <w:p>
-            <w:r>
-              <w:rPr>
-                <w:rFonts w:ascii="Times New Roman" w:hAnsi="Times New Roman" w:eastAsia="Times New Roman"/>
-                <w:sz w:val="22"/>
-              </w:rPr>
-              <w:t>Dịch vụ trả lỗi không đủ quyền</w:t>
-            </w:r>
-          </w:p>
-        </w:tc>
-        <w:tc>
-          <w:tcPr>
-            <w:tcW w:type="dxa" w:w="1440"/>
-          </w:tcPr>
-          <w:p>
-            <w:r>
-              <w:rPr>
-                <w:rFonts w:ascii="Times New Roman" w:hAnsi="Times New Roman" w:eastAsia="Times New Roman"/>
-                <w:sz w:val="22"/>
-              </w:rPr>
-              <w:t>PASS</w:t>
-            </w:r>
-          </w:p>
-        </w:tc>
-      </w:tr>
-      <w:tr>
-        <w:tc>
-          <w:tcPr>
-            <w:tcW w:type="dxa" w:w="1440"/>
-          </w:tcPr>
-          <w:p>
-            <w:r>
-              <w:rPr>
-                <w:rFonts w:ascii="Times New Roman" w:hAnsi="Times New Roman" w:eastAsia="Times New Roman"/>
-                <w:sz w:val="22"/>
-              </w:rPr>
-              <w:t>TC05 - Tạo yêu cầu nhận nuôi pet Available</w:t>
-            </w:r>
-          </w:p>
-        </w:tc>
-        <w:tc>
-          <w:tcPr>
-            <w:tcW w:type="dxa" w:w="1440"/>
-          </w:tcPr>
-          <w:p>
-            <w:r>
-              <w:rPr>
-                <w:rFonts w:ascii="Times New Roman" w:hAnsi="Times New Roman" w:eastAsia="Times New Roman"/>
-                <w:sz w:val="22"/>
-              </w:rPr>
-              <w:t>Kiểm tra luồng tạo yêu cầu nhận nuôi</w:t>
-            </w:r>
-          </w:p>
-        </w:tc>
-        <w:tc>
-          <w:tcPr>
-            <w:tcW w:type="dxa" w:w="1440"/>
-          </w:tcPr>
-          <w:p>
-            <w:r>
-              <w:rPr>
-                <w:rFonts w:ascii="Times New Roman" w:hAnsi="Times New Roman" w:eastAsia="Times New Roman"/>
-                <w:sz w:val="22"/>
-              </w:rPr>
-              <w:t>Pet ở trạng thái Available, có message</w:t>
-            </w:r>
-          </w:p>
-        </w:tc>
-        <w:tc>
-          <w:tcPr>
-            <w:tcW w:type="dxa" w:w="1440"/>
-          </w:tcPr>
-          <w:p>
-            <w:r>
-              <w:rPr>
-                <w:rFonts w:ascii="Times New Roman" w:hAnsi="Times New Roman" w:eastAsia="Times New Roman"/>
-                <w:sz w:val="22"/>
-              </w:rPr>
-              <w:t>Tạo request Pending, pet chuyển Pending</w:t>
-            </w:r>
-          </w:p>
-        </w:tc>
-        <w:tc>
-          <w:tcPr>
-            <w:tcW w:type="dxa" w:w="1440"/>
-          </w:tcPr>
-          <w:p>
-            <w:r>
-              <w:rPr>
-                <w:rFonts w:ascii="Times New Roman" w:hAnsi="Times New Roman" w:eastAsia="Times New Roman"/>
-                <w:sz w:val="22"/>
-              </w:rPr>
-              <w:t>Request được tạo, trạng thái pet cập nhật</w:t>
-            </w:r>
-          </w:p>
-        </w:tc>
-        <w:tc>
-          <w:tcPr>
-            <w:tcW w:type="dxa" w:w="1440"/>
-          </w:tcPr>
-          <w:p>
-            <w:r>
-              <w:rPr>
-                <w:rFonts w:ascii="Times New Roman" w:hAnsi="Times New Roman" w:eastAsia="Times New Roman"/>
-                <w:sz w:val="22"/>
-              </w:rPr>
-              <w:t>PASS</w:t>
-            </w:r>
-          </w:p>
-        </w:tc>
-      </w:tr>
-      <w:tr>
-        <w:tc>
-          <w:tcPr>
-            <w:tcW w:type="dxa" w:w="1440"/>
-          </w:tcPr>
-          <w:p>
-            <w:r>
-              <w:rPr>
-                <w:rFonts w:ascii="Times New Roman" w:hAnsi="Times New Roman" w:eastAsia="Times New Roman"/>
-                <w:sz w:val="22"/>
-              </w:rPr>
-              <w:t>TC06 - Tạo yêu cầu nhận nuôi trùng pet đang Pending</w:t>
-            </w:r>
-          </w:p>
-        </w:tc>
-        <w:tc>
-          <w:tcPr>
-            <w:tcW w:type="dxa" w:w="1440"/>
-          </w:tcPr>
-          <w:p>
-            <w:r>
-              <w:rPr>
-                <w:rFonts w:ascii="Times New Roman" w:hAnsi="Times New Roman" w:eastAsia="Times New Roman"/>
-                <w:sz w:val="22"/>
-              </w:rPr>
-              <w:t>Ngăn trùng yêu cầu</w:t>
-            </w:r>
-          </w:p>
-        </w:tc>
-        <w:tc>
-          <w:tcPr>
-            <w:tcW w:type="dxa" w:w="1440"/>
-          </w:tcPr>
-          <w:p>
-            <w:r>
-              <w:rPr>
-                <w:rFonts w:ascii="Times New Roman" w:hAnsi="Times New Roman" w:eastAsia="Times New Roman"/>
-                <w:sz w:val="22"/>
-              </w:rPr>
-              <w:t>Pet đã có yêu cầu Pending</w:t>
-            </w:r>
-          </w:p>
-        </w:tc>
-        <w:tc>
-          <w:tcPr>
-            <w:tcW w:type="dxa" w:w="1440"/>
-          </w:tcPr>
-          <w:p>
-            <w:r>
-              <w:rPr>
-                <w:rFonts w:ascii="Times New Roman" w:hAnsi="Times New Roman" w:eastAsia="Times New Roman"/>
-                <w:sz w:val="22"/>
-              </w:rPr>
-              <w:t>Không tạo yêu cầu mới, thông báo lỗi</w:t>
-            </w:r>
-          </w:p>
-        </w:tc>
-        <w:tc>
-          <w:tcPr>
-            <w:tcW w:type="dxa" w:w="1440"/>
-          </w:tcPr>
-          <w:p>
-            <w:r>
-              <w:rPr>
-                <w:rFonts w:ascii="Times New Roman" w:hAnsi="Times New Roman" w:eastAsia="Times New Roman"/>
-                <w:sz w:val="22"/>
-              </w:rPr>
-              <w:t>Hệ thống từ chối đúng như mong đợi</w:t>
-            </w:r>
-          </w:p>
-        </w:tc>
-        <w:tc>
-          <w:tcPr>
-            <w:tcW w:type="dxa" w:w="1440"/>
-          </w:tcPr>
-          <w:p>
-            <w:r>
-              <w:rPr>
-                <w:rFonts w:ascii="Times New Roman" w:hAnsi="Times New Roman" w:eastAsia="Times New Roman"/>
-                <w:sz w:val="22"/>
-              </w:rPr>
-              <w:t>PASS</w:t>
-            </w:r>
-          </w:p>
-        </w:tc>
-      </w:tr>
-      <w:tr>
-        <w:tc>
-          <w:tcPr>
-            <w:tcW w:type="dxa" w:w="1440"/>
-          </w:tcPr>
-          <w:p>
-            <w:r>
-              <w:rPr>
-                <w:rFonts w:ascii="Times New Roman" w:hAnsi="Times New Roman" w:eastAsia="Times New Roman"/>
-                <w:sz w:val="22"/>
-              </w:rPr>
-              <w:t>TC07 - Duyệt yêu cầu nhận nuôi</w:t>
-            </w:r>
-          </w:p>
-        </w:tc>
-        <w:tc>
-          <w:tcPr>
-            <w:tcW w:type="dxa" w:w="1440"/>
-          </w:tcPr>
-          <w:p>
-            <w:r>
-              <w:rPr>
-                <w:rFonts w:ascii="Times New Roman" w:hAnsi="Times New Roman" w:eastAsia="Times New Roman"/>
-                <w:sz w:val="22"/>
-              </w:rPr>
-              <w:t>Kiểm tra luồng approve của staff/admin</w:t>
-            </w:r>
-          </w:p>
-        </w:tc>
-        <w:tc>
-          <w:tcPr>
-            <w:tcW w:type="dxa" w:w="1440"/>
-          </w:tcPr>
-          <w:p>
-            <w:r>
-              <w:rPr>
-                <w:rFonts w:ascii="Times New Roman" w:hAnsi="Times New Roman" w:eastAsia="Times New Roman"/>
-                <w:sz w:val="22"/>
-              </w:rPr>
-              <w:t>Request Pending + Action=Approve</w:t>
-            </w:r>
-          </w:p>
-        </w:tc>
-        <w:tc>
-          <w:tcPr>
-            <w:tcW w:type="dxa" w:w="1440"/>
-          </w:tcPr>
-          <w:p>
-            <w:r>
-              <w:rPr>
-                <w:rFonts w:ascii="Times New Roman" w:hAnsi="Times New Roman" w:eastAsia="Times New Roman"/>
-                <w:sz w:val="22"/>
-              </w:rPr>
-              <w:t>Request thành Approved, pet Adopted, tạo hợp đồng</w:t>
-            </w:r>
-          </w:p>
-        </w:tc>
-        <w:tc>
-          <w:tcPr>
-            <w:tcW w:type="dxa" w:w="1440"/>
-          </w:tcPr>
-          <w:p>
-            <w:r>
-              <w:rPr>
-                <w:rFonts w:ascii="Times New Roman" w:hAnsi="Times New Roman" w:eastAsia="Times New Roman"/>
-                <w:sz w:val="22"/>
-              </w:rPr>
-              <w:t>Dữ liệu cập nhật đầy đủ ở 3 bảng</w:t>
-            </w:r>
-          </w:p>
-        </w:tc>
-        <w:tc>
-          <w:tcPr>
-            <w:tcW w:type="dxa" w:w="1440"/>
-          </w:tcPr>
-          <w:p>
-            <w:r>
-              <w:rPr>
-                <w:rFonts w:ascii="Times New Roman" w:hAnsi="Times New Roman" w:eastAsia="Times New Roman"/>
-                <w:sz w:val="22"/>
-              </w:rPr>
-              <w:t>PASS</w:t>
-            </w:r>
-          </w:p>
-        </w:tc>
-      </w:tr>
-      <w:tr>
-        <w:tc>
-          <w:tcPr>
-            <w:tcW w:type="dxa" w:w="1440"/>
-          </w:tcPr>
-          <w:p>
-            <w:r>
-              <w:rPr>
-                <w:rFonts w:ascii="Times New Roman" w:hAnsi="Times New Roman" w:eastAsia="Times New Roman"/>
-                <w:sz w:val="22"/>
-              </w:rPr>
-              <w:t>TC08 - Tạo payment cho appointment chưa Completed</w:t>
-            </w:r>
-          </w:p>
-        </w:tc>
-        <w:tc>
-          <w:tcPr>
-            <w:tcW w:type="dxa" w:w="1440"/>
-          </w:tcPr>
-          <w:p>
-            <w:r>
-              <w:rPr>
-                <w:rFonts w:ascii="Times New Roman" w:hAnsi="Times New Roman" w:eastAsia="Times New Roman"/>
-                <w:sz w:val="22"/>
-              </w:rPr>
-              <w:t>Ràng buộc nghiệp vụ thanh toán</w:t>
-            </w:r>
-          </w:p>
-        </w:tc>
-        <w:tc>
-          <w:tcPr>
-            <w:tcW w:type="dxa" w:w="1440"/>
-          </w:tcPr>
-          <w:p>
-            <w:r>
-              <w:rPr>
-                <w:rFonts w:ascii="Times New Roman" w:hAnsi="Times New Roman" w:eastAsia="Times New Roman"/>
-                <w:sz w:val="22"/>
-              </w:rPr>
-              <w:t>Appointment status = Pending</w:t>
-            </w:r>
-          </w:p>
-        </w:tc>
-        <w:tc>
-          <w:tcPr>
-            <w:tcW w:type="dxa" w:w="1440"/>
-          </w:tcPr>
-          <w:p>
-            <w:r>
-              <w:rPr>
-                <w:rFonts w:ascii="Times New Roman" w:hAnsi="Times New Roman" w:eastAsia="Times New Roman"/>
-                <w:sz w:val="22"/>
-              </w:rPr>
-              <w:t>Từ chối tạo payment</w:t>
-            </w:r>
-          </w:p>
-        </w:tc>
-        <w:tc>
-          <w:tcPr>
-            <w:tcW w:type="dxa" w:w="1440"/>
-          </w:tcPr>
-          <w:p>
-            <w:r>
-              <w:rPr>
-                <w:rFonts w:ascii="Times New Roman" w:hAnsi="Times New Roman" w:eastAsia="Times New Roman"/>
-                <w:sz w:val="22"/>
-              </w:rPr>
-              <w:t>ModelState báo lỗi đúng</w:t>
-            </w:r>
-          </w:p>
-        </w:tc>
-        <w:tc>
-          <w:tcPr>
-            <w:tcW w:type="dxa" w:w="1440"/>
-          </w:tcPr>
-          <w:p>
-            <w:r>
-              <w:rPr>
-                <w:rFonts w:ascii="Times New Roman" w:hAnsi="Times New Roman" w:eastAsia="Times New Roman"/>
-                <w:sz w:val="22"/>
-              </w:rPr>
-              <w:t>PASS</w:t>
-            </w:r>
-          </w:p>
-        </w:tc>
-      </w:tr>
-      <w:tr>
-        <w:tc>
-          <w:tcPr>
-            <w:tcW w:type="dxa" w:w="1440"/>
-          </w:tcPr>
-          <w:p>
-            <w:r>
-              <w:rPr>
-                <w:rFonts w:ascii="Times New Roman" w:hAnsi="Times New Roman" w:eastAsia="Times New Roman"/>
-                <w:sz w:val="22"/>
-              </w:rPr>
-              <w:t>TC09 - Cập nhật tiêm chủng với NextDueDate &lt; VaccinationDate</w:t>
-            </w:r>
-          </w:p>
-        </w:tc>
-        <w:tc>
-          <w:tcPr>
-            <w:tcW w:type="dxa" w:w="1440"/>
-          </w:tcPr>
-          <w:p>
-            <w:r>
-              <w:rPr>
-                <w:rFonts w:ascii="Times New Roman" w:hAnsi="Times New Roman" w:eastAsia="Times New Roman"/>
-                <w:sz w:val="22"/>
-              </w:rPr>
-              <w:t>Ràng buộc ngày tiêm</w:t>
-            </w:r>
-          </w:p>
-        </w:tc>
-        <w:tc>
-          <w:tcPr>
-            <w:tcW w:type="dxa" w:w="1440"/>
-          </w:tcPr>
-          <w:p>
-            <w:r>
-              <w:rPr>
-                <w:rFonts w:ascii="Times New Roman" w:hAnsi="Times New Roman" w:eastAsia="Times New Roman"/>
-                <w:sz w:val="22"/>
-              </w:rPr>
-              <w:t>Ngày nhắc lại nhỏ hơn ngày tiêm</w:t>
-            </w:r>
-          </w:p>
-        </w:tc>
-        <w:tc>
-          <w:tcPr>
-            <w:tcW w:type="dxa" w:w="1440"/>
-          </w:tcPr>
-          <w:p>
-            <w:r>
-              <w:rPr>
-                <w:rFonts w:ascii="Times New Roman" w:hAnsi="Times New Roman" w:eastAsia="Times New Roman"/>
-                <w:sz w:val="22"/>
-              </w:rPr>
-              <w:t>Không lưu, báo lỗi validation</w:t>
-            </w:r>
-          </w:p>
-        </w:tc>
-        <w:tc>
-          <w:tcPr>
-            <w:tcW w:type="dxa" w:w="1440"/>
-          </w:tcPr>
-          <w:p>
-            <w:r>
-              <w:rPr>
-                <w:rFonts w:ascii="Times New Roman" w:hAnsi="Times New Roman" w:eastAsia="Times New Roman"/>
-                <w:sz w:val="22"/>
-              </w:rPr>
-              <w:t>Đã chặn và báo lỗi</w:t>
-            </w:r>
-          </w:p>
-        </w:tc>
-        <w:tc>
-          <w:tcPr>
-            <w:tcW w:type="dxa" w:w="1440"/>
-          </w:tcPr>
-          <w:p>
-            <w:r>
-              <w:rPr>
-                <w:rFonts w:ascii="Times New Roman" w:hAnsi="Times New Roman" w:eastAsia="Times New Roman"/>
-                <w:sz w:val="22"/>
-              </w:rPr>
-              <w:t>PASS</w:t>
-            </w:r>
-          </w:p>
-        </w:tc>
-      </w:tr>
-      <w:tr>
-        <w:tc>
-          <w:tcPr>
-            <w:tcW w:type="dxa" w:w="1440"/>
-          </w:tcPr>
-          <w:p>
-            <w:r>
-              <w:rPr>
-                <w:rFonts w:ascii="Times New Roman" w:hAnsi="Times New Roman" w:eastAsia="Times New Roman"/>
-                <w:sz w:val="22"/>
-              </w:rPr>
-              <w:t>TC10 - Truy cập trang System bằng khách hàng</w:t>
-            </w:r>
-          </w:p>
-        </w:tc>
-        <w:tc>
-          <w:tcPr>
-            <w:tcW w:type="dxa" w:w="1440"/>
-          </w:tcPr>
-          <w:p>
-            <w:r>
-              <w:rPr>
-                <w:rFonts w:ascii="Times New Roman" w:hAnsi="Times New Roman" w:eastAsia="Times New Roman"/>
-                <w:sz w:val="22"/>
-              </w:rPr>
-              <w:t>Kiểm tra phân quyền quản trị</w:t>
-            </w:r>
-          </w:p>
-        </w:tc>
-        <w:tc>
-          <w:tcPr>
-            <w:tcW w:type="dxa" w:w="1440"/>
-          </w:tcPr>
-          <w:p>
-            <w:r>
-              <w:rPr>
-                <w:rFonts w:ascii="Times New Roman" w:hAnsi="Times New Roman" w:eastAsia="Times New Roman"/>
-                <w:sz w:val="22"/>
-              </w:rPr>
-              <w:t>Role = Customer</w:t>
-            </w:r>
-          </w:p>
-        </w:tc>
-        <w:tc>
-          <w:tcPr>
-            <w:tcW w:type="dxa" w:w="1440"/>
-          </w:tcPr>
-          <w:p>
-            <w:r>
-              <w:rPr>
-                <w:rFonts w:ascii="Times New Roman" w:hAnsi="Times New Roman" w:eastAsia="Times New Roman"/>
-                <w:sz w:val="22"/>
-              </w:rPr>
-              <w:t>Bị chặn truy cập (403/redirect)</w:t>
-            </w:r>
-          </w:p>
-        </w:tc>
-        <w:tc>
-          <w:tcPr>
-            <w:tcW w:type="dxa" w:w="1440"/>
-          </w:tcPr>
-          <w:p>
-            <w:r>
-              <w:rPr>
-                <w:rFonts w:ascii="Times New Roman" w:hAnsi="Times New Roman" w:eastAsia="Times New Roman"/>
-                <w:sz w:val="22"/>
-              </w:rPr>
-              <w:t>Bị chặn đúng theo policy</w:t>
-            </w:r>
-          </w:p>
-        </w:tc>
-        <w:tc>
-          <w:tcPr>
-            <w:tcW w:type="dxa" w:w="1440"/>
-          </w:tcPr>
-          <w:p>
-            <w:r>
-              <w:rPr>
-                <w:rFonts w:ascii="Times New Roman" w:hAnsi="Times New Roman" w:eastAsia="Times New Roman"/>
-                <w:sz w:val="22"/>
-              </w:rPr>
-              <w:t>PASS</w:t>
-            </w:r>
-          </w:p>
-        </w:tc>
-      </w:tr>
-      <w:tr>
-        <w:tc>
-          <w:tcPr>
-            <w:tcW w:type="dxa" w:w="1440"/>
-          </w:tcPr>
-          <w:p>
-            <w:r>
-              <w:rPr>
-                <w:rFonts w:ascii="Times New Roman" w:hAnsi="Times New Roman" w:eastAsia="Times New Roman"/>
-                <w:sz w:val="22"/>
-              </w:rPr>
-              <w:t>TC11 - Upload ảnh thú cưng không chọn file</w:t>
-            </w:r>
-          </w:p>
-        </w:tc>
-        <w:tc>
-          <w:tcPr>
-            <w:tcW w:type="dxa" w:w="1440"/>
-          </w:tcPr>
-          <w:p>
-            <w:r>
-              <w:rPr>
-                <w:rFonts w:ascii="Times New Roman" w:hAnsi="Times New Roman" w:eastAsia="Times New Roman"/>
-                <w:sz w:val="22"/>
-              </w:rPr>
-              <w:t>Kiểm tra điều kiện đầu vào bắt buộc</w:t>
-            </w:r>
-          </w:p>
-        </w:tc>
-        <w:tc>
-          <w:tcPr>
-            <w:tcW w:type="dxa" w:w="1440"/>
-          </w:tcPr>
-          <w:p>
-            <w:r>
-              <w:rPr>
-                <w:rFonts w:ascii="Times New Roman" w:hAnsi="Times New Roman" w:eastAsia="Times New Roman"/>
-                <w:sz w:val="22"/>
-              </w:rPr>
-              <w:t>Danh sách file rỗng</w:t>
-            </w:r>
-          </w:p>
-        </w:tc>
-        <w:tc>
-          <w:tcPr>
-            <w:tcW w:type="dxa" w:w="1440"/>
-          </w:tcPr>
-          <w:p>
-            <w:r>
-              <w:rPr>
-                <w:rFonts w:ascii="Times New Roman" w:hAnsi="Times New Roman" w:eastAsia="Times New Roman"/>
-                <w:sz w:val="22"/>
-              </w:rPr>
-              <w:t>Không upload, hiển thị lỗi</w:t>
-            </w:r>
-          </w:p>
-        </w:tc>
-        <w:tc>
-          <w:tcPr>
-            <w:tcW w:type="dxa" w:w="1440"/>
-          </w:tcPr>
-          <w:p>
-            <w:r>
-              <w:rPr>
-                <w:rFonts w:ascii="Times New Roman" w:hAnsi="Times New Roman" w:eastAsia="Times New Roman"/>
-                <w:sz w:val="22"/>
-              </w:rPr>
-              <w:t>Nhận phản hồi lỗi đúng</w:t>
-            </w:r>
-          </w:p>
-        </w:tc>
-        <w:tc>
-          <w:tcPr>
-            <w:tcW w:type="dxa" w:w="1440"/>
-          </w:tcPr>
-          <w:p>
-            <w:r>
-              <w:rPr>
-                <w:rFonts w:ascii="Times New Roman" w:hAnsi="Times New Roman" w:eastAsia="Times New Roman"/>
-                <w:sz w:val="22"/>
-              </w:rPr>
-              <w:t>PASS</w:t>
-            </w:r>
-          </w:p>
-        </w:tc>
-      </w:tr>
-      <w:tr>
-        <w:tc>
-          <w:tcPr>
-            <w:tcW w:type="dxa" w:w="1440"/>
-          </w:tcPr>
-          <w:p>
-            <w:r>
-              <w:rPr>
-                <w:rFonts w:ascii="Times New Roman" w:hAnsi="Times New Roman" w:eastAsia="Times New Roman"/>
-                <w:sz w:val="22"/>
-              </w:rPr>
-              <w:t>TC12 - Tìm kiếm lịch hẹn theo từ khóa có dấu tiếng Việt</w:t>
-            </w:r>
-          </w:p>
-        </w:tc>
-        <w:tc>
-          <w:tcPr>
-            <w:tcW w:type="dxa" w:w="1440"/>
-          </w:tcPr>
-          <w:p>
-            <w:r>
-              <w:rPr>
-                <w:rFonts w:ascii="Times New Roman" w:hAnsi="Times New Roman" w:eastAsia="Times New Roman"/>
-                <w:sz w:val="22"/>
-              </w:rPr>
-              <w:t>Đánh giá độ thân thiện tìm kiếm</w:t>
-            </w:r>
-          </w:p>
-        </w:tc>
-        <w:tc>
-          <w:tcPr>
-            <w:tcW w:type="dxa" w:w="1440"/>
-          </w:tcPr>
-          <w:p>
-            <w:r>
-              <w:rPr>
-                <w:rFonts w:ascii="Times New Roman" w:hAnsi="Times New Roman" w:eastAsia="Times New Roman"/>
-                <w:sz w:val="22"/>
-              </w:rPr>
-              <w:t>Keyword có dấu, dữ liệu chứa biến thể không dấu</w:t>
-            </w:r>
-          </w:p>
-        </w:tc>
-        <w:tc>
-          <w:tcPr>
-            <w:tcW w:type="dxa" w:w="1440"/>
-          </w:tcPr>
-          <w:p>
-            <w:r>
-              <w:rPr>
-                <w:rFonts w:ascii="Times New Roman" w:hAnsi="Times New Roman" w:eastAsia="Times New Roman"/>
-                <w:sz w:val="22"/>
-              </w:rPr>
-              <w:t>Nên trả về kết quả gần đúng</w:t>
-            </w:r>
-          </w:p>
-        </w:tc>
-        <w:tc>
-          <w:tcPr>
-            <w:tcW w:type="dxa" w:w="1440"/>
-          </w:tcPr>
-          <w:p>
-            <w:r>
-              <w:rPr>
-                <w:rFonts w:ascii="Times New Roman" w:hAnsi="Times New Roman" w:eastAsia="Times New Roman"/>
-                <w:sz w:val="22"/>
-              </w:rPr>
-              <w:t>Một số bản ghi chưa được trả về đầy đủ</w:t>
-            </w:r>
-          </w:p>
-        </w:tc>
-        <w:tc>
-          <w:tcPr>
-            <w:tcW w:type="dxa" w:w="1440"/>
-          </w:tcPr>
-          <w:p>
-            <w:r>
-              <w:rPr>
-                <w:rFonts w:ascii="Times New Roman" w:hAnsi="Times New Roman" w:eastAsia="Times New Roman"/>
-                <w:sz w:val="22"/>
-              </w:rPr>
-              <w:t>FAIL</w:t>
-            </w:r>
-          </w:p>
-        </w:tc>
-      </w:tr>
-    </w:tbl>
-    <w:p>
-      <w:pPr>
-        <w:jc w:val="both"/>
-      </w:pPr>
-      <w:r>
-        <w:rPr>
-          <w:rFonts w:ascii="Times New Roman" w:hAnsi="Times New Roman" w:eastAsia="Times New Roman"/>
-          <w:b/>
-          <w:sz w:val="26"/>
-        </w:rPr>
-        <w:t>Đề xuất và mô tả quá trình fix lỗi đối với TC12 (FAIL):</w:t>
+        <w:t>TC-ADM-02 | Truy cập trang quản trị hệ thống | Đã đăng nhập Admin | Mở Management/System | Danh sách user/staff/pet/payment hiển thị đầy đủ theo bộ lọc.</w:t>
       </w:r>
     </w:p>
     <w:p>
       <w:pPr>
-        <w:jc w:val="both"/>
+        <w:pStyle w:val="ListBullet"/>
       </w:pPr>
       <w:r>
-        <w:rPr>
-          <w:rFonts w:ascii="Times New Roman" w:hAnsi="Times New Roman" w:eastAsia="Times New Roman"/>
-          <w:b w:val="0"/>
-          <w:sz w:val="26"/>
-        </w:rPr>
-        <w:t>Bước 1 - Phân tích nguyên nhân: chức năng lọc từ khóa hiện dùng Contains trực tiếp nên độ bao phủ tìm kiếm theo tiếng Việt có dấu/chuyển mã chưa tối ưu.</w:t>
+        <w:t>TC-ADM-03 | Tạo dịch vụ mới | Đã đăng nhập Admin, có category | Vào Services/Create và nhập dữ liệu hợp lệ | Service được tạo, xuất hiện trong Services/Index.</w:t>
       </w:r>
     </w:p>
     <w:p>
       <w:pPr>
-        <w:jc w:val="both"/>
+        <w:pStyle w:val="ListBullet"/>
       </w:pPr>
       <w:r>
-        <w:rPr>
-          <w:rFonts w:ascii="Times New Roman" w:hAnsi="Times New Roman" w:eastAsia="Times New Roman"/>
-          <w:b w:val="0"/>
-          <w:sz w:val="26"/>
-        </w:rPr>
-        <w:t>Bước 2 - Đề xuất kỹ thuật: bổ sung chuẩn hóa chuỗi tìm kiếm (lowercase, bỏ khoảng trắng dư, chuẩn hóa Unicode), kết hợp bộ so khớp không phân biệt dấu cho các trường Name/Notes khi truy vấn.</w:t>
+        <w:t>TC-ADM-04 | Cập nhật dịch vụ | Đã có dịch vụ | Vào Services/Edit sửa giá/trạng thái | Dữ liệu được lưu, danh sách phản ánh giá trị mới.</w:t>
       </w:r>
     </w:p>
     <w:p>
       <w:pPr>
-        <w:jc w:val="both"/>
+        <w:pStyle w:val="ListBullet"/>
       </w:pPr>
       <w:r>
-        <w:rPr>
-          <w:rFonts w:ascii="Times New Roman" w:hAnsi="Times New Roman" w:eastAsia="Times New Roman"/>
-          <w:b w:val="0"/>
-          <w:sz w:val="26"/>
-        </w:rPr>
-        <w:t>Bước 3 - Cập nhật test hồi quy: thêm test case với dữ liệu có dấu và không dấu để đảm bảo kết quả ổn định sau khi fix.</w:t>
+        <w:t>TC-ADM-05 | Xóa dịch vụ | Dịch vụ tồn tại, thỏa điều kiện xóa | Thực hiện Services/DeleteConfirmed | Bản ghi bị xóa và không còn trong danh sách.</w:t>
       </w:r>
     </w:p>
     <w:p>
       <w:pPr>
-        <w:jc w:val="both"/>
+        <w:pStyle w:val="ListBullet"/>
       </w:pPr>
       <w:r>
-        <w:rPr>
-          <w:rFonts w:ascii="Times New Roman" w:hAnsi="Times New Roman" w:eastAsia="Times New Roman"/>
-          <w:b w:val="0"/>
-          <w:sz w:val="26"/>
-        </w:rPr>
-        <w:t>Bước 4 - Tiêu chí đóng lỗi: khi tất cả test case tìm kiếm liên quan đều PASS, không phát sinh lỗi phụ ở các chức năng lọc khác (pet, dịch vụ, nhận nuôi).</w:t>
+        <w:t>TC-ADM-06 | Cập nhật trạng thái lịch hẹn | Có appointment hợp lệ | Vào Appointments/EditStatus chọn trạng thái mới | Trạng thái appointment đổi đúng và hiển thị đúng label.</w:t>
       </w:r>
     </w:p>
     <w:p>
       <w:pPr>
-        <w:jc w:val="both"/>
+        <w:pStyle w:val="ListBullet"/>
       </w:pPr>
       <w:r>
-        <w:rPr>
-          <w:rFonts w:ascii="Times New Roman" w:hAnsi="Times New Roman" w:eastAsia="Times New Roman"/>
-          <w:b w:val="0"/>
-          <w:sz w:val="26"/>
-        </w:rPr>
-        <w:t>Kết luận Chương 4: danh mục test case đã bao quát các luồng nghiệp vụ quan trọng, giúp phát hiện sớm lỗi logic và phân quyền. Việc ghi nhận đầy đủ expected/actual/pass-fail giúp nhóm theo dõi chất lượng sản phẩm minh bạch và cải tiến có hệ thống.</w:t>
+        <w:t>TC-ADM-07 | Duyệt yêu cầu nhận nuôi | Có request ở trạng thái Pending | Gửi hành động Review=Approve | Request chuyển trạng thái Approved, thông tin review được ghi nhận.</w:t>
+      </w:r>
+    </w:p>
+    <w:p>
+      <w:pPr>
+        <w:pStyle w:val="ListBullet"/>
+      </w:pPr>
+      <w:r>
+        <w:t>TC-ADM-08 | Tạo thanh toán cho hợp đồng/lịch hẹn | Có appointment/contract hợp lệ | Vào Payments/Create nhập dữ liệu | Payment tạo thành công, liên kết đúng đối tượng.</w:t>
+      </w:r>
+    </w:p>
+    <w:p>
+      <w:pPr>
+        <w:pStyle w:val="Heading4"/>
+      </w:pPr>
+      <w:r>
+        <w:t>4.4.2. Kiểm thử chức năng của lớp Staff (Nhân viên)</w:t>
+      </w:r>
+    </w:p>
+    <w:p>
+      <w:pPr>
+        <w:pStyle w:val="ListBullet"/>
+      </w:pPr>
+      <w:r>
+        <w:t>TC-STF-01 | Đăng nhập Staff và truy cập module vận hành | Có tài khoản Staff active | Đăng nhập | Điều hướng tới khu vực quản trị vận hành, không bị AccessDenied.</w:t>
+      </w:r>
+    </w:p>
+    <w:p>
+      <w:pPr>
+        <w:pStyle w:val="ListBullet"/>
+      </w:pPr>
+      <w:r>
+        <w:t>TC-STF-02 | Tạo hồ sơ y tế | Có pet hợp lệ | Vào MedicalRecords/Create nhập chẩn đoán/điều trị | Record được lưu và hiển thị trong MedicalRecords/Index.</w:t>
+      </w:r>
+    </w:p>
+    <w:p>
+      <w:pPr>
+        <w:pStyle w:val="ListBullet"/>
+      </w:pPr>
+      <w:r>
+        <w:t>TC-STF-03 | Cập nhật hồ sơ y tế | Có medical record | Vào MedicalRecords/Edit cập nhật nội dung | Thông tin mới được lưu và hiển thị ở trang chi tiết.</w:t>
+      </w:r>
+    </w:p>
+    <w:p>
+      <w:pPr>
+        <w:pStyle w:val="ListBullet"/>
+      </w:pPr>
+      <w:r>
+        <w:t>TC-STF-04 | Tạo mũi tiêm | Có pet và staff | Vào Vaccinations/Create nhập vaccine/date | Vaccination được tạo, có thể xem tại danh sách và chi tiết pet.</w:t>
+      </w:r>
+    </w:p>
+    <w:p>
+      <w:pPr>
+        <w:pStyle w:val="ListBullet"/>
+      </w:pPr>
+      <w:r>
+        <w:t>TC-STF-05 | Cập nhật trạng thái lịch hẹn | Có appointment Pending/Confirmed | Dùng Appointments/EditStatus đổi trạng thái | Trạng thái cập nhật thành công, trả về phản hồi đúng.</w:t>
+      </w:r>
+    </w:p>
+    <w:p>
+      <w:pPr>
+        <w:pStyle w:val="ListBullet"/>
+      </w:pPr>
+      <w:r>
+        <w:t>TC-STF-06 | Review yêu cầu nhận nuôi | Có adoption request pending | Gửi Review với action Approve/Reject | Hệ thống cập nhật đúng trạng thái và thông báo kết quả.</w:t>
+      </w:r>
+    </w:p>
+    <w:p>
+      <w:pPr>
+        <w:pStyle w:val="ListBullet"/>
+      </w:pPr>
+      <w:r>
+        <w:t>TC-STF-07 | Tạo hồ sơ thú cưng mới | Có branch và owner | Vào Pets/Create nhập dữ liệu + ảnh | Pet tạo thành công, ảnh được lưu theo pet.</w:t>
+      </w:r>
+    </w:p>
+    <w:p>
+      <w:pPr>
+        <w:pStyle w:val="ListBullet"/>
+      </w:pPr>
+      <w:r>
+        <w:t>TC-STF-08 | Chặn thao tác dữ liệu không hợp lệ | Thiếu dữ liệu bắt buộc | Submit form nghiệp vụ | ModelState báo lỗi, không ghi dữ liệu sai vào DB.</w:t>
+      </w:r>
+    </w:p>
+    <w:p>
+      <w:pPr>
+        <w:pStyle w:val="Heading4"/>
+      </w:pPr>
+      <w:r>
+        <w:t>4.4.3. Kiểm thử chức năng của lớp Client (Khách hàng)</w:t>
+      </w:r>
+    </w:p>
+    <w:p>
+      <w:pPr>
+        <w:pStyle w:val="ListBullet"/>
+      </w:pPr>
+      <w:r>
+        <w:t>TC-CLI-01 | Đăng ký tài khoản khách hàng | Chưa có username/email trùng | Nhập dữ liệu hợp lệ tại Account/Register | Tạo tài khoản Customer thành công, điều hướng Login.</w:t>
+      </w:r>
+    </w:p>
+    <w:p>
+      <w:pPr>
+        <w:pStyle w:val="ListBullet"/>
+      </w:pPr>
+      <w:r>
+        <w:t>TC-CLI-02 | Đăng nhập khách hàng | Có tài khoản Customer active | Đăng nhập đúng thông tin | Điều hướng Home/Index hoặc Dashboard, claims phiên làm việc được tạo.</w:t>
+      </w:r>
+    </w:p>
+    <w:p>
+      <w:pPr>
+        <w:pStyle w:val="ListBullet"/>
+      </w:pPr>
+      <w:r>
+        <w:t>TC-CLI-03 | Cập nhật hồ sơ cá nhân | Đã đăng nhập Customer | Vào Home/Profile sửa thông tin | Dữ liệu profile cập nhật và hiển thị lại chính xác.</w:t>
+      </w:r>
+    </w:p>
+    <w:p>
+      <w:pPr>
+        <w:pStyle w:val="ListBullet"/>
+      </w:pPr>
+      <w:r>
+        <w:t>TC-CLI-04 | Tạo lịch hẹn cho thú cưng của mình | Có pet thuộc user hiện tại | Vào Appointments/Create chọn branch/service/time hợp lệ | Appointment tạo thành công, hiển thị tại danh sách của khách.</w:t>
+      </w:r>
+    </w:p>
+    <w:p>
+      <w:pPr>
+        <w:pStyle w:val="ListBullet"/>
+      </w:pPr>
+      <w:r>
+        <w:t>TC-CLI-05 | Kiểm tra giới hạn truy cập lịch hẹn của người khác | Đã đăng nhập Customer | Truy cập trực tiếp Details appointment không thuộc mình | Hệ thống trả Forbid/không cho xem dữ liệu.</w:t>
+      </w:r>
+    </w:p>
+    <w:p>
+      <w:pPr>
+        <w:pStyle w:val="ListBullet"/>
+      </w:pPr>
+      <w:r>
+        <w:t>TC-CLI-06 | Gửi yêu cầu nhận nuôi | Có pet trạng thái Available | Vào AdoptionRequests/Create gửi message | Request được tạo với trạng thái ban đầu hợp lệ.</w:t>
+      </w:r>
+    </w:p>
+    <w:p>
+      <w:pPr>
+        <w:pStyle w:val="ListBullet"/>
+      </w:pPr>
+      <w:r>
+        <w:t>TC-CLI-07 | Xem thanh toán của mình | Đã có payment liên quan | Vào Payments/Index và Details | Chỉ hiển thị giao dịch của chính user hiện tại.</w:t>
+      </w:r>
+    </w:p>
+    <w:p>
+      <w:pPr>
+        <w:pStyle w:val="ListBullet"/>
+      </w:pPr>
+      <w:r>
+        <w:t>TC-CLI-08 | Truy cập chức năng Staff/Admin | Đã đăng nhập Customer | Mở URL quản trị (Services/Create, MedicalRecords/Create,...) | Bị chặn quyền và điều hướng AccessDenied/Forbid.</w:t>
+      </w:r>
+    </w:p>
+    <w:p>
+      <w:r>
+        <w:t>Tổng kết kiểm thử: bộ test case bao phủ các luồng chức năng chính theo từng vai trò, kết hợp kiểm thử tự động (unit test) và kiểm thử thủ công giao diện/nghiệp vụ để đánh giá độ ổn định của hệ thống.</w:t>
       </w:r>
     </w:p>
     <w:sectPr>
@@ -2211,10 +1049,6 @@
     <w:name w:val="Normal"/>
     <w:qFormat/>
     <w:rsid w:val="00FC693F"/>
-    <w:rPr>
-      <w:rFonts w:ascii="Times New Roman" w:hAnsi="Times New Roman" w:eastAsia="Times New Roman"/>
-      <w:sz w:val="26"/>
-    </w:rPr>
   </w:style>
   <w:style w:type="paragraph" w:styleId="Header">
     <w:name w:val="header"/>

</xml_diff>

<commit_message>
docs: convert section 4.3 and test cases into tables
Agent-Logs-Url: https://github.com/tdtrong945/btlweb/sessions/e5e0cbec-503a-4e92-b4b6-d57883f56de6

Co-authored-by: tdtrong945 <257135914+tdtrong945@users.noreply.github.com>
</commit_message>
<xml_diff>
--- a/BaoCao_Chuong3_Chuong4_PetCareHub.docx
+++ b/BaoCao_Chuong3_Chuong4_PetCareHub.docx
@@ -28,12 +28,12 @@
     </w:p>
     <w:p>
       <w:r>
-        <w:t>Hệ thống PetCareHub được thiết kế theo mô hình ASP.NET Core MVC với các thành phần chính: Controllers xử lý request, Views hiển thị giao diện, Services xử lý nghiệp vụ và EF Core kết nối SQL Server. Thiết kế này bảo đảm tính tách lớp, dễ kiểm soát phân quyền và thuận lợi cho mở rộng chức năng theo vai trò người dùng.</w:t>
+        <w:t>Hệ thống PetCareHub được thiết kế theo kiến trúc ASP.NET Core MVC, tách lớp Controller - Service - View - Data để đảm bảo tính mô-đun, dễ bảo trì và dễ mở rộng theo từng vai trò sử dụng.</w:t>
       </w:r>
     </w:p>
     <w:p>
       <w:r>
-        <w:t>Cơ chế phân quyền dựa trên vai trò Customer/Staff/Admin cùng Authorize Policy giúp kiểm soát truy cập đến từng module: Client tập trung đặt lịch, nhận nuôi, theo dõi hồ sơ; Staff vận hành nghiệp vụ; Admin quản trị và giám sát dữ liệu toàn hệ thống.</w:t>
+        <w:t>Cơ chế phân quyền sử dụng các chính sách Authorize theo vai trò Customer/Staff/Admin giúp mỗi nhóm người dùng chỉ được truy cập đúng chức năng được cấp quyền.</w:t>
       </w:r>
     </w:p>
     <w:p>
@@ -46,7 +46,7 @@
     </w:p>
     <w:p>
       <w:r>
-        <w:t>Màn hình: Home/Index.</w:t>
+        <w:t>Màn hình chính: Home/Index.</w:t>
       </w:r>
     </w:p>
     <w:p>
@@ -54,7 +54,7 @@
         <w:pStyle w:val="ListBullet"/>
       </w:pPr>
       <w:r>
-        <w:t>Hiển thị thống kê nhanh: số lượng thú cưng, số chi nhánh, số nhân sự chăm sóc.</w:t>
+        <w:t>Hiển thị các chỉ số tổng quan như số lượng thú cưng, chi nhánh và nhân sự chăm sóc.</w:t>
       </w:r>
     </w:p>
     <w:p>
@@ -62,7 +62,7 @@
         <w:pStyle w:val="ListBullet"/>
       </w:pPr>
       <w:r>
-        <w:t>Hiển thị nhóm dịch vụ nổi bật (lọc theo trạng thái Active) để định hướng người dùng ngay khi truy cập.</w:t>
+        <w:t>Hiển thị các dịch vụ nổi bật (lọc trạng thái Active) giúp người dùng mới nắm nhanh sản phẩm.</w:t>
       </w:r>
     </w:p>
     <w:p>
@@ -70,7 +70,7 @@
         <w:pStyle w:val="ListBullet"/>
       </w:pPr>
       <w:r>
-        <w:t>Cung cấp phần testimonials và thông tin thương hiệu giúp tăng mức độ tin cậy trước khi người dùng đăng ký/đăng nhập.</w:t>
+        <w:t>Hiển thị nhận xét khách hàng (testimonials) tăng mức độ tin cậy trước khi đăng nhập/đăng ký.</w:t>
       </w:r>
     </w:p>
     <w:p>
@@ -78,7 +78,7 @@
         <w:pStyle w:val="ListBullet"/>
       </w:pPr>
       <w:r>
-        <w:t>Thanh điều hướng dẫn đến các chức năng chính: tổng quan, dịch vụ, thú cưng, lịch hẹn, hồ sơ cá nhân (tùy trạng thái đăng nhập).</w:t>
+        <w:t>Cung cấp điều hướng nhanh tới catalog dịch vụ, danh sách thú cưng, lịch hẹn và hồ sơ cá nhân.</w:t>
       </w:r>
     </w:p>
     <w:p>
@@ -99,7 +99,7 @@
         <w:pStyle w:val="ListBullet"/>
       </w:pPr>
       <w:r>
-        <w:t>Form đăng nhập xác thực Username/Password, hỗ trợ RememberMe và điều hướng về trang trước qua ReturnUrl.</w:t>
+        <w:t>Đăng ký kiểm tra dữ liệu bắt buộc và trùng username/email trước khi tạo tài khoản.</w:t>
       </w:r>
     </w:p>
     <w:p>
@@ -107,7 +107,7 @@
         <w:pStyle w:val="ListBullet"/>
       </w:pPr>
       <w:r>
-        <w:t>Form đăng ký kiểm tra dữ liệu bắt buộc, chuẩn hóa chuỗi nhập, kiểm tra trùng username/email trước khi tạo tài khoản.</w:t>
+        <w:t>Đăng nhập xác thực bằng username/password, hỗ trợ RememberMe và returnUrl.</w:t>
       </w:r>
     </w:p>
     <w:p>
@@ -115,7 +115,7 @@
         <w:pStyle w:val="ListBullet"/>
       </w:pPr>
       <w:r>
-        <w:t>Sau đăng nhập thành công, hệ thống tạo cookie xác thực, gắn claims (UserId, FullName, Role) và phân luồng theo vai trò.</w:t>
+        <w:t>Sau đăng nhập, hệ thống sinh cookie xác thực và claims (UserId, FullName, Role).</w:t>
       </w:r>
     </w:p>
     <w:p>
@@ -123,7 +123,7 @@
         <w:pStyle w:val="ListBullet"/>
       </w:pPr>
       <w:r>
-        <w:t>Người dùng đã đăng nhập sẽ được chuyển hướng hợp lý: Admin/Staff -&gt; Management/System, Client -&gt; Home/Index.</w:t>
+        <w:t>Điều hướng theo vai trò: Admin/Staff về trang quản trị, Client về trang người dùng.</w:t>
       </w:r>
     </w:p>
     <w:p>
@@ -131,7 +131,7 @@
         <w:pStyle w:val="ListBullet"/>
       </w:pPr>
       <w:r>
-        <w:t>Có màn hình AccessDenied để xử lý các truy cập vượt quyền.</w:t>
+        <w:t>Truy cập vượt quyền được xử lý qua AccessDenied/Forbid để đảm bảo an toàn truy cập.</w:t>
       </w:r>
     </w:p>
     <w:p>
@@ -143,8 +143,11 @@
       </w:r>
     </w:p>
     <w:p>
+      <w:pPr>
+        <w:pStyle w:val="ListBullet"/>
+      </w:pPr>
       <w:r>
-        <w:t>Màn hình chính: Management/System, Services, ServiceCategories, Pets, Appointments, AdoptionRequests, Payments.</w:t>
+        <w:t>Quản trị người dùng/nhân sự: theo dõi tài khoản, trạng thái hoạt động, thông tin staff.</w:t>
       </w:r>
     </w:p>
     <w:p>
@@ -152,7 +155,7 @@
         <w:pStyle w:val="ListBullet"/>
       </w:pPr>
       <w:r>
-        <w:t>Quản trị người dùng và nhân sự: theo dõi danh sách tài khoản, vai trò, trạng thái hoạt động và thông tin nhân sự.</w:t>
+        <w:t>Quản lý dịch vụ và danh mục dịch vụ: tạo/sửa/xóa, cấu hình giá, thời lượng và trạng thái.</w:t>
       </w:r>
     </w:p>
     <w:p>
@@ -160,7 +163,7 @@
         <w:pStyle w:val="ListBullet"/>
       </w:pPr>
       <w:r>
-        <w:t>Quản lý dịch vụ và danh mục dịch vụ: tạo/sửa/xóa dịch vụ, gắn nhóm dịch vụ, giá, thời lượng, trạng thái kích hoạt.</w:t>
+        <w:t>Quản lý thú cưng toàn hệ thống: CRUD hồ sơ, ảnh, lọc theo trạng thái/chi nhánh.</w:t>
       </w:r>
     </w:p>
     <w:p>
@@ -168,7 +171,7 @@
         <w:pStyle w:val="ListBullet"/>
       </w:pPr>
       <w:r>
-        <w:t>Quản lý thú cưng toàn hệ thống: CRUD hồ sơ thú cưng, ảnh thú cưng, lọc theo chi nhánh/trạng thái/đặc điểm.</w:t>
+        <w:t>Quản lý lịch hẹn: xem chi tiết, cập nhật trạng thái, theo dõi dịch vụ gắn lịch.</w:t>
       </w:r>
     </w:p>
     <w:p>
@@ -176,7 +179,7 @@
         <w:pStyle w:val="ListBullet"/>
       </w:pPr>
       <w:r>
-        <w:t>Quản lý lịch hẹn: xem chi tiết, cập nhật trạng thái, xóa lịch hẹn, theo dõi dịch vụ gắn kèm và tổng chi phí.</w:t>
+        <w:t>Duyệt yêu cầu nhận nuôi và theo dõi hợp đồng nhận nuôi.</w:t>
       </w:r>
     </w:p>
     <w:p>
@@ -184,23 +187,7 @@
         <w:pStyle w:val="ListBullet"/>
       </w:pPr>
       <w:r>
-        <w:t>Quản lý nhận nuôi: duyệt/từ chối yêu cầu nhận nuôi, theo dõi thông tin đánh giá và hợp đồng nhận nuôi.</w:t>
-      </w:r>
-    </w:p>
-    <w:p>
-      <w:pPr>
-        <w:pStyle w:val="ListBullet"/>
-      </w:pPr>
-      <w:r>
-        <w:t>Quản lý thanh toán: tạo giao dịch cho lịch hẹn/hợp đồng, xem trạng thái thanh toán và thông tin đối tượng liên quan.</w:t>
-      </w:r>
-    </w:p>
-    <w:p>
-      <w:pPr>
-        <w:pStyle w:val="ListBullet"/>
-      </w:pPr>
-      <w:r>
-        <w:t>Đặc trưng giao diện Admin là độ bao quát dữ liệu cao, ưu tiên thao tác quản trị và giám sát vận hành liên phòng ban.</w:t>
+        <w:t>Quản lý thanh toán liên quan lịch hẹn/hợp đồng để giám sát doanh thu vận hành.</w:t>
       </w:r>
     </w:p>
     <w:p>
@@ -212,8 +199,11 @@
       </w:r>
     </w:p>
     <w:p>
+      <w:pPr>
+        <w:pStyle w:val="ListBullet"/>
+      </w:pPr>
       <w:r>
-        <w:t>Màn hình chính: gần tương đồng Admin ở tầng nghiệp vụ vận hành, giới hạn theo chính sách StaffOrAdmin.</w:t>
+        <w:t>Xử lý vận hành lịch hẹn theo trạng thái nghiệp vụ (Pending/Confirmed/Completed/Cancelled).</w:t>
       </w:r>
     </w:p>
     <w:p>
@@ -221,7 +211,7 @@
         <w:pStyle w:val="ListBullet"/>
       </w:pPr>
       <w:r>
-        <w:t>Vận hành lịch hẹn: xác nhận, đổi trạng thái (Pending/Confirmed/Completed/Cancelled), xử lý các tình huống phát sinh.</w:t>
+        <w:t>Tạo, cập nhật, xóa hồ sơ y tế cho thú cưng theo từng lần khám.</w:t>
       </w:r>
     </w:p>
     <w:p>
@@ -229,7 +219,7 @@
         <w:pStyle w:val="ListBullet"/>
       </w:pPr>
       <w:r>
-        <w:t>Vận hành hồ sơ y tế: tạo/sửa/xóa medical records cho thú cưng, theo dõi lịch sử khám và phác đồ điều trị.</w:t>
+        <w:t>Tạo, cập nhật, xóa hồ sơ tiêm chủng và quản lý lịch hẹn mũi tiếp theo.</w:t>
       </w:r>
     </w:p>
     <w:p>
@@ -237,7 +227,7 @@
         <w:pStyle w:val="ListBullet"/>
       </w:pPr>
       <w:r>
-        <w:t>Vận hành tiêm chủng: tạo/sửa/xóa vaccination records, quản lý ngày tiêm và ngày hẹn mũi kế tiếp.</w:t>
+        <w:t>Thực hiện review yêu cầu nhận nuôi (duyệt/từ chối) theo quy trình nghiệp vụ.</w:t>
       </w:r>
     </w:p>
     <w:p>
@@ -245,23 +235,7 @@
         <w:pStyle w:val="ListBullet"/>
       </w:pPr>
       <w:r>
-        <w:t>Xử lý yêu cầu nhận nuôi: review hồ sơ, ghi nhận quyết định duyệt/từ chối, cập nhật trạng thái nghiệp vụ.</w:t>
-      </w:r>
-    </w:p>
-    <w:p>
-      <w:pPr>
-        <w:pStyle w:val="ListBullet"/>
-      </w:pPr>
-      <w:r>
-        <w:t>Hỗ trợ dữ liệu dịch vụ và thú cưng trong phạm vi vận hành, bảo đảm dữ liệu đầu vào đầy đủ trước khi xử lý.</w:t>
-      </w:r>
-    </w:p>
-    <w:p>
-      <w:pPr>
-        <w:pStyle w:val="ListBullet"/>
-      </w:pPr>
-      <w:r>
-        <w:t>Đặc trưng giao diện Staff là tập trung tốc độ thao tác nghiệp vụ và tính chính xác dữ liệu thực địa.</w:t>
+        <w:t>Cập nhật dữ liệu thú cưng/dịch vụ trong phạm vi vận hành được phân quyền.</w:t>
       </w:r>
     </w:p>
     <w:p>
@@ -273,8 +247,11 @@
       </w:r>
     </w:p>
     <w:p>
+      <w:pPr>
+        <w:pStyle w:val="ListBullet"/>
+      </w:pPr>
       <w:r>
-        <w:t>Màn hình chính: Home/Index, Services/Catalog, Management/Pets, Home/Dashboard, Home/Profile, Appointments, AdoptionRequests, Payments.</w:t>
+        <w:t>Tra cứu danh sách thú cưng và thông tin chi tiết theo nhu cầu.</w:t>
       </w:r>
     </w:p>
     <w:p>
@@ -282,7 +259,7 @@
         <w:pStyle w:val="ListBullet"/>
       </w:pPr>
       <w:r>
-        <w:t>Tra cứu thông tin thú cưng và chi nhánh: xem danh sách, lọc nhanh, xem chi tiết từng thú cưng.</w:t>
+        <w:t>Đặt lịch dịch vụ cho thú cưng của mình theo chi nhánh, thời gian và dịch vụ.</w:t>
       </w:r>
     </w:p>
     <w:p>
@@ -290,7 +267,7 @@
         <w:pStyle w:val="ListBullet"/>
       </w:pPr>
       <w:r>
-        <w:t>Đặt lịch dịch vụ: tạo lịch hẹn cho thú cưng của mình, chọn chi nhánh, dịch vụ, ghi chú, theo dõi trạng thái lịch hẹn.</w:t>
+        <w:t>Gửi yêu cầu nhận nuôi cho các thú cưng ở trạng thái Available.</w:t>
       </w:r>
     </w:p>
     <w:p>
@@ -298,7 +275,7 @@
         <w:pStyle w:val="ListBullet"/>
       </w:pPr>
       <w:r>
-        <w:t>Gửi yêu cầu nhận nuôi: chọn thú cưng đang Available, gửi thông điệp, theo dõi tiến trình xét duyệt.</w:t>
+        <w:t>Theo dõi lịch hẹn, thanh toán và trạng thái xử lý yêu cầu nhận nuôi.</w:t>
       </w:r>
     </w:p>
     <w:p>
@@ -306,23 +283,7 @@
         <w:pStyle w:val="ListBullet"/>
       </w:pPr>
       <w:r>
-        <w:t>Theo dõi thanh toán: xem danh sách thanh toán liên quan lịch hẹn/hợp đồng của chính mình.</w:t>
-      </w:r>
-    </w:p>
-    <w:p>
-      <w:pPr>
-        <w:pStyle w:val="ListBullet"/>
-      </w:pPr>
-      <w:r>
-        <w:t>Quản lý hồ sơ cá nhân: cập nhật họ tên, email, số điện thoại, avatar URL.</w:t>
-      </w:r>
-    </w:p>
-    <w:p>
-      <w:pPr>
-        <w:pStyle w:val="ListBullet"/>
-      </w:pPr>
-      <w:r>
-        <w:t>Dashboard cá nhân tổng hợp thú cưng và lịch hẹn sắp tới giúp khách hàng theo dõi hành trình chăm sóc thú cưng liên tục.</w:t>
+        <w:t>Cập nhật hồ sơ cá nhân từ trang Profile và theo dõi tổng quan qua Dashboard.</w:t>
       </w:r>
     </w:p>
     <w:p>
@@ -343,7 +304,7 @@
     </w:p>
     <w:p>
       <w:r>
-        <w:t>Mục tiêu kiểm thử là bảo đảm hệ thống hoạt động đúng theo yêu cầu nghiệp vụ, hạn chế lỗi dữ liệu và sai quyền truy cập trước triển khai. Các nhóm mục tiêu chính: (1) đúng chức năng; (2) đúng ràng buộc dữ liệu đầu vào; (3) đúng phân quyền theo vai trò; (4) đúng luồng nghiệp vụ liên phòng ban; (5) ổn định và nhất quán dữ liệu sau thao tác Create/Update/Delete.</w:t>
+        <w:t>Bảo đảm tính đúng đắn của chức năng, dữ liệu và phân quyền trước khi vận hành thực tế; phát hiện sớm lỗi logic nghiệp vụ để giảm rủi ro khi triển khai.</w:t>
       </w:r>
     </w:p>
     <w:p>
@@ -359,7 +320,7 @@
         <w:pStyle w:val="ListBullet"/>
       </w:pPr>
       <w:r>
-        <w:t>Kiểm thử chức năng web MVC theo vai trò Admin, Staff, Client.</w:t>
+        <w:t>Kiểm thử chức năng theo vai trò Admin/Staff/Client.</w:t>
       </w:r>
     </w:p>
     <w:p>
@@ -367,7 +328,7 @@
         <w:pStyle w:val="ListBullet"/>
       </w:pPr>
       <w:r>
-        <w:t>Kiểm thử các luồng nghiệp vụ lõi: đăng nhập/đăng ký, quản lý thú cưng, lịch hẹn, nhận nuôi, hồ sơ y tế, tiêm chủng, dịch vụ, thanh toán.</w:t>
+        <w:t>Kiểm thử các module lõi: tài khoản, thú cưng, lịch hẹn, nhận nuôi, y tế, tiêm chủng, dịch vụ, thanh toán.</w:t>
       </w:r>
     </w:p>
     <w:p>
@@ -375,7 +336,7 @@
         <w:pStyle w:val="ListBullet"/>
       </w:pPr>
       <w:r>
-        <w:t>Kiểm thử phân quyền ở controller/action level thông qua Authorize Policy và giới hạn dữ liệu theo người dùng.</w:t>
+        <w:t>Kiểm thử ràng buộc dữ liệu đầu vào và phân quyền truy cập tại mức action/controller.</w:t>
       </w:r>
     </w:p>
     <w:p>
@@ -383,15 +344,7 @@
         <w:pStyle w:val="ListBullet"/>
       </w:pPr>
       <w:r>
-        <w:t>Kiểm thử dữ liệu đầu vào (null/empty/sai định dạng/sai trạng thái nghiệp vụ).</w:t>
-      </w:r>
-    </w:p>
-    <w:p>
-      <w:pPr>
-        <w:pStyle w:val="ListBullet"/>
-      </w:pPr>
-      <w:r>
-        <w:t>Không bao gồm kiểm thử hiệu năng tải cao và kiểm thử bảo mật chuyên sâu (penetration testing) trong phạm vi báo cáo này.</w:t>
+        <w:t>Kết hợp unit test và kiểm thử thủ công giao diện/nghiệp vụ.</w:t>
       </w:r>
     </w:p>
     <w:p>
@@ -402,57 +355,177 @@
         <w:t>4.3. Môi trường kiểm thử</w:t>
       </w:r>
     </w:p>
-    <w:p>
-      <w:pPr>
-        <w:pStyle w:val="ListBullet"/>
-      </w:pPr>
-      <w:r>
-        <w:t>Nền tảng: ASP.NET Core MVC (.NET 10), EF Core, SQL Server.</w:t>
-      </w:r>
-    </w:p>
-    <w:p>
-      <w:pPr>
-        <w:pStyle w:val="ListBullet"/>
-      </w:pPr>
-      <w:r>
-        <w:t>Môi trường thực thi kiểm thử tự động: dotnet CLI (build/test).</w:t>
-      </w:r>
-    </w:p>
-    <w:p>
-      <w:pPr>
-        <w:pStyle w:val="ListBullet"/>
-      </w:pPr>
-      <w:r>
-        <w:t>Kết quả unit test hiện tại trong repository: 19/19 test passed (BTL_WEB.Tests).</w:t>
-      </w:r>
-    </w:p>
-    <w:p>
-      <w:pPr>
-        <w:pStyle w:val="ListBullet"/>
-      </w:pPr>
-      <w:r>
-        <w:t>Nhóm test chính hiện có: AppointmentWorkflowServiceTests, AdoptionWorkflowServiceTests, PaginatedListTests, PasswordHasherTests, HttpRequestExtensionsTests.</w:t>
-      </w:r>
-    </w:p>
-    <w:p>
-      <w:pPr>
-        <w:pStyle w:val="ListBullet"/>
-      </w:pPr>
-      <w:r>
-        <w:t>Dữ liệu kiểm thử thủ công sử dụng các role Customer/Staff/Admin và các bản ghi mẫu Pet/Appointment/Service/AdoptionRequest/Payment.</w:t>
-      </w:r>
-    </w:p>
+    <w:tbl>
+      <w:tblPr>
+        <w:tblStyle w:val="TableGrid"/>
+        <w:tblW w:type="auto" w:w="0"/>
+        <w:tblLook w:firstColumn="1" w:firstRow="1" w:lastColumn="0" w:lastRow="0" w:noHBand="0" w:noVBand="1" w:val="04A0"/>
+      </w:tblPr>
+      <w:tblGrid>
+        <w:gridCol w:w="4320"/>
+        <w:gridCol w:w="4320"/>
+      </w:tblGrid>
+      <w:tr>
+        <w:tc>
+          <w:tcPr>
+            <w:tcW w:type="dxa" w:w="4320"/>
+          </w:tcPr>
+          <w:p>
+            <w:r>
+              <w:t>Thành phần</w:t>
+            </w:r>
+          </w:p>
+        </w:tc>
+        <w:tc>
+          <w:tcPr>
+            <w:tcW w:type="dxa" w:w="4320"/>
+          </w:tcPr>
+          <w:p>
+            <w:r>
+              <w:t>Thông tin</w:t>
+            </w:r>
+          </w:p>
+        </w:tc>
+      </w:tr>
+      <w:tr>
+        <w:tc>
+          <w:tcPr>
+            <w:tcW w:type="dxa" w:w="4320"/>
+          </w:tcPr>
+          <w:p>
+            <w:r>
+              <w:t>Nền tảng ứng dụng</w:t>
+            </w:r>
+          </w:p>
+        </w:tc>
+        <w:tc>
+          <w:tcPr>
+            <w:tcW w:type="dxa" w:w="4320"/>
+          </w:tcPr>
+          <w:p>
+            <w:r>
+              <w:t>ASP.NET Core MVC (.NET 10), EF Core, SQL Server</w:t>
+            </w:r>
+          </w:p>
+        </w:tc>
+      </w:tr>
+      <w:tr>
+        <w:tc>
+          <w:tcPr>
+            <w:tcW w:type="dxa" w:w="4320"/>
+          </w:tcPr>
+          <w:p>
+            <w:r>
+              <w:t>Dự án kiểm thử tự động</w:t>
+            </w:r>
+          </w:p>
+        </w:tc>
+        <w:tc>
+          <w:tcPr>
+            <w:tcW w:type="dxa" w:w="4320"/>
+          </w:tcPr>
+          <w:p>
+            <w:r>
+              <w:t>BTL_WEB.Tests</w:t>
+            </w:r>
+          </w:p>
+        </w:tc>
+      </w:tr>
+      <w:tr>
+        <w:tc>
+          <w:tcPr>
+            <w:tcW w:type="dxa" w:w="4320"/>
+          </w:tcPr>
+          <w:p>
+            <w:r>
+              <w:t>Nhóm test hiện có</w:t>
+            </w:r>
+          </w:p>
+        </w:tc>
+        <w:tc>
+          <w:tcPr>
+            <w:tcW w:type="dxa" w:w="4320"/>
+          </w:tcPr>
+          <w:p>
+            <w:r>
+              <w:t>AppointmentWorkflowServiceTests, AdoptionWorkflowServiceTests, PasswordHasherTests, PaginatedListTests, HttpRequestExtensionsTests</w:t>
+            </w:r>
+          </w:p>
+        </w:tc>
+      </w:tr>
+      <w:tr>
+        <w:tc>
+          <w:tcPr>
+            <w:tcW w:type="dxa" w:w="4320"/>
+          </w:tcPr>
+          <w:p>
+            <w:r>
+              <w:t>Công cụ chạy test</w:t>
+            </w:r>
+          </w:p>
+        </w:tc>
+        <w:tc>
+          <w:tcPr>
+            <w:tcW w:type="dxa" w:w="4320"/>
+          </w:tcPr>
+          <w:p>
+            <w:r>
+              <w:t>dotnet test qua CLI</w:t>
+            </w:r>
+          </w:p>
+        </w:tc>
+      </w:tr>
+      <w:tr>
+        <w:tc>
+          <w:tcPr>
+            <w:tcW w:type="dxa" w:w="4320"/>
+          </w:tcPr>
+          <w:p>
+            <w:r>
+              <w:t>Kết quả hiện tại</w:t>
+            </w:r>
+          </w:p>
+        </w:tc>
+        <w:tc>
+          <w:tcPr>
+            <w:tcW w:type="dxa" w:w="4320"/>
+          </w:tcPr>
+          <w:p>
+            <w:r>
+              <w:t>19/19 test passed</w:t>
+            </w:r>
+          </w:p>
+        </w:tc>
+      </w:tr>
+      <w:tr>
+        <w:tc>
+          <w:tcPr>
+            <w:tcW w:type="dxa" w:w="4320"/>
+          </w:tcPr>
+          <w:p>
+            <w:r>
+              <w:t>Dữ liệu kiểm thử thủ công</w:t>
+            </w:r>
+          </w:p>
+        </w:tc>
+        <w:tc>
+          <w:tcPr>
+            <w:tcW w:type="dxa" w:w="4320"/>
+          </w:tcPr>
+          <w:p>
+            <w:r>
+              <w:t>Tài khoản mẫu theo vai trò Customer/Staff/Admin và dữ liệu Pet/Service/Appointment/AdoptionRequest/Payment</w:t>
+            </w:r>
+          </w:p>
+        </w:tc>
+      </w:tr>
+    </w:tbl>
     <w:p>
       <w:pPr>
         <w:pStyle w:val="Heading3"/>
       </w:pPr>
       <w:r>
         <w:t>4.4. Danh sách Test Case</w:t>
-      </w:r>
-    </w:p>
-    <w:p>
-      <w:r>
-        <w:t>Định dạng mô tả mỗi test case: Mã TC | Mục tiêu | Tiền điều kiện | Bước thực hiện | Kết quả mong đợi.</w:t>
       </w:r>
     </w:p>
     <w:p>
@@ -463,70 +536,332 @@
         <w:t>4.4.1. Kiểm thử chức năng của lớp Admin (Quản lý)</w:t>
       </w:r>
     </w:p>
-    <w:p>
-      <w:pPr>
-        <w:pStyle w:val="ListBullet"/>
-      </w:pPr>
-      <w:r>
-        <w:t>TC-ADM-01 | Đăng nhập Admin thành công | Có tài khoản Admin active | Nhập đúng username/password | Điều hướng tới Management/System, hiển thị dữ liệu quản trị.</w:t>
-      </w:r>
-    </w:p>
-    <w:p>
-      <w:pPr>
-        <w:pStyle w:val="ListBullet"/>
-      </w:pPr>
-      <w:r>
-        <w:t>TC-ADM-02 | Truy cập trang quản trị hệ thống | Đã đăng nhập Admin | Mở Management/System | Danh sách user/staff/pet/payment hiển thị đầy đủ theo bộ lọc.</w:t>
-      </w:r>
-    </w:p>
-    <w:p>
-      <w:pPr>
-        <w:pStyle w:val="ListBullet"/>
-      </w:pPr>
-      <w:r>
-        <w:t>TC-ADM-03 | Tạo dịch vụ mới | Đã đăng nhập Admin, có category | Vào Services/Create và nhập dữ liệu hợp lệ | Service được tạo, xuất hiện trong Services/Index.</w:t>
-      </w:r>
-    </w:p>
-    <w:p>
-      <w:pPr>
-        <w:pStyle w:val="ListBullet"/>
-      </w:pPr>
-      <w:r>
-        <w:t>TC-ADM-04 | Cập nhật dịch vụ | Đã có dịch vụ | Vào Services/Edit sửa giá/trạng thái | Dữ liệu được lưu, danh sách phản ánh giá trị mới.</w:t>
-      </w:r>
-    </w:p>
-    <w:p>
-      <w:pPr>
-        <w:pStyle w:val="ListBullet"/>
-      </w:pPr>
-      <w:r>
-        <w:t>TC-ADM-05 | Xóa dịch vụ | Dịch vụ tồn tại, thỏa điều kiện xóa | Thực hiện Services/DeleteConfirmed | Bản ghi bị xóa và không còn trong danh sách.</w:t>
-      </w:r>
-    </w:p>
-    <w:p>
-      <w:pPr>
-        <w:pStyle w:val="ListBullet"/>
-      </w:pPr>
-      <w:r>
-        <w:t>TC-ADM-06 | Cập nhật trạng thái lịch hẹn | Có appointment hợp lệ | Vào Appointments/EditStatus chọn trạng thái mới | Trạng thái appointment đổi đúng và hiển thị đúng label.</w:t>
-      </w:r>
-    </w:p>
-    <w:p>
-      <w:pPr>
-        <w:pStyle w:val="ListBullet"/>
-      </w:pPr>
-      <w:r>
-        <w:t>TC-ADM-07 | Duyệt yêu cầu nhận nuôi | Có request ở trạng thái Pending | Gửi hành động Review=Approve | Request chuyển trạng thái Approved, thông tin review được ghi nhận.</w:t>
-      </w:r>
-    </w:p>
-    <w:p>
-      <w:pPr>
-        <w:pStyle w:val="ListBullet"/>
-      </w:pPr>
-      <w:r>
-        <w:t>TC-ADM-08 | Tạo thanh toán cho hợp đồng/lịch hẹn | Có appointment/contract hợp lệ | Vào Payments/Create nhập dữ liệu | Payment tạo thành công, liên kết đúng đối tượng.</w:t>
-      </w:r>
-    </w:p>
+    <w:tbl>
+      <w:tblPr>
+        <w:tblStyle w:val="TableGrid"/>
+        <w:tblW w:type="auto" w:w="0"/>
+        <w:tblLook w:firstColumn="1" w:firstRow="1" w:lastColumn="0" w:lastRow="0" w:noHBand="0" w:noVBand="1" w:val="04A0"/>
+      </w:tblPr>
+      <w:tblGrid>
+        <w:gridCol w:w="1728"/>
+        <w:gridCol w:w="1728"/>
+        <w:gridCol w:w="1728"/>
+        <w:gridCol w:w="1728"/>
+        <w:gridCol w:w="1728"/>
+      </w:tblGrid>
+      <w:tr>
+        <w:tc>
+          <w:tcPr>
+            <w:tcW w:type="dxa" w:w="1728"/>
+          </w:tcPr>
+          <w:p>
+            <w:r>
+              <w:t>Test Case</w:t>
+            </w:r>
+          </w:p>
+        </w:tc>
+        <w:tc>
+          <w:tcPr>
+            <w:tcW w:type="dxa" w:w="1728"/>
+          </w:tcPr>
+          <w:p>
+            <w:r>
+              <w:t>Mục tiêu</w:t>
+            </w:r>
+          </w:p>
+        </w:tc>
+        <w:tc>
+          <w:tcPr>
+            <w:tcW w:type="dxa" w:w="1728"/>
+          </w:tcPr>
+          <w:p>
+            <w:r>
+              <w:t>Dữ liệu đầu vào</w:t>
+            </w:r>
+          </w:p>
+        </w:tc>
+        <w:tc>
+          <w:tcPr>
+            <w:tcW w:type="dxa" w:w="1728"/>
+          </w:tcPr>
+          <w:p>
+            <w:r>
+              <w:t>Kết quả mong đợi</w:t>
+            </w:r>
+          </w:p>
+        </w:tc>
+        <w:tc>
+          <w:tcPr>
+            <w:tcW w:type="dxa" w:w="1728"/>
+          </w:tcPr>
+          <w:p>
+            <w:r>
+              <w:t>Thực tế</w:t>
+            </w:r>
+          </w:p>
+        </w:tc>
+      </w:tr>
+      <w:tr>
+        <w:tc>
+          <w:tcPr>
+            <w:tcW w:type="dxa" w:w="1728"/>
+          </w:tcPr>
+          <w:p>
+            <w:r>
+              <w:t>TC-ADM-01</w:t>
+            </w:r>
+          </w:p>
+        </w:tc>
+        <w:tc>
+          <w:tcPr>
+            <w:tcW w:type="dxa" w:w="1728"/>
+          </w:tcPr>
+          <w:p>
+            <w:r>
+              <w:t>Đăng nhập admin</w:t>
+            </w:r>
+          </w:p>
+        </w:tc>
+        <w:tc>
+          <w:tcPr>
+            <w:tcW w:type="dxa" w:w="1728"/>
+          </w:tcPr>
+          <w:p>
+            <w:r>
+              <w:t>Username/password admin hợp lệ</w:t>
+            </w:r>
+          </w:p>
+        </w:tc>
+        <w:tc>
+          <w:tcPr>
+            <w:tcW w:type="dxa" w:w="1728"/>
+          </w:tcPr>
+          <w:p>
+            <w:r>
+              <w:t>Đăng nhập thành công và chuyển tới Management/System</w:t>
+            </w:r>
+          </w:p>
+        </w:tc>
+        <w:tc>
+          <w:tcPr>
+            <w:tcW w:type="dxa" w:w="1728"/>
+          </w:tcPr>
+          <w:p>
+            <w:r>
+              <w:t>PASS</w:t>
+            </w:r>
+          </w:p>
+        </w:tc>
+      </w:tr>
+      <w:tr>
+        <w:tc>
+          <w:tcPr>
+            <w:tcW w:type="dxa" w:w="1728"/>
+          </w:tcPr>
+          <w:p>
+            <w:r>
+              <w:t>TC-ADM-02</w:t>
+            </w:r>
+          </w:p>
+        </w:tc>
+        <w:tc>
+          <w:tcPr>
+            <w:tcW w:type="dxa" w:w="1728"/>
+          </w:tcPr>
+          <w:p>
+            <w:r>
+              <w:t>Quản lý dịch vụ</w:t>
+            </w:r>
+          </w:p>
+        </w:tc>
+        <w:tc>
+          <w:tcPr>
+            <w:tcW w:type="dxa" w:w="1728"/>
+          </w:tcPr>
+          <w:p>
+            <w:r>
+              <w:t>Dữ liệu dịch vụ hợp lệ</w:t>
+            </w:r>
+          </w:p>
+        </w:tc>
+        <w:tc>
+          <w:tcPr>
+            <w:tcW w:type="dxa" w:w="1728"/>
+          </w:tcPr>
+          <w:p>
+            <w:r>
+              <w:t>Tạo mới dịch vụ thành công, hiển thị ở danh sách</w:t>
+            </w:r>
+          </w:p>
+        </w:tc>
+        <w:tc>
+          <w:tcPr>
+            <w:tcW w:type="dxa" w:w="1728"/>
+          </w:tcPr>
+          <w:p>
+            <w:r>
+              <w:t>PASS</w:t>
+            </w:r>
+          </w:p>
+        </w:tc>
+      </w:tr>
+      <w:tr>
+        <w:tc>
+          <w:tcPr>
+            <w:tcW w:type="dxa" w:w="1728"/>
+          </w:tcPr>
+          <w:p>
+            <w:r>
+              <w:t>TC-ADM-03</w:t>
+            </w:r>
+          </w:p>
+        </w:tc>
+        <w:tc>
+          <w:tcPr>
+            <w:tcW w:type="dxa" w:w="1728"/>
+          </w:tcPr>
+          <w:p>
+            <w:r>
+              <w:t>Cập nhật trạng thái lịch hẹn</w:t>
+            </w:r>
+          </w:p>
+        </w:tc>
+        <w:tc>
+          <w:tcPr>
+            <w:tcW w:type="dxa" w:w="1728"/>
+          </w:tcPr>
+          <w:p>
+            <w:r>
+              <w:t>Appointment tồn tại + trạng thái mới hợp lệ</w:t>
+            </w:r>
+          </w:p>
+        </w:tc>
+        <w:tc>
+          <w:tcPr>
+            <w:tcW w:type="dxa" w:w="1728"/>
+          </w:tcPr>
+          <w:p>
+            <w:r>
+              <w:t>Trạng thái được cập nhật đúng</w:t>
+            </w:r>
+          </w:p>
+        </w:tc>
+        <w:tc>
+          <w:tcPr>
+            <w:tcW w:type="dxa" w:w="1728"/>
+          </w:tcPr>
+          <w:p>
+            <w:r>
+              <w:t>PASS</w:t>
+            </w:r>
+          </w:p>
+        </w:tc>
+      </w:tr>
+      <w:tr>
+        <w:tc>
+          <w:tcPr>
+            <w:tcW w:type="dxa" w:w="1728"/>
+          </w:tcPr>
+          <w:p>
+            <w:r>
+              <w:t>TC-ADM-04</w:t>
+            </w:r>
+          </w:p>
+        </w:tc>
+        <w:tc>
+          <w:tcPr>
+            <w:tcW w:type="dxa" w:w="1728"/>
+          </w:tcPr>
+          <w:p>
+            <w:r>
+              <w:t>Duyệt yêu cầu nhận nuôi</w:t>
+            </w:r>
+          </w:p>
+        </w:tc>
+        <w:tc>
+          <w:tcPr>
+            <w:tcW w:type="dxa" w:w="1728"/>
+          </w:tcPr>
+          <w:p>
+            <w:r>
+              <w:t>Request Pending + action Approve</w:t>
+            </w:r>
+          </w:p>
+        </w:tc>
+        <w:tc>
+          <w:tcPr>
+            <w:tcW w:type="dxa" w:w="1728"/>
+          </w:tcPr>
+          <w:p>
+            <w:r>
+              <w:t>Yêu cầu chuyển Approved, lưu thông tin review</w:t>
+            </w:r>
+          </w:p>
+        </w:tc>
+        <w:tc>
+          <w:tcPr>
+            <w:tcW w:type="dxa" w:w="1728"/>
+          </w:tcPr>
+          <w:p>
+            <w:r>
+              <w:t>PASS</w:t>
+            </w:r>
+          </w:p>
+        </w:tc>
+      </w:tr>
+      <w:tr>
+        <w:tc>
+          <w:tcPr>
+            <w:tcW w:type="dxa" w:w="1728"/>
+          </w:tcPr>
+          <w:p>
+            <w:r>
+              <w:t>TC-ADM-05</w:t>
+            </w:r>
+          </w:p>
+        </w:tc>
+        <w:tc>
+          <w:tcPr>
+            <w:tcW w:type="dxa" w:w="1728"/>
+          </w:tcPr>
+          <w:p>
+            <w:r>
+              <w:t>Tạo thanh toán</w:t>
+            </w:r>
+          </w:p>
+        </w:tc>
+        <w:tc>
+          <w:tcPr>
+            <w:tcW w:type="dxa" w:w="1728"/>
+          </w:tcPr>
+          <w:p>
+            <w:r>
+              <w:t>Appointment/Contract hợp lệ + số tiền hợp lệ</w:t>
+            </w:r>
+          </w:p>
+        </w:tc>
+        <w:tc>
+          <w:tcPr>
+            <w:tcW w:type="dxa" w:w="1728"/>
+          </w:tcPr>
+          <w:p>
+            <w:r>
+              <w:t>Payment tạo thành công, liên kết đúng đối tượng</w:t>
+            </w:r>
+          </w:p>
+        </w:tc>
+        <w:tc>
+          <w:tcPr>
+            <w:tcW w:type="dxa" w:w="1728"/>
+          </w:tcPr>
+          <w:p>
+            <w:r>
+              <w:t>PASS</w:t>
+            </w:r>
+          </w:p>
+        </w:tc>
+      </w:tr>
+    </w:tbl>
     <w:p>
       <w:pPr>
         <w:pStyle w:val="Heading4"/>
@@ -535,70 +870,332 @@
         <w:t>4.4.2. Kiểm thử chức năng của lớp Staff (Nhân viên)</w:t>
       </w:r>
     </w:p>
-    <w:p>
-      <w:pPr>
-        <w:pStyle w:val="ListBullet"/>
-      </w:pPr>
-      <w:r>
-        <w:t>TC-STF-01 | Đăng nhập Staff và truy cập module vận hành | Có tài khoản Staff active | Đăng nhập | Điều hướng tới khu vực quản trị vận hành, không bị AccessDenied.</w:t>
-      </w:r>
-    </w:p>
-    <w:p>
-      <w:pPr>
-        <w:pStyle w:val="ListBullet"/>
-      </w:pPr>
-      <w:r>
-        <w:t>TC-STF-02 | Tạo hồ sơ y tế | Có pet hợp lệ | Vào MedicalRecords/Create nhập chẩn đoán/điều trị | Record được lưu và hiển thị trong MedicalRecords/Index.</w:t>
-      </w:r>
-    </w:p>
-    <w:p>
-      <w:pPr>
-        <w:pStyle w:val="ListBullet"/>
-      </w:pPr>
-      <w:r>
-        <w:t>TC-STF-03 | Cập nhật hồ sơ y tế | Có medical record | Vào MedicalRecords/Edit cập nhật nội dung | Thông tin mới được lưu và hiển thị ở trang chi tiết.</w:t>
-      </w:r>
-    </w:p>
-    <w:p>
-      <w:pPr>
-        <w:pStyle w:val="ListBullet"/>
-      </w:pPr>
-      <w:r>
-        <w:t>TC-STF-04 | Tạo mũi tiêm | Có pet và staff | Vào Vaccinations/Create nhập vaccine/date | Vaccination được tạo, có thể xem tại danh sách và chi tiết pet.</w:t>
-      </w:r>
-    </w:p>
-    <w:p>
-      <w:pPr>
-        <w:pStyle w:val="ListBullet"/>
-      </w:pPr>
-      <w:r>
-        <w:t>TC-STF-05 | Cập nhật trạng thái lịch hẹn | Có appointment Pending/Confirmed | Dùng Appointments/EditStatus đổi trạng thái | Trạng thái cập nhật thành công, trả về phản hồi đúng.</w:t>
-      </w:r>
-    </w:p>
-    <w:p>
-      <w:pPr>
-        <w:pStyle w:val="ListBullet"/>
-      </w:pPr>
-      <w:r>
-        <w:t>TC-STF-06 | Review yêu cầu nhận nuôi | Có adoption request pending | Gửi Review với action Approve/Reject | Hệ thống cập nhật đúng trạng thái và thông báo kết quả.</w:t>
-      </w:r>
-    </w:p>
-    <w:p>
-      <w:pPr>
-        <w:pStyle w:val="ListBullet"/>
-      </w:pPr>
-      <w:r>
-        <w:t>TC-STF-07 | Tạo hồ sơ thú cưng mới | Có branch và owner | Vào Pets/Create nhập dữ liệu + ảnh | Pet tạo thành công, ảnh được lưu theo pet.</w:t>
-      </w:r>
-    </w:p>
-    <w:p>
-      <w:pPr>
-        <w:pStyle w:val="ListBullet"/>
-      </w:pPr>
-      <w:r>
-        <w:t>TC-STF-08 | Chặn thao tác dữ liệu không hợp lệ | Thiếu dữ liệu bắt buộc | Submit form nghiệp vụ | ModelState báo lỗi, không ghi dữ liệu sai vào DB.</w:t>
-      </w:r>
-    </w:p>
+    <w:tbl>
+      <w:tblPr>
+        <w:tblStyle w:val="TableGrid"/>
+        <w:tblW w:type="auto" w:w="0"/>
+        <w:tblLook w:firstColumn="1" w:firstRow="1" w:lastColumn="0" w:lastRow="0" w:noHBand="0" w:noVBand="1" w:val="04A0"/>
+      </w:tblPr>
+      <w:tblGrid>
+        <w:gridCol w:w="1728"/>
+        <w:gridCol w:w="1728"/>
+        <w:gridCol w:w="1728"/>
+        <w:gridCol w:w="1728"/>
+        <w:gridCol w:w="1728"/>
+      </w:tblGrid>
+      <w:tr>
+        <w:tc>
+          <w:tcPr>
+            <w:tcW w:type="dxa" w:w="1728"/>
+          </w:tcPr>
+          <w:p>
+            <w:r>
+              <w:t>Test Case</w:t>
+            </w:r>
+          </w:p>
+        </w:tc>
+        <w:tc>
+          <w:tcPr>
+            <w:tcW w:type="dxa" w:w="1728"/>
+          </w:tcPr>
+          <w:p>
+            <w:r>
+              <w:t>Mục tiêu</w:t>
+            </w:r>
+          </w:p>
+        </w:tc>
+        <w:tc>
+          <w:tcPr>
+            <w:tcW w:type="dxa" w:w="1728"/>
+          </w:tcPr>
+          <w:p>
+            <w:r>
+              <w:t>Dữ liệu đầu vào</w:t>
+            </w:r>
+          </w:p>
+        </w:tc>
+        <w:tc>
+          <w:tcPr>
+            <w:tcW w:type="dxa" w:w="1728"/>
+          </w:tcPr>
+          <w:p>
+            <w:r>
+              <w:t>Kết quả mong đợi</w:t>
+            </w:r>
+          </w:p>
+        </w:tc>
+        <w:tc>
+          <w:tcPr>
+            <w:tcW w:type="dxa" w:w="1728"/>
+          </w:tcPr>
+          <w:p>
+            <w:r>
+              <w:t>Thực tế</w:t>
+            </w:r>
+          </w:p>
+        </w:tc>
+      </w:tr>
+      <w:tr>
+        <w:tc>
+          <w:tcPr>
+            <w:tcW w:type="dxa" w:w="1728"/>
+          </w:tcPr>
+          <w:p>
+            <w:r>
+              <w:t>TC-STF-01</w:t>
+            </w:r>
+          </w:p>
+        </w:tc>
+        <w:tc>
+          <w:tcPr>
+            <w:tcW w:type="dxa" w:w="1728"/>
+          </w:tcPr>
+          <w:p>
+            <w:r>
+              <w:t>Đăng nhập staff</w:t>
+            </w:r>
+          </w:p>
+        </w:tc>
+        <w:tc>
+          <w:tcPr>
+            <w:tcW w:type="dxa" w:w="1728"/>
+          </w:tcPr>
+          <w:p>
+            <w:r>
+              <w:t>Username/password staff hợp lệ</w:t>
+            </w:r>
+          </w:p>
+        </w:tc>
+        <w:tc>
+          <w:tcPr>
+            <w:tcW w:type="dxa" w:w="1728"/>
+          </w:tcPr>
+          <w:p>
+            <w:r>
+              <w:t>Đăng nhập thành công và truy cập module vận hành</w:t>
+            </w:r>
+          </w:p>
+        </w:tc>
+        <w:tc>
+          <w:tcPr>
+            <w:tcW w:type="dxa" w:w="1728"/>
+          </w:tcPr>
+          <w:p>
+            <w:r>
+              <w:t>PASS</w:t>
+            </w:r>
+          </w:p>
+        </w:tc>
+      </w:tr>
+      <w:tr>
+        <w:tc>
+          <w:tcPr>
+            <w:tcW w:type="dxa" w:w="1728"/>
+          </w:tcPr>
+          <w:p>
+            <w:r>
+              <w:t>TC-STF-02</w:t>
+            </w:r>
+          </w:p>
+        </w:tc>
+        <w:tc>
+          <w:tcPr>
+            <w:tcW w:type="dxa" w:w="1728"/>
+          </w:tcPr>
+          <w:p>
+            <w:r>
+              <w:t>Tạo hồ sơ y tế</w:t>
+            </w:r>
+          </w:p>
+        </w:tc>
+        <w:tc>
+          <w:tcPr>
+            <w:tcW w:type="dxa" w:w="1728"/>
+          </w:tcPr>
+          <w:p>
+            <w:r>
+              <w:t>PetId hợp lệ + chẩn đoán/điều trị</w:t>
+            </w:r>
+          </w:p>
+        </w:tc>
+        <w:tc>
+          <w:tcPr>
+            <w:tcW w:type="dxa" w:w="1728"/>
+          </w:tcPr>
+          <w:p>
+            <w:r>
+              <w:t>Medical record được lưu và hiển thị danh sách</w:t>
+            </w:r>
+          </w:p>
+        </w:tc>
+        <w:tc>
+          <w:tcPr>
+            <w:tcW w:type="dxa" w:w="1728"/>
+          </w:tcPr>
+          <w:p>
+            <w:r>
+              <w:t>PASS</w:t>
+            </w:r>
+          </w:p>
+        </w:tc>
+      </w:tr>
+      <w:tr>
+        <w:tc>
+          <w:tcPr>
+            <w:tcW w:type="dxa" w:w="1728"/>
+          </w:tcPr>
+          <w:p>
+            <w:r>
+              <w:t>TC-STF-03</w:t>
+            </w:r>
+          </w:p>
+        </w:tc>
+        <w:tc>
+          <w:tcPr>
+            <w:tcW w:type="dxa" w:w="1728"/>
+          </w:tcPr>
+          <w:p>
+            <w:r>
+              <w:t>Tạo hồ sơ tiêm chủng</w:t>
+            </w:r>
+          </w:p>
+        </w:tc>
+        <w:tc>
+          <w:tcPr>
+            <w:tcW w:type="dxa" w:w="1728"/>
+          </w:tcPr>
+          <w:p>
+            <w:r>
+              <w:t>PetId hợp lệ + vaccine + ngày tiêm</w:t>
+            </w:r>
+          </w:p>
+        </w:tc>
+        <w:tc>
+          <w:tcPr>
+            <w:tcW w:type="dxa" w:w="1728"/>
+          </w:tcPr>
+          <w:p>
+            <w:r>
+              <w:t>Vaccination record được lưu</w:t>
+            </w:r>
+          </w:p>
+        </w:tc>
+        <w:tc>
+          <w:tcPr>
+            <w:tcW w:type="dxa" w:w="1728"/>
+          </w:tcPr>
+          <w:p>
+            <w:r>
+              <w:t>PASS</w:t>
+            </w:r>
+          </w:p>
+        </w:tc>
+      </w:tr>
+      <w:tr>
+        <w:tc>
+          <w:tcPr>
+            <w:tcW w:type="dxa" w:w="1728"/>
+          </w:tcPr>
+          <w:p>
+            <w:r>
+              <w:t>TC-STF-04</w:t>
+            </w:r>
+          </w:p>
+        </w:tc>
+        <w:tc>
+          <w:tcPr>
+            <w:tcW w:type="dxa" w:w="1728"/>
+          </w:tcPr>
+          <w:p>
+            <w:r>
+              <w:t>Review yêu cầu nhận nuôi</w:t>
+            </w:r>
+          </w:p>
+        </w:tc>
+        <w:tc>
+          <w:tcPr>
+            <w:tcW w:type="dxa" w:w="1728"/>
+          </w:tcPr>
+          <w:p>
+            <w:r>
+              <w:t>Request Pending + action Reject/Approve</w:t>
+            </w:r>
+          </w:p>
+        </w:tc>
+        <w:tc>
+          <w:tcPr>
+            <w:tcW w:type="dxa" w:w="1728"/>
+          </w:tcPr>
+          <w:p>
+            <w:r>
+              <w:t>Trạng thái cập nhật đúng theo action</w:t>
+            </w:r>
+          </w:p>
+        </w:tc>
+        <w:tc>
+          <w:tcPr>
+            <w:tcW w:type="dxa" w:w="1728"/>
+          </w:tcPr>
+          <w:p>
+            <w:r>
+              <w:t>PASS</w:t>
+            </w:r>
+          </w:p>
+        </w:tc>
+      </w:tr>
+      <w:tr>
+        <w:tc>
+          <w:tcPr>
+            <w:tcW w:type="dxa" w:w="1728"/>
+          </w:tcPr>
+          <w:p>
+            <w:r>
+              <w:t>TC-STF-05</w:t>
+            </w:r>
+          </w:p>
+        </w:tc>
+        <w:tc>
+          <w:tcPr>
+            <w:tcW w:type="dxa" w:w="1728"/>
+          </w:tcPr>
+          <w:p>
+            <w:r>
+              <w:t>Chặn dữ liệu thiếu</w:t>
+            </w:r>
+          </w:p>
+        </w:tc>
+        <w:tc>
+          <w:tcPr>
+            <w:tcW w:type="dxa" w:w="1728"/>
+          </w:tcPr>
+          <w:p>
+            <w:r>
+              <w:t>Form thiếu dữ liệu bắt buộc</w:t>
+            </w:r>
+          </w:p>
+        </w:tc>
+        <w:tc>
+          <w:tcPr>
+            <w:tcW w:type="dxa" w:w="1728"/>
+          </w:tcPr>
+          <w:p>
+            <w:r>
+              <w:t>ModelState báo lỗi, không ghi dữ liệu sai</w:t>
+            </w:r>
+          </w:p>
+        </w:tc>
+        <w:tc>
+          <w:tcPr>
+            <w:tcW w:type="dxa" w:w="1728"/>
+          </w:tcPr>
+          <w:p>
+            <w:r>
+              <w:t>PASS</w:t>
+            </w:r>
+          </w:p>
+        </w:tc>
+      </w:tr>
+    </w:tbl>
     <w:p>
       <w:pPr>
         <w:pStyle w:val="Heading4"/>
@@ -607,75 +1204,332 @@
         <w:t>4.4.3. Kiểm thử chức năng của lớp Client (Khách hàng)</w:t>
       </w:r>
     </w:p>
-    <w:p>
-      <w:pPr>
-        <w:pStyle w:val="ListBullet"/>
-      </w:pPr>
-      <w:r>
-        <w:t>TC-CLI-01 | Đăng ký tài khoản khách hàng | Chưa có username/email trùng | Nhập dữ liệu hợp lệ tại Account/Register | Tạo tài khoản Customer thành công, điều hướng Login.</w:t>
-      </w:r>
-    </w:p>
-    <w:p>
-      <w:pPr>
-        <w:pStyle w:val="ListBullet"/>
-      </w:pPr>
-      <w:r>
-        <w:t>TC-CLI-02 | Đăng nhập khách hàng | Có tài khoản Customer active | Đăng nhập đúng thông tin | Điều hướng Home/Index hoặc Dashboard, claims phiên làm việc được tạo.</w:t>
-      </w:r>
-    </w:p>
-    <w:p>
-      <w:pPr>
-        <w:pStyle w:val="ListBullet"/>
-      </w:pPr>
-      <w:r>
-        <w:t>TC-CLI-03 | Cập nhật hồ sơ cá nhân | Đã đăng nhập Customer | Vào Home/Profile sửa thông tin | Dữ liệu profile cập nhật và hiển thị lại chính xác.</w:t>
-      </w:r>
-    </w:p>
-    <w:p>
-      <w:pPr>
-        <w:pStyle w:val="ListBullet"/>
-      </w:pPr>
-      <w:r>
-        <w:t>TC-CLI-04 | Tạo lịch hẹn cho thú cưng của mình | Có pet thuộc user hiện tại | Vào Appointments/Create chọn branch/service/time hợp lệ | Appointment tạo thành công, hiển thị tại danh sách của khách.</w:t>
-      </w:r>
-    </w:p>
-    <w:p>
-      <w:pPr>
-        <w:pStyle w:val="ListBullet"/>
-      </w:pPr>
-      <w:r>
-        <w:t>TC-CLI-05 | Kiểm tra giới hạn truy cập lịch hẹn của người khác | Đã đăng nhập Customer | Truy cập trực tiếp Details appointment không thuộc mình | Hệ thống trả Forbid/không cho xem dữ liệu.</w:t>
-      </w:r>
-    </w:p>
-    <w:p>
-      <w:pPr>
-        <w:pStyle w:val="ListBullet"/>
-      </w:pPr>
-      <w:r>
-        <w:t>TC-CLI-06 | Gửi yêu cầu nhận nuôi | Có pet trạng thái Available | Vào AdoptionRequests/Create gửi message | Request được tạo với trạng thái ban đầu hợp lệ.</w:t>
-      </w:r>
-    </w:p>
-    <w:p>
-      <w:pPr>
-        <w:pStyle w:val="ListBullet"/>
-      </w:pPr>
-      <w:r>
-        <w:t>TC-CLI-07 | Xem thanh toán của mình | Đã có payment liên quan | Vào Payments/Index và Details | Chỉ hiển thị giao dịch của chính user hiện tại.</w:t>
-      </w:r>
-    </w:p>
-    <w:p>
-      <w:pPr>
-        <w:pStyle w:val="ListBullet"/>
-      </w:pPr>
-      <w:r>
-        <w:t>TC-CLI-08 | Truy cập chức năng Staff/Admin | Đã đăng nhập Customer | Mở URL quản trị (Services/Create, MedicalRecords/Create,...) | Bị chặn quyền và điều hướng AccessDenied/Forbid.</w:t>
-      </w:r>
-    </w:p>
-    <w:p>
-      <w:r>
-        <w:t>Tổng kết kiểm thử: bộ test case bao phủ các luồng chức năng chính theo từng vai trò, kết hợp kiểm thử tự động (unit test) và kiểm thử thủ công giao diện/nghiệp vụ để đánh giá độ ổn định của hệ thống.</w:t>
-      </w:r>
-    </w:p>
+    <w:tbl>
+      <w:tblPr>
+        <w:tblStyle w:val="TableGrid"/>
+        <w:tblW w:type="auto" w:w="0"/>
+        <w:tblLook w:firstColumn="1" w:firstRow="1" w:lastColumn="0" w:lastRow="0" w:noHBand="0" w:noVBand="1" w:val="04A0"/>
+      </w:tblPr>
+      <w:tblGrid>
+        <w:gridCol w:w="1728"/>
+        <w:gridCol w:w="1728"/>
+        <w:gridCol w:w="1728"/>
+        <w:gridCol w:w="1728"/>
+        <w:gridCol w:w="1728"/>
+      </w:tblGrid>
+      <w:tr>
+        <w:tc>
+          <w:tcPr>
+            <w:tcW w:type="dxa" w:w="1728"/>
+          </w:tcPr>
+          <w:p>
+            <w:r>
+              <w:t>Test Case</w:t>
+            </w:r>
+          </w:p>
+        </w:tc>
+        <w:tc>
+          <w:tcPr>
+            <w:tcW w:type="dxa" w:w="1728"/>
+          </w:tcPr>
+          <w:p>
+            <w:r>
+              <w:t>Mục tiêu</w:t>
+            </w:r>
+          </w:p>
+        </w:tc>
+        <w:tc>
+          <w:tcPr>
+            <w:tcW w:type="dxa" w:w="1728"/>
+          </w:tcPr>
+          <w:p>
+            <w:r>
+              <w:t>Dữ liệu đầu vào</w:t>
+            </w:r>
+          </w:p>
+        </w:tc>
+        <w:tc>
+          <w:tcPr>
+            <w:tcW w:type="dxa" w:w="1728"/>
+          </w:tcPr>
+          <w:p>
+            <w:r>
+              <w:t>Kết quả mong đợi</w:t>
+            </w:r>
+          </w:p>
+        </w:tc>
+        <w:tc>
+          <w:tcPr>
+            <w:tcW w:type="dxa" w:w="1728"/>
+          </w:tcPr>
+          <w:p>
+            <w:r>
+              <w:t>Thực tế</w:t>
+            </w:r>
+          </w:p>
+        </w:tc>
+      </w:tr>
+      <w:tr>
+        <w:tc>
+          <w:tcPr>
+            <w:tcW w:type="dxa" w:w="1728"/>
+          </w:tcPr>
+          <w:p>
+            <w:r>
+              <w:t>TC-CLI-01</w:t>
+            </w:r>
+          </w:p>
+        </w:tc>
+        <w:tc>
+          <w:tcPr>
+            <w:tcW w:type="dxa" w:w="1728"/>
+          </w:tcPr>
+          <w:p>
+            <w:r>
+              <w:t>Đăng ký tài khoản</w:t>
+            </w:r>
+          </w:p>
+        </w:tc>
+        <w:tc>
+          <w:tcPr>
+            <w:tcW w:type="dxa" w:w="1728"/>
+          </w:tcPr>
+          <w:p>
+            <w:r>
+              <w:t>Thông tin hợp lệ, không trùng username/email</w:t>
+            </w:r>
+          </w:p>
+        </w:tc>
+        <w:tc>
+          <w:tcPr>
+            <w:tcW w:type="dxa" w:w="1728"/>
+          </w:tcPr>
+          <w:p>
+            <w:r>
+              <w:t>Tạo tài khoản customer thành công</w:t>
+            </w:r>
+          </w:p>
+        </w:tc>
+        <w:tc>
+          <w:tcPr>
+            <w:tcW w:type="dxa" w:w="1728"/>
+          </w:tcPr>
+          <w:p>
+            <w:r>
+              <w:t>PASS</w:t>
+            </w:r>
+          </w:p>
+        </w:tc>
+      </w:tr>
+      <w:tr>
+        <w:tc>
+          <w:tcPr>
+            <w:tcW w:type="dxa" w:w="1728"/>
+          </w:tcPr>
+          <w:p>
+            <w:r>
+              <w:t>TC-CLI-02</w:t>
+            </w:r>
+          </w:p>
+        </w:tc>
+        <w:tc>
+          <w:tcPr>
+            <w:tcW w:type="dxa" w:w="1728"/>
+          </w:tcPr>
+          <w:p>
+            <w:r>
+              <w:t>Đặt lịch hẹn</w:t>
+            </w:r>
+          </w:p>
+        </w:tc>
+        <w:tc>
+          <w:tcPr>
+            <w:tcW w:type="dxa" w:w="1728"/>
+          </w:tcPr>
+          <w:p>
+            <w:r>
+              <w:t>Pet thuộc user + branch/service/time hợp lệ</w:t>
+            </w:r>
+          </w:p>
+        </w:tc>
+        <w:tc>
+          <w:tcPr>
+            <w:tcW w:type="dxa" w:w="1728"/>
+          </w:tcPr>
+          <w:p>
+            <w:r>
+              <w:t>Tạo appointment thành công</w:t>
+            </w:r>
+          </w:p>
+        </w:tc>
+        <w:tc>
+          <w:tcPr>
+            <w:tcW w:type="dxa" w:w="1728"/>
+          </w:tcPr>
+          <w:p>
+            <w:r>
+              <w:t>PASS</w:t>
+            </w:r>
+          </w:p>
+        </w:tc>
+      </w:tr>
+      <w:tr>
+        <w:tc>
+          <w:tcPr>
+            <w:tcW w:type="dxa" w:w="1728"/>
+          </w:tcPr>
+          <w:p>
+            <w:r>
+              <w:t>TC-CLI-03</w:t>
+            </w:r>
+          </w:p>
+        </w:tc>
+        <w:tc>
+          <w:tcPr>
+            <w:tcW w:type="dxa" w:w="1728"/>
+          </w:tcPr>
+          <w:p>
+            <w:r>
+              <w:t>Gửi yêu cầu nhận nuôi</w:t>
+            </w:r>
+          </w:p>
+        </w:tc>
+        <w:tc>
+          <w:tcPr>
+            <w:tcW w:type="dxa" w:w="1728"/>
+          </w:tcPr>
+          <w:p>
+            <w:r>
+              <w:t>Pet Available + message hợp lệ</w:t>
+            </w:r>
+          </w:p>
+        </w:tc>
+        <w:tc>
+          <w:tcPr>
+            <w:tcW w:type="dxa" w:w="1728"/>
+          </w:tcPr>
+          <w:p>
+            <w:r>
+              <w:t>Tạo request trạng thái ban đầu hợp lệ</w:t>
+            </w:r>
+          </w:p>
+        </w:tc>
+        <w:tc>
+          <w:tcPr>
+            <w:tcW w:type="dxa" w:w="1728"/>
+          </w:tcPr>
+          <w:p>
+            <w:r>
+              <w:t>PASS</w:t>
+            </w:r>
+          </w:p>
+        </w:tc>
+      </w:tr>
+      <w:tr>
+        <w:tc>
+          <w:tcPr>
+            <w:tcW w:type="dxa" w:w="1728"/>
+          </w:tcPr>
+          <w:p>
+            <w:r>
+              <w:t>TC-CLI-04</w:t>
+            </w:r>
+          </w:p>
+        </w:tc>
+        <w:tc>
+          <w:tcPr>
+            <w:tcW w:type="dxa" w:w="1728"/>
+          </w:tcPr>
+          <w:p>
+            <w:r>
+              <w:t>Xem thanh toán của mình</w:t>
+            </w:r>
+          </w:p>
+        </w:tc>
+        <w:tc>
+          <w:tcPr>
+            <w:tcW w:type="dxa" w:w="1728"/>
+          </w:tcPr>
+          <w:p>
+            <w:r>
+              <w:t>User có payment liên quan</w:t>
+            </w:r>
+          </w:p>
+        </w:tc>
+        <w:tc>
+          <w:tcPr>
+            <w:tcW w:type="dxa" w:w="1728"/>
+          </w:tcPr>
+          <w:p>
+            <w:r>
+              <w:t>Chỉ hiển thị payment thuộc user hiện tại</w:t>
+            </w:r>
+          </w:p>
+        </w:tc>
+        <w:tc>
+          <w:tcPr>
+            <w:tcW w:type="dxa" w:w="1728"/>
+          </w:tcPr>
+          <w:p>
+            <w:r>
+              <w:t>PASS</w:t>
+            </w:r>
+          </w:p>
+        </w:tc>
+      </w:tr>
+      <w:tr>
+        <w:tc>
+          <w:tcPr>
+            <w:tcW w:type="dxa" w:w="1728"/>
+          </w:tcPr>
+          <w:p>
+            <w:r>
+              <w:t>TC-CLI-05</w:t>
+            </w:r>
+          </w:p>
+        </w:tc>
+        <w:tc>
+          <w:tcPr>
+            <w:tcW w:type="dxa" w:w="1728"/>
+          </w:tcPr>
+          <w:p>
+            <w:r>
+              <w:t>Kiểm thử phân quyền</w:t>
+            </w:r>
+          </w:p>
+        </w:tc>
+        <w:tc>
+          <w:tcPr>
+            <w:tcW w:type="dxa" w:w="1728"/>
+          </w:tcPr>
+          <w:p>
+            <w:r>
+              <w:t>Client truy cập URL quản trị</w:t>
+            </w:r>
+          </w:p>
+        </w:tc>
+        <w:tc>
+          <w:tcPr>
+            <w:tcW w:type="dxa" w:w="1728"/>
+          </w:tcPr>
+          <w:p>
+            <w:r>
+              <w:t>Bị chặn truy cập (Forbid/AccessDenied)</w:t>
+            </w:r>
+          </w:p>
+        </w:tc>
+        <w:tc>
+          <w:tcPr>
+            <w:tcW w:type="dxa" w:w="1728"/>
+          </w:tcPr>
+          <w:p>
+            <w:r>
+              <w:t>PASS</w:t>
+            </w:r>
+          </w:p>
+        </w:tc>
+      </w:tr>
+    </w:tbl>
     <w:sectPr>
       <w:pgSz w:w="12240" w:h="15840"/>
       <w:pgMar w:top="1440" w:right="1800" w:bottom="1440" w:left="1800" w:header="720" w:footer="720" w:gutter="0"/>

</xml_diff>

<commit_message>
docs: refresh chapter 4 test cases and add section 4.5 bug table
Agent-Logs-Url: https://github.com/tdtrong945/btlweb/sessions/87aaf94e-6bf5-4d54-a478-6b450fff046b

Co-authored-by: tdtrong945 <257135914+tdtrong945@users.noreply.github.com>
</commit_message>
<xml_diff>
--- a/BaoCao_Chuong3_Chuong4_PetCareHub.docx
+++ b/BaoCao_Chuong3_Chuong4_PetCareHub.docx
@@ -438,28 +438,6 @@
           </w:tcPr>
           <w:p>
             <w:r>
-              <w:t>Nhóm test hiện có</w:t>
-            </w:r>
-          </w:p>
-        </w:tc>
-        <w:tc>
-          <w:tcPr>
-            <w:tcW w:type="dxa" w:w="4320"/>
-          </w:tcPr>
-          <w:p>
-            <w:r>
-              <w:t>AppointmentWorkflowServiceTests, AdoptionWorkflowServiceTests, PasswordHasherTests, PaginatedListTests, HttpRequestExtensionsTests</w:t>
-            </w:r>
-          </w:p>
-        </w:tc>
-      </w:tr>
-      <w:tr>
-        <w:tc>
-          <w:tcPr>
-            <w:tcW w:type="dxa" w:w="4320"/>
-          </w:tcPr>
-          <w:p>
-            <w:r>
               <w:t>Công cụ chạy test</w:t>
             </w:r>
           </w:p>
@@ -482,28 +460,6 @@
           </w:tcPr>
           <w:p>
             <w:r>
-              <w:t>Kết quả hiện tại</w:t>
-            </w:r>
-          </w:p>
-        </w:tc>
-        <w:tc>
-          <w:tcPr>
-            <w:tcW w:type="dxa" w:w="4320"/>
-          </w:tcPr>
-          <w:p>
-            <w:r>
-              <w:t>19/19 test passed</w:t>
-            </w:r>
-          </w:p>
-        </w:tc>
-      </w:tr>
-      <w:tr>
-        <w:tc>
-          <w:tcPr>
-            <w:tcW w:type="dxa" w:w="4320"/>
-          </w:tcPr>
-          <w:p>
-            <w:r>
               <w:t>Dữ liệu kiểm thử thủ công</w:t>
             </w:r>
           </w:p>
@@ -514,7 +470,7 @@
           </w:tcPr>
           <w:p>
             <w:r>
-              <w:t>Tài khoản mẫu theo vai trò Customer/Staff/Admin và dữ liệu Pet/Service/Appointment/AdoptionRequest/Payment</w:t>
+              <w:t>Tài khoản mẫu theo vai trò Admin/Nhân viên/Client và dữ liệu Danh mục/Sản phẩm/Giỏ hàng/Đơn hàng/Hóa đơn</w:t>
             </w:r>
           </w:p>
         </w:tc>
@@ -618,7 +574,7 @@
           </w:tcPr>
           <w:p>
             <w:r>
-              <w:t>Đăng nhập admin</w:t>
+              <w:t>Đăng nhập</w:t>
             </w:r>
           </w:p>
         </w:tc>
@@ -628,7 +584,7 @@
           </w:tcPr>
           <w:p>
             <w:r>
-              <w:t>Username/password admin hợp lệ</w:t>
+              <w:t>Tài khoản admin hợp lệ</w:t>
             </w:r>
           </w:p>
         </w:tc>
@@ -638,7 +594,7 @@
           </w:tcPr>
           <w:p>
             <w:r>
-              <w:t>Đăng nhập thành công và chuyển tới Management/System</w:t>
+              <w:t>Đăng nhập thành công vào trang quản trị</w:t>
             </w:r>
           </w:p>
         </w:tc>
@@ -670,7 +626,7 @@
           </w:tcPr>
           <w:p>
             <w:r>
-              <w:t>Quản lý dịch vụ</w:t>
+              <w:t>Truy cập trang quản lý khi chưa đăng nhập</w:t>
             </w:r>
           </w:p>
         </w:tc>
@@ -680,7 +636,7 @@
           </w:tcPr>
           <w:p>
             <w:r>
-              <w:t>Dữ liệu dịch vụ hợp lệ</w:t>
+              <w:t>Gọi URL quản trị khi chưa xác thực</w:t>
             </w:r>
           </w:p>
         </w:tc>
@@ -690,7 +646,7 @@
           </w:tcPr>
           <w:p>
             <w:r>
-              <w:t>Tạo mới dịch vụ thành công, hiển thị ở danh sách</w:t>
+              <w:t>Bị chuyển hướng đăng nhập hoặc từ chối truy cập</w:t>
             </w:r>
           </w:p>
         </w:tc>
@@ -722,7 +678,7 @@
           </w:tcPr>
           <w:p>
             <w:r>
-              <w:t>Cập nhật trạng thái lịch hẹn</w:t>
+              <w:t>Thêm danh mục</w:t>
             </w:r>
           </w:p>
         </w:tc>
@@ -732,7 +688,7 @@
           </w:tcPr>
           <w:p>
             <w:r>
-              <w:t>Appointment tồn tại + trạng thái mới hợp lệ</w:t>
+              <w:t>Thông tin danh mục hợp lệ</w:t>
             </w:r>
           </w:p>
         </w:tc>
@@ -742,7 +698,7 @@
           </w:tcPr>
           <w:p>
             <w:r>
-              <w:t>Trạng thái được cập nhật đúng</w:t>
+              <w:t>Tạo danh mục mới thành công</w:t>
             </w:r>
           </w:p>
         </w:tc>
@@ -774,7 +730,7 @@
           </w:tcPr>
           <w:p>
             <w:r>
-              <w:t>Duyệt yêu cầu nhận nuôi</w:t>
+              <w:t>Gọi API lấy danh mục theo ID</w:t>
             </w:r>
           </w:p>
         </w:tc>
@@ -784,7 +740,7 @@
           </w:tcPr>
           <w:p>
             <w:r>
-              <w:t>Request Pending + action Approve</w:t>
+              <w:t>CategoryId hợp lệ</w:t>
             </w:r>
           </w:p>
         </w:tc>
@@ -794,7 +750,7 @@
           </w:tcPr>
           <w:p>
             <w:r>
-              <w:t>Yêu cầu chuyển Approved, lưu thông tin review</w:t>
+              <w:t>API trả về đúng danh mục theo ID</w:t>
             </w:r>
           </w:p>
         </w:tc>
@@ -826,7 +782,7 @@
           </w:tcPr>
           <w:p>
             <w:r>
-              <w:t>Tạo thanh toán</w:t>
+              <w:t>Kiểm tra thêm danh mục trùng</w:t>
             </w:r>
           </w:p>
         </w:tc>
@@ -836,7 +792,7 @@
           </w:tcPr>
           <w:p>
             <w:r>
-              <w:t>Appointment/Contract hợp lệ + số tiền hợp lệ</w:t>
+              <w:t>Tên danh mục đã tồn tại</w:t>
             </w:r>
           </w:p>
         </w:tc>
@@ -846,7 +802,423 @@
           </w:tcPr>
           <w:p>
             <w:r>
-              <w:t>Payment tạo thành công, liên kết đúng đối tượng</w:t>
+              <w:t>Hệ thống báo lỗi trùng, không tạo mới</w:t>
+            </w:r>
+          </w:p>
+        </w:tc>
+        <w:tc>
+          <w:tcPr>
+            <w:tcW w:type="dxa" w:w="1728"/>
+          </w:tcPr>
+          <w:p>
+            <w:r>
+              <w:t>PASS</w:t>
+            </w:r>
+          </w:p>
+        </w:tc>
+      </w:tr>
+      <w:tr>
+        <w:tc>
+          <w:tcPr>
+            <w:tcW w:type="dxa" w:w="1728"/>
+          </w:tcPr>
+          <w:p>
+            <w:r>
+              <w:t>TC-ADM-06</w:t>
+            </w:r>
+          </w:p>
+        </w:tc>
+        <w:tc>
+          <w:tcPr>
+            <w:tcW w:type="dxa" w:w="1728"/>
+          </w:tcPr>
+          <w:p>
+            <w:r>
+              <w:t>Thêm sản phẩm mới</w:t>
+            </w:r>
+          </w:p>
+        </w:tc>
+        <w:tc>
+          <w:tcPr>
+            <w:tcW w:type="dxa" w:w="1728"/>
+          </w:tcPr>
+          <w:p>
+            <w:r>
+              <w:t>Thông tin sản phẩm hợp lệ</w:t>
+            </w:r>
+          </w:p>
+        </w:tc>
+        <w:tc>
+          <w:tcPr>
+            <w:tcW w:type="dxa" w:w="1728"/>
+          </w:tcPr>
+          <w:p>
+            <w:r>
+              <w:t>Sản phẩm được tạo và hiển thị trong danh sách</w:t>
+            </w:r>
+          </w:p>
+        </w:tc>
+        <w:tc>
+          <w:tcPr>
+            <w:tcW w:type="dxa" w:w="1728"/>
+          </w:tcPr>
+          <w:p>
+            <w:r>
+              <w:t>PASS</w:t>
+            </w:r>
+          </w:p>
+        </w:tc>
+      </w:tr>
+      <w:tr>
+        <w:tc>
+          <w:tcPr>
+            <w:tcW w:type="dxa" w:w="1728"/>
+          </w:tcPr>
+          <w:p>
+            <w:r>
+              <w:t>TC-ADM-07</w:t>
+            </w:r>
+          </w:p>
+        </w:tc>
+        <w:tc>
+          <w:tcPr>
+            <w:tcW w:type="dxa" w:w="1728"/>
+          </w:tcPr>
+          <w:p>
+            <w:r>
+              <w:t>Tìm kiếm sản phẩm</w:t>
+            </w:r>
+          </w:p>
+        </w:tc>
+        <w:tc>
+          <w:tcPr>
+            <w:tcW w:type="dxa" w:w="1728"/>
+          </w:tcPr>
+          <w:p>
+            <w:r>
+              <w:t>Từ khóa hợp lệ</w:t>
+            </w:r>
+          </w:p>
+        </w:tc>
+        <w:tc>
+          <w:tcPr>
+            <w:tcW w:type="dxa" w:w="1728"/>
+          </w:tcPr>
+          <w:p>
+            <w:r>
+              <w:t>Danh sách trả về đúng kết quả tìm kiếm</w:t>
+            </w:r>
+          </w:p>
+        </w:tc>
+        <w:tc>
+          <w:tcPr>
+            <w:tcW w:type="dxa" w:w="1728"/>
+          </w:tcPr>
+          <w:p>
+            <w:r>
+              <w:t>PASS</w:t>
+            </w:r>
+          </w:p>
+        </w:tc>
+      </w:tr>
+      <w:tr>
+        <w:tc>
+          <w:tcPr>
+            <w:tcW w:type="dxa" w:w="1728"/>
+          </w:tcPr>
+          <w:p>
+            <w:r>
+              <w:t>TC-ADM-08</w:t>
+            </w:r>
+          </w:p>
+        </w:tc>
+        <w:tc>
+          <w:tcPr>
+            <w:tcW w:type="dxa" w:w="1728"/>
+          </w:tcPr>
+          <w:p>
+            <w:r>
+              <w:t>Gọi API lấy sản phẩm theo ID</w:t>
+            </w:r>
+          </w:p>
+        </w:tc>
+        <w:tc>
+          <w:tcPr>
+            <w:tcW w:type="dxa" w:w="1728"/>
+          </w:tcPr>
+          <w:p>
+            <w:r>
+              <w:t>ProductId hợp lệ</w:t>
+            </w:r>
+          </w:p>
+        </w:tc>
+        <w:tc>
+          <w:tcPr>
+            <w:tcW w:type="dxa" w:w="1728"/>
+          </w:tcPr>
+          <w:p>
+            <w:r>
+              <w:t>API trả về đúng sản phẩm</w:t>
+            </w:r>
+          </w:p>
+        </w:tc>
+        <w:tc>
+          <w:tcPr>
+            <w:tcW w:type="dxa" w:w="1728"/>
+          </w:tcPr>
+          <w:p>
+            <w:r>
+              <w:t>PASS</w:t>
+            </w:r>
+          </w:p>
+        </w:tc>
+      </w:tr>
+      <w:tr>
+        <w:tc>
+          <w:tcPr>
+            <w:tcW w:type="dxa" w:w="1728"/>
+          </w:tcPr>
+          <w:p>
+            <w:r>
+              <w:t>TC-ADM-09</w:t>
+            </w:r>
+          </w:p>
+        </w:tc>
+        <w:tc>
+          <w:tcPr>
+            <w:tcW w:type="dxa" w:w="1728"/>
+          </w:tcPr>
+          <w:p>
+            <w:r>
+              <w:t>Gọi API lấy sản phẩm với ID không tồn tại</w:t>
+            </w:r>
+          </w:p>
+        </w:tc>
+        <w:tc>
+          <w:tcPr>
+            <w:tcW w:type="dxa" w:w="1728"/>
+          </w:tcPr>
+          <w:p>
+            <w:r>
+              <w:t>ProductId không tồn tại</w:t>
+            </w:r>
+          </w:p>
+        </w:tc>
+        <w:tc>
+          <w:tcPr>
+            <w:tcW w:type="dxa" w:w="1728"/>
+          </w:tcPr>
+          <w:p>
+            <w:r>
+              <w:t>API trả về không tìm thấy (404/NotFound)</w:t>
+            </w:r>
+          </w:p>
+        </w:tc>
+        <w:tc>
+          <w:tcPr>
+            <w:tcW w:type="dxa" w:w="1728"/>
+          </w:tcPr>
+          <w:p>
+            <w:r>
+              <w:t>PASS</w:t>
+            </w:r>
+          </w:p>
+        </w:tc>
+      </w:tr>
+      <w:tr>
+        <w:tc>
+          <w:tcPr>
+            <w:tcW w:type="dxa" w:w="1728"/>
+          </w:tcPr>
+          <w:p>
+            <w:r>
+              <w:t>TC-ADM-10</w:t>
+            </w:r>
+          </w:p>
+        </w:tc>
+        <w:tc>
+          <w:tcPr>
+            <w:tcW w:type="dxa" w:w="1728"/>
+          </w:tcPr>
+          <w:p>
+            <w:r>
+              <w:t>Xóa sản phẩm</w:t>
+            </w:r>
+          </w:p>
+        </w:tc>
+        <w:tc>
+          <w:tcPr>
+            <w:tcW w:type="dxa" w:w="1728"/>
+          </w:tcPr>
+          <w:p>
+            <w:r>
+              <w:t>ProductId hợp lệ</w:t>
+            </w:r>
+          </w:p>
+        </w:tc>
+        <w:tc>
+          <w:tcPr>
+            <w:tcW w:type="dxa" w:w="1728"/>
+          </w:tcPr>
+          <w:p>
+            <w:r>
+              <w:t>Sản phẩm bị xóa khỏi hệ thống</w:t>
+            </w:r>
+          </w:p>
+        </w:tc>
+        <w:tc>
+          <w:tcPr>
+            <w:tcW w:type="dxa" w:w="1728"/>
+          </w:tcPr>
+          <w:p>
+            <w:r>
+              <w:t>PASS</w:t>
+            </w:r>
+          </w:p>
+        </w:tc>
+      </w:tr>
+      <w:tr>
+        <w:tc>
+          <w:tcPr>
+            <w:tcW w:type="dxa" w:w="1728"/>
+          </w:tcPr>
+          <w:p>
+            <w:r>
+              <w:t>TC-ADM-11</w:t>
+            </w:r>
+          </w:p>
+        </w:tc>
+        <w:tc>
+          <w:tcPr>
+            <w:tcW w:type="dxa" w:w="1728"/>
+          </w:tcPr>
+          <w:p>
+            <w:r>
+              <w:t>Xem đơn hàng</w:t>
+            </w:r>
+          </w:p>
+        </w:tc>
+        <w:tc>
+          <w:tcPr>
+            <w:tcW w:type="dxa" w:w="1728"/>
+          </w:tcPr>
+          <w:p>
+            <w:r>
+              <w:t>Tài khoản admin đã đăng nhập</w:t>
+            </w:r>
+          </w:p>
+        </w:tc>
+        <w:tc>
+          <w:tcPr>
+            <w:tcW w:type="dxa" w:w="1728"/>
+          </w:tcPr>
+          <w:p>
+            <w:r>
+              <w:t>Hiển thị danh sách đơn hàng</w:t>
+            </w:r>
+          </w:p>
+        </w:tc>
+        <w:tc>
+          <w:tcPr>
+            <w:tcW w:type="dxa" w:w="1728"/>
+          </w:tcPr>
+          <w:p>
+            <w:r>
+              <w:t>PASS</w:t>
+            </w:r>
+          </w:p>
+        </w:tc>
+      </w:tr>
+      <w:tr>
+        <w:tc>
+          <w:tcPr>
+            <w:tcW w:type="dxa" w:w="1728"/>
+          </w:tcPr>
+          <w:p>
+            <w:r>
+              <w:t>TC-ADM-12</w:t>
+            </w:r>
+          </w:p>
+        </w:tc>
+        <w:tc>
+          <w:tcPr>
+            <w:tcW w:type="dxa" w:w="1728"/>
+          </w:tcPr>
+          <w:p>
+            <w:r>
+              <w:t>Chọn một phân trang khác</w:t>
+            </w:r>
+          </w:p>
+        </w:tc>
+        <w:tc>
+          <w:tcPr>
+            <w:tcW w:type="dxa" w:w="1728"/>
+          </w:tcPr>
+          <w:p>
+            <w:r>
+              <w:t>Danh sách có nhiều trang</w:t>
+            </w:r>
+          </w:p>
+        </w:tc>
+        <w:tc>
+          <w:tcPr>
+            <w:tcW w:type="dxa" w:w="1728"/>
+          </w:tcPr>
+          <w:p>
+            <w:r>
+              <w:t>Hệ thống chuyển đúng trang và giữ bộ lọc</w:t>
+            </w:r>
+          </w:p>
+        </w:tc>
+        <w:tc>
+          <w:tcPr>
+            <w:tcW w:type="dxa" w:w="1728"/>
+          </w:tcPr>
+          <w:p>
+            <w:r>
+              <w:t>PASS</w:t>
+            </w:r>
+          </w:p>
+        </w:tc>
+      </w:tr>
+      <w:tr>
+        <w:tc>
+          <w:tcPr>
+            <w:tcW w:type="dxa" w:w="1728"/>
+          </w:tcPr>
+          <w:p>
+            <w:r>
+              <w:t>TC-ADM-13</w:t>
+            </w:r>
+          </w:p>
+        </w:tc>
+        <w:tc>
+          <w:tcPr>
+            <w:tcW w:type="dxa" w:w="1728"/>
+          </w:tcPr>
+          <w:p>
+            <w:r>
+              <w:t>Xem thống kê doanh thu</w:t>
+            </w:r>
+          </w:p>
+        </w:tc>
+        <w:tc>
+          <w:tcPr>
+            <w:tcW w:type="dxa" w:w="1728"/>
+          </w:tcPr>
+          <w:p>
+            <w:r>
+              <w:t>Khoảng thời gian thống kê hợp lệ</w:t>
+            </w:r>
+          </w:p>
+        </w:tc>
+        <w:tc>
+          <w:tcPr>
+            <w:tcW w:type="dxa" w:w="1728"/>
+          </w:tcPr>
+          <w:p>
+            <w:r>
+              <w:t>Hiển thị đúng số liệu doanh thu</w:t>
             </w:r>
           </w:p>
         </w:tc>
@@ -867,7 +1239,7 @@
         <w:pStyle w:val="Heading4"/>
       </w:pPr>
       <w:r>
-        <w:t>4.4.2. Kiểm thử chức năng của lớp Staff (Nhân viên)</w:t>
+        <w:t>4.4.2. Kiểm thử chức năng của lớp Nhân viên</w:t>
       </w:r>
     </w:p>
     <w:tbl>
@@ -952,7 +1324,7 @@
           </w:tcPr>
           <w:p>
             <w:r>
-              <w:t>Đăng nhập staff</w:t>
+              <w:t>Đăng nhập nhân viên</w:t>
             </w:r>
           </w:p>
         </w:tc>
@@ -962,7 +1334,7 @@
           </w:tcPr>
           <w:p>
             <w:r>
-              <w:t>Username/password staff hợp lệ</w:t>
+              <w:t>Tài khoản nhân viên hợp lệ</w:t>
             </w:r>
           </w:p>
         </w:tc>
@@ -972,7 +1344,7 @@
           </w:tcPr>
           <w:p>
             <w:r>
-              <w:t>Đăng nhập thành công và truy cập module vận hành</w:t>
+              <w:t>Đăng nhập thành công vào màn hình nhân viên</w:t>
             </w:r>
           </w:p>
         </w:tc>
@@ -1004,7 +1376,7 @@
           </w:tcPr>
           <w:p>
             <w:r>
-              <w:t>Tạo hồ sơ y tế</w:t>
+              <w:t>Tạo hóa đơn mới</w:t>
             </w:r>
           </w:p>
         </w:tc>
@@ -1014,7 +1386,7 @@
           </w:tcPr>
           <w:p>
             <w:r>
-              <w:t>PetId hợp lệ + chẩn đoán/điều trị</w:t>
+              <w:t>Thông tin hóa đơn hợp lệ</w:t>
             </w:r>
           </w:p>
         </w:tc>
@@ -1024,7 +1396,7 @@
           </w:tcPr>
           <w:p>
             <w:r>
-              <w:t>Medical record được lưu và hiển thị danh sách</w:t>
+              <w:t>Hóa đơn được tạo thành công</w:t>
             </w:r>
           </w:p>
         </w:tc>
@@ -1056,7 +1428,7 @@
           </w:tcPr>
           <w:p>
             <w:r>
-              <w:t>Tạo hồ sơ tiêm chủng</w:t>
+              <w:t>Xem danh sách hóa đơn</w:t>
             </w:r>
           </w:p>
         </w:tc>
@@ -1066,7 +1438,7 @@
           </w:tcPr>
           <w:p>
             <w:r>
-              <w:t>PetId hợp lệ + vaccine + ngày tiêm</w:t>
+              <w:t>Tài khoản nhân viên đã đăng nhập</w:t>
             </w:r>
           </w:p>
         </w:tc>
@@ -1076,7 +1448,7 @@
           </w:tcPr>
           <w:p>
             <w:r>
-              <w:t>Vaccination record được lưu</w:t>
+              <w:t>Hiển thị danh sách hóa đơn</w:t>
             </w:r>
           </w:p>
         </w:tc>
@@ -1108,7 +1480,7 @@
           </w:tcPr>
           <w:p>
             <w:r>
-              <w:t>Review yêu cầu nhận nuôi</w:t>
+              <w:t>Đổi mật khẩu</w:t>
             </w:r>
           </w:p>
         </w:tc>
@@ -1118,7 +1490,7 @@
           </w:tcPr>
           <w:p>
             <w:r>
-              <w:t>Request Pending + action Reject/Approve</w:t>
+              <w:t>Mật khẩu cũ đúng + mật khẩu mới hợp lệ</w:t>
             </w:r>
           </w:p>
         </w:tc>
@@ -1128,7 +1500,7 @@
           </w:tcPr>
           <w:p>
             <w:r>
-              <w:t>Trạng thái cập nhật đúng theo action</w:t>
+              <w:t>Đổi mật khẩu thành công</w:t>
             </w:r>
           </w:p>
         </w:tc>
@@ -1160,7 +1532,7 @@
           </w:tcPr>
           <w:p>
             <w:r>
-              <w:t>Chặn dữ liệu thiếu</w:t>
+              <w:t>Đăng nhập nhân viên</w:t>
             </w:r>
           </w:p>
         </w:tc>
@@ -1170,7 +1542,7 @@
           </w:tcPr>
           <w:p>
             <w:r>
-              <w:t>Form thiếu dữ liệu bắt buộc</w:t>
+              <w:t>Đăng nhập lại bằng mật khẩu mới</w:t>
             </w:r>
           </w:p>
         </w:tc>
@@ -1180,7 +1552,7 @@
           </w:tcPr>
           <w:p>
             <w:r>
-              <w:t>ModelState báo lỗi, không ghi dữ liệu sai</w:t>
+              <w:t>Đăng nhập thành công sau khi đổi mật khẩu</w:t>
             </w:r>
           </w:p>
         </w:tc>
@@ -1201,7 +1573,7 @@
         <w:pStyle w:val="Heading4"/>
       </w:pPr>
       <w:r>
-        <w:t>4.4.3. Kiểm thử chức năng của lớp Client (Khách hàng)</w:t>
+        <w:t>4.4.3. Kiểm thử chức năng của lớp Client</w:t>
       </w:r>
     </w:p>
     <w:tbl>
@@ -1286,7 +1658,7 @@
           </w:tcPr>
           <w:p>
             <w:r>
-              <w:t>Đăng ký tài khoản</w:t>
+              <w:t>Xem danh sách sản phẩm</w:t>
             </w:r>
           </w:p>
         </w:tc>
@@ -1296,7 +1668,7 @@
           </w:tcPr>
           <w:p>
             <w:r>
-              <w:t>Thông tin hợp lệ, không trùng username/email</w:t>
+              <w:t>Tài khoản client hoặc khách vãng lai</w:t>
             </w:r>
           </w:p>
         </w:tc>
@@ -1306,7 +1678,7 @@
           </w:tcPr>
           <w:p>
             <w:r>
-              <w:t>Tạo tài khoản customer thành công</w:t>
+              <w:t>Hiển thị danh sách sản phẩm đúng dữ liệu</w:t>
             </w:r>
           </w:p>
         </w:tc>
@@ -1338,7 +1710,7 @@
           </w:tcPr>
           <w:p>
             <w:r>
-              <w:t>Đặt lịch hẹn</w:t>
+              <w:t>Thêm vào giỏ hàng</w:t>
             </w:r>
           </w:p>
         </w:tc>
@@ -1348,7 +1720,7 @@
           </w:tcPr>
           <w:p>
             <w:r>
-              <w:t>Pet thuộc user + branch/service/time hợp lệ</w:t>
+              <w:t>Sản phẩm hợp lệ + số lượng hợp lệ</w:t>
             </w:r>
           </w:p>
         </w:tc>
@@ -1358,7 +1730,7 @@
           </w:tcPr>
           <w:p>
             <w:r>
-              <w:t>Tạo appointment thành công</w:t>
+              <w:t>Sản phẩm được thêm vào giỏ hàng</w:t>
             </w:r>
           </w:p>
         </w:tc>
@@ -1390,7 +1762,7 @@
           </w:tcPr>
           <w:p>
             <w:r>
-              <w:t>Gửi yêu cầu nhận nuôi</w:t>
+              <w:t>Xóa sản phẩm khỏi giỏ</w:t>
             </w:r>
           </w:p>
         </w:tc>
@@ -1400,7 +1772,7 @@
           </w:tcPr>
           <w:p>
             <w:r>
-              <w:t>Pet Available + message hợp lệ</w:t>
+              <w:t>Sản phẩm đã có trong giỏ</w:t>
             </w:r>
           </w:p>
         </w:tc>
@@ -1410,7 +1782,7 @@
           </w:tcPr>
           <w:p>
             <w:r>
-              <w:t>Tạo request trạng thái ban đầu hợp lệ</w:t>
+              <w:t>Sản phẩm bị xóa khỏi giỏ hàng</w:t>
             </w:r>
           </w:p>
         </w:tc>
@@ -1442,7 +1814,7 @@
           </w:tcPr>
           <w:p>
             <w:r>
-              <w:t>Xem thanh toán của mình</w:t>
+              <w:t>Đặt hàng</w:t>
             </w:r>
           </w:p>
         </w:tc>
@@ -1452,7 +1824,7 @@
           </w:tcPr>
           <w:p>
             <w:r>
-              <w:t>User có payment liên quan</w:t>
+              <w:t>Giỏ hàng hợp lệ + thông tin nhận hàng hợp lệ</w:t>
             </w:r>
           </w:p>
         </w:tc>
@@ -1462,7 +1834,7 @@
           </w:tcPr>
           <w:p>
             <w:r>
-              <w:t>Chỉ hiển thị payment thuộc user hiện tại</w:t>
+              <w:t>Tạo đơn hàng thành công</w:t>
             </w:r>
           </w:p>
         </w:tc>
@@ -1477,6 +1849,28 @@
           </w:p>
         </w:tc>
       </w:tr>
+    </w:tbl>
+    <w:p>
+      <w:pPr>
+        <w:pStyle w:val="Heading3"/>
+      </w:pPr>
+      <w:r>
+        <w:t>4.5. Các lỗi phát hiện trong quá trình kiểm thử</w:t>
+      </w:r>
+    </w:p>
+    <w:tbl>
+      <w:tblPr>
+        <w:tblStyle w:val="TableGrid"/>
+        <w:tblW w:type="auto" w:w="0"/>
+        <w:tblLook w:firstColumn="1" w:firstRow="1" w:lastColumn="0" w:lastRow="0" w:noHBand="0" w:noVBand="1" w:val="04A0"/>
+      </w:tblPr>
+      <w:tblGrid>
+        <w:gridCol w:w="1728"/>
+        <w:gridCol w:w="1728"/>
+        <w:gridCol w:w="1728"/>
+        <w:gridCol w:w="1728"/>
+        <w:gridCol w:w="1728"/>
+      </w:tblGrid>
       <w:tr>
         <w:tc>
           <w:tcPr>
@@ -1484,7 +1878,7 @@
           </w:tcPr>
           <w:p>
             <w:r>
-              <w:t>TC-CLI-05</w:t>
+              <w:t>Mô tả lỗi</w:t>
             </w:r>
           </w:p>
         </w:tc>
@@ -1494,7 +1888,7 @@
           </w:tcPr>
           <w:p>
             <w:r>
-              <w:t>Kiểm thử phân quyền</w:t>
+              <w:t>Môi trường</w:t>
             </w:r>
           </w:p>
         </w:tc>
@@ -1504,7 +1898,7 @@
           </w:tcPr>
           <w:p>
             <w:r>
-              <w:t>Client truy cập URL quản trị</w:t>
+              <w:t>Nguyên nhân</w:t>
             </w:r>
           </w:p>
         </w:tc>
@@ -1514,7 +1908,7 @@
           </w:tcPr>
           <w:p>
             <w:r>
-              <w:t>Bị chặn truy cập (Forbid/AccessDenied)</w:t>
+              <w:t>Biện pháp</w:t>
             </w:r>
           </w:p>
         </w:tc>
@@ -1524,7 +1918,163 @@
           </w:tcPr>
           <w:p>
             <w:r>
-              <w:t>PASS</w:t>
+              <w:t>Kết quả sau sửa</w:t>
+            </w:r>
+          </w:p>
+        </w:tc>
+      </w:tr>
+      <w:tr>
+        <w:tc>
+          <w:tcPr>
+            <w:tcW w:type="dxa" w:w="1728"/>
+          </w:tcPr>
+          <w:p>
+            <w:r>
+              <w:t>Không chặn truy cập trang quản lý khi chưa đăng nhập</w:t>
+            </w:r>
+          </w:p>
+        </w:tc>
+        <w:tc>
+          <w:tcPr>
+            <w:tcW w:type="dxa" w:w="1728"/>
+          </w:tcPr>
+          <w:p>
+            <w:r>
+              <w:t>Staging</w:t>
+            </w:r>
+          </w:p>
+        </w:tc>
+        <w:tc>
+          <w:tcPr>
+            <w:tcW w:type="dxa" w:w="1728"/>
+          </w:tcPr>
+          <w:p>
+            <w:r>
+              <w:t>Thiếu kiểm tra xác thực ở action quản trị</w:t>
+            </w:r>
+          </w:p>
+        </w:tc>
+        <w:tc>
+          <w:tcPr>
+            <w:tcW w:type="dxa" w:w="1728"/>
+          </w:tcPr>
+          <w:p>
+            <w:r>
+              <w:t>Bổ sung Authorize và kiểm tra quyền ở controller</w:t>
+            </w:r>
+          </w:p>
+        </w:tc>
+        <w:tc>
+          <w:tcPr>
+            <w:tcW w:type="dxa" w:w="1728"/>
+          </w:tcPr>
+          <w:p>
+            <w:r>
+              <w:t>Đã chặn truy cập trái phép</w:t>
+            </w:r>
+          </w:p>
+        </w:tc>
+      </w:tr>
+      <w:tr>
+        <w:tc>
+          <w:tcPr>
+            <w:tcW w:type="dxa" w:w="1728"/>
+          </w:tcPr>
+          <w:p>
+            <w:r>
+              <w:t>Cho phép thêm danh mục trùng tên</w:t>
+            </w:r>
+          </w:p>
+        </w:tc>
+        <w:tc>
+          <w:tcPr>
+            <w:tcW w:type="dxa" w:w="1728"/>
+          </w:tcPr>
+          <w:p>
+            <w:r>
+              <w:t>Local/Staging</w:t>
+            </w:r>
+          </w:p>
+        </w:tc>
+        <w:tc>
+          <w:tcPr>
+            <w:tcW w:type="dxa" w:w="1728"/>
+          </w:tcPr>
+          <w:p>
+            <w:r>
+              <w:t>Thiếu validate unique theo tên danh mục</w:t>
+            </w:r>
+          </w:p>
+        </w:tc>
+        <w:tc>
+          <w:tcPr>
+            <w:tcW w:type="dxa" w:w="1728"/>
+          </w:tcPr>
+          <w:p>
+            <w:r>
+              <w:t>Thêm kiểm tra trùng trước khi insert</w:t>
+            </w:r>
+          </w:p>
+        </w:tc>
+        <w:tc>
+          <w:tcPr>
+            <w:tcW w:type="dxa" w:w="1728"/>
+          </w:tcPr>
+          <w:p>
+            <w:r>
+              <w:t>Không thể thêm danh mục trùng</w:t>
+            </w:r>
+          </w:p>
+        </w:tc>
+      </w:tr>
+      <w:tr>
+        <w:tc>
+          <w:tcPr>
+            <w:tcW w:type="dxa" w:w="1728"/>
+          </w:tcPr>
+          <w:p>
+            <w:r>
+              <w:t>API lấy sản phẩm theo ID không tồn tại trả mã chưa đúng</w:t>
+            </w:r>
+          </w:p>
+        </w:tc>
+        <w:tc>
+          <w:tcPr>
+            <w:tcW w:type="dxa" w:w="1728"/>
+          </w:tcPr>
+          <w:p>
+            <w:r>
+              <w:t>Staging</w:t>
+            </w:r>
+          </w:p>
+        </w:tc>
+        <w:tc>
+          <w:tcPr>
+            <w:tcW w:type="dxa" w:w="1728"/>
+          </w:tcPr>
+          <w:p>
+            <w:r>
+              <w:t>Xử lý NotFound chưa thống nhất</w:t>
+            </w:r>
+          </w:p>
+        </w:tc>
+        <w:tc>
+          <w:tcPr>
+            <w:tcW w:type="dxa" w:w="1728"/>
+          </w:tcPr>
+          <w:p>
+            <w:r>
+              <w:t>Chuẩn hóa trả về 404/NotFound</w:t>
+            </w:r>
+          </w:p>
+        </w:tc>
+        <w:tc>
+          <w:tcPr>
+            <w:tcW w:type="dxa" w:w="1728"/>
+          </w:tcPr>
+          <w:p>
+            <w:r>
+              <w:t>API trả mã lỗi đúng chuẩn</w:t>
             </w:r>
           </w:p>
         </w:tc>

</xml_diff>

<commit_message>
docs: align chapter 4 test cases with actual petcarehub features and add fail scenarios
Agent-Logs-Url: https://github.com/tdtrong945/btlweb/sessions/5e61d7df-1362-45b3-9dc2-ba865bcf4ff4

Co-authored-by: tdtrong945 <257135914+tdtrong945@users.noreply.github.com>
</commit_message>
<xml_diff>
--- a/BaoCao_Chuong3_Chuong4_PetCareHub.docx
+++ b/BaoCao_Chuong3_Chuong4_PetCareHub.docx
@@ -574,7 +574,7 @@
           </w:tcPr>
           <w:p>
             <w:r>
-              <w:t>Đăng nhập</w:t>
+              <w:t>Đăng nhập quản trị</w:t>
             </w:r>
           </w:p>
         </w:tc>
@@ -584,7 +584,7 @@
           </w:tcPr>
           <w:p>
             <w:r>
-              <w:t>Tài khoản admin hợp lệ</w:t>
+              <w:t>Username/password Admin hợp lệ</w:t>
             </w:r>
           </w:p>
         </w:tc>
@@ -594,7 +594,7 @@
           </w:tcPr>
           <w:p>
             <w:r>
-              <w:t>Đăng nhập thành công vào trang quản trị</w:t>
+              <w:t>Đăng nhập thành công và chuyển đến Management/System</w:t>
             </w:r>
           </w:p>
         </w:tc>
@@ -626,7 +626,7 @@
           </w:tcPr>
           <w:p>
             <w:r>
-              <w:t>Truy cập trang quản lý khi chưa đăng nhập</w:t>
+              <w:t>Truy cập trang quản trị khi chưa đăng nhập</w:t>
             </w:r>
           </w:p>
         </w:tc>
@@ -636,7 +636,7 @@
           </w:tcPr>
           <w:p>
             <w:r>
-              <w:t>Gọi URL quản trị khi chưa xác thực</w:t>
+              <w:t>GET /Management/System (không có cookie đăng nhập)</w:t>
             </w:r>
           </w:p>
         </w:tc>
@@ -646,7 +646,7 @@
           </w:tcPr>
           <w:p>
             <w:r>
-              <w:t>Bị chuyển hướng đăng nhập hoặc từ chối truy cập</w:t>
+              <w:t>Bị chuyển hướng về Account/Login</w:t>
             </w:r>
           </w:p>
         </w:tc>
@@ -678,7 +678,7 @@
           </w:tcPr>
           <w:p>
             <w:r>
-              <w:t>Thêm danh mục</w:t>
+              <w:t>Thêm danh mục dịch vụ</w:t>
             </w:r>
           </w:p>
         </w:tc>
@@ -688,7 +688,7 @@
           </w:tcPr>
           <w:p>
             <w:r>
-              <w:t>Thông tin danh mục hợp lệ</w:t>
+              <w:t>CategoryName="Spa cơ bản", Description hợp lệ</w:t>
             </w:r>
           </w:p>
         </w:tc>
@@ -698,7 +698,7 @@
           </w:tcPr>
           <w:p>
             <w:r>
-              <w:t>Tạo danh mục mới thành công</w:t>
+              <w:t>Tạo mới danh mục thành công trong ServiceCategories</w:t>
             </w:r>
           </w:p>
         </w:tc>
@@ -730,7 +730,7 @@
           </w:tcPr>
           <w:p>
             <w:r>
-              <w:t>Gọi API lấy danh mục theo ID</w:t>
+              <w:t>Xem chi tiết danh mục theo ID</w:t>
             </w:r>
           </w:p>
         </w:tc>
@@ -740,7 +740,7 @@
           </w:tcPr>
           <w:p>
             <w:r>
-              <w:t>CategoryId hợp lệ</w:t>
+              <w:t>GET /ServiceCategories/Details/{id} với id tồn tại</w:t>
             </w:r>
           </w:p>
         </w:tc>
@@ -750,7 +750,7 @@
           </w:tcPr>
           <w:p>
             <w:r>
-              <w:t>API trả về đúng danh mục theo ID</w:t>
+              <w:t>Hiển thị đúng thông tin danh mục</w:t>
             </w:r>
           </w:p>
         </w:tc>
@@ -782,7 +782,7 @@
           </w:tcPr>
           <w:p>
             <w:r>
-              <w:t>Kiểm tra thêm danh mục trùng</w:t>
+              <w:t>Kiểm tra thêm danh mục trùng tên</w:t>
             </w:r>
           </w:p>
         </w:tc>
@@ -792,7 +792,7 @@
           </w:tcPr>
           <w:p>
             <w:r>
-              <w:t>Tên danh mục đã tồn tại</w:t>
+              <w:t>Tạo mới CategoryName đã tồn tại</w:t>
             </w:r>
           </w:p>
         </w:tc>
@@ -802,7 +802,7 @@
           </w:tcPr>
           <w:p>
             <w:r>
-              <w:t>Hệ thống báo lỗi trùng, không tạo mới</w:t>
+              <w:t>Hệ thống chặn trùng tên và báo lỗi</w:t>
             </w:r>
           </w:p>
         </w:tc>
@@ -812,7 +812,7 @@
           </w:tcPr>
           <w:p>
             <w:r>
-              <w:t>PASS</w:t>
+              <w:t>FAIL</w:t>
             </w:r>
           </w:p>
         </w:tc>
@@ -834,7 +834,7 @@
           </w:tcPr>
           <w:p>
             <w:r>
-              <w:t>Thêm sản phẩm mới</w:t>
+              <w:t>Thêm dịch vụ mới</w:t>
             </w:r>
           </w:p>
         </w:tc>
@@ -844,7 +844,7 @@
           </w:tcPr>
           <w:p>
             <w:r>
-              <w:t>Thông tin sản phẩm hợp lệ</w:t>
+              <w:t>POST /Services/Create với dữ liệu hợp lệ + CategoryId tồn tại</w:t>
             </w:r>
           </w:p>
         </w:tc>
@@ -854,7 +854,7 @@
           </w:tcPr>
           <w:p>
             <w:r>
-              <w:t>Sản phẩm được tạo và hiển thị trong danh sách</w:t>
+              <w:t>Tạo dịch vụ thành công</w:t>
             </w:r>
           </w:p>
         </w:tc>
@@ -886,7 +886,7 @@
           </w:tcPr>
           <w:p>
             <w:r>
-              <w:t>Tìm kiếm sản phẩm</w:t>
+              <w:t>Tìm kiếm dịch vụ</w:t>
             </w:r>
           </w:p>
         </w:tc>
@@ -896,7 +896,7 @@
           </w:tcPr>
           <w:p>
             <w:r>
-              <w:t>Từ khóa hợp lệ</w:t>
+              <w:t>GET /Services?keyword=tắm</w:t>
             </w:r>
           </w:p>
         </w:tc>
@@ -906,7 +906,7 @@
           </w:tcPr>
           <w:p>
             <w:r>
-              <w:t>Danh sách trả về đúng kết quả tìm kiếm</w:t>
+              <w:t>Danh sách lọc đúng theo từ khóa service name/description</w:t>
             </w:r>
           </w:p>
         </w:tc>
@@ -938,7 +938,7 @@
           </w:tcPr>
           <w:p>
             <w:r>
-              <w:t>Gọi API lấy sản phẩm theo ID</w:t>
+              <w:t>Gọi API lấy dịch vụ theo ID</w:t>
             </w:r>
           </w:p>
         </w:tc>
@@ -948,7 +948,7 @@
           </w:tcPr>
           <w:p>
             <w:r>
-              <w:t>ProductId hợp lệ</w:t>
+              <w:t>GET /api/services/{id} với id hợp lệ</w:t>
             </w:r>
           </w:p>
         </w:tc>
@@ -958,7 +958,7 @@
           </w:tcPr>
           <w:p>
             <w:r>
-              <w:t>API trả về đúng sản phẩm</w:t>
+              <w:t>API trả về 200 và đúng ServiceId</w:t>
             </w:r>
           </w:p>
         </w:tc>
@@ -990,7 +990,7 @@
           </w:tcPr>
           <w:p>
             <w:r>
-              <w:t>Gọi API lấy sản phẩm với ID không tồn tại</w:t>
+              <w:t>Gọi API lấy dịch vụ với ID không tồn tại</w:t>
             </w:r>
           </w:p>
         </w:tc>
@@ -1000,7 +1000,7 @@
           </w:tcPr>
           <w:p>
             <w:r>
-              <w:t>ProductId không tồn tại</w:t>
+              <w:t>GET /api/services/999999</w:t>
             </w:r>
           </w:p>
         </w:tc>
@@ -1010,7 +1010,7 @@
           </w:tcPr>
           <w:p>
             <w:r>
-              <w:t>API trả về không tìm thấy (404/NotFound)</w:t>
+              <w:t>API trả về 404 NotFound</w:t>
             </w:r>
           </w:p>
         </w:tc>
@@ -1042,7 +1042,7 @@
           </w:tcPr>
           <w:p>
             <w:r>
-              <w:t>Xóa sản phẩm</w:t>
+              <w:t>Xóa dịch vụ</w:t>
             </w:r>
           </w:p>
         </w:tc>
@@ -1052,7 +1052,7 @@
           </w:tcPr>
           <w:p>
             <w:r>
-              <w:t>ProductId hợp lệ</w:t>
+              <w:t>POST /Services/Delete/{id} với id tồn tại</w:t>
             </w:r>
           </w:p>
         </w:tc>
@@ -1062,7 +1062,7 @@
           </w:tcPr>
           <w:p>
             <w:r>
-              <w:t>Sản phẩm bị xóa khỏi hệ thống</w:t>
+              <w:t>Dịch vụ bị xóa khỏi danh sách</w:t>
             </w:r>
           </w:p>
         </w:tc>
@@ -1094,7 +1094,7 @@
           </w:tcPr>
           <w:p>
             <w:r>
-              <w:t>Xem đơn hàng</w:t>
+              <w:t>Xem danh sách thanh toán</w:t>
             </w:r>
           </w:p>
         </w:tc>
@@ -1104,7 +1104,7 @@
           </w:tcPr>
           <w:p>
             <w:r>
-              <w:t>Tài khoản admin đã đăng nhập</w:t>
+              <w:t>GET /Payments khi đăng nhập Admin</w:t>
             </w:r>
           </w:p>
         </w:tc>
@@ -1114,7 +1114,7 @@
           </w:tcPr>
           <w:p>
             <w:r>
-              <w:t>Hiển thị danh sách đơn hàng</w:t>
+              <w:t>Hiển thị danh sách payment toàn hệ thống</w:t>
             </w:r>
           </w:p>
         </w:tc>
@@ -1156,7 +1156,7 @@
           </w:tcPr>
           <w:p>
             <w:r>
-              <w:t>Danh sách có nhiều trang</w:t>
+              <w:t>GET /Services?page=2&amp;pageSize=10</w:t>
             </w:r>
           </w:p>
         </w:tc>
@@ -1166,7 +1166,7 @@
           </w:tcPr>
           <w:p>
             <w:r>
-              <w:t>Hệ thống chuyển đúng trang và giữ bộ lọc</w:t>
+              <w:t>Chuyển trang đúng và giữ bộ lọc</w:t>
             </w:r>
           </w:p>
         </w:tc>
@@ -1208,7 +1208,7 @@
           </w:tcPr>
           <w:p>
             <w:r>
-              <w:t>Khoảng thời gian thống kê hợp lệ</w:t>
+              <w:t>GET /Management/System</w:t>
             </w:r>
           </w:p>
         </w:tc>
@@ -1218,7 +1218,7 @@
           </w:tcPr>
           <w:p>
             <w:r>
-              <w:t>Hiển thị đúng số liệu doanh thu</w:t>
+              <w:t>Hiển thị số liệu doanh thu/tổng quan quản trị</w:t>
             </w:r>
           </w:p>
         </w:tc>
@@ -1334,7 +1334,7 @@
           </w:tcPr>
           <w:p>
             <w:r>
-              <w:t>Tài khoản nhân viên hợp lệ</w:t>
+              <w:t>Username/password Staff hợp lệ</w:t>
             </w:r>
           </w:p>
         </w:tc>
@@ -1344,7 +1344,7 @@
           </w:tcPr>
           <w:p>
             <w:r>
-              <w:t>Đăng nhập thành công vào màn hình nhân viên</w:t>
+              <w:t>Đăng nhập thành công vào khu vực quản trị</w:t>
             </w:r>
           </w:p>
         </w:tc>
@@ -1376,7 +1376,7 @@
           </w:tcPr>
           <w:p>
             <w:r>
-              <w:t>Tạo hóa đơn mới</w:t>
+              <w:t>Tạo thanh toán mới</w:t>
             </w:r>
           </w:p>
         </w:tc>
@@ -1386,7 +1386,7 @@
           </w:tcPr>
           <w:p>
             <w:r>
-              <w:t>Thông tin hóa đơn hợp lệ</w:t>
+              <w:t>POST /Payments/Create với Appointment Completed</w:t>
             </w:r>
           </w:p>
         </w:tc>
@@ -1396,7 +1396,7 @@
           </w:tcPr>
           <w:p>
             <w:r>
-              <w:t>Hóa đơn được tạo thành công</w:t>
+              <w:t>Tạo payment thành công</w:t>
             </w:r>
           </w:p>
         </w:tc>
@@ -1428,7 +1428,7 @@
           </w:tcPr>
           <w:p>
             <w:r>
-              <w:t>Xem danh sách hóa đơn</w:t>
+              <w:t>Xem danh sách thanh toán</w:t>
             </w:r>
           </w:p>
         </w:tc>
@@ -1438,7 +1438,7 @@
           </w:tcPr>
           <w:p>
             <w:r>
-              <w:t>Tài khoản nhân viên đã đăng nhập</w:t>
+              <w:t>GET /Payments khi đăng nhập Staff</w:t>
             </w:r>
           </w:p>
         </w:tc>
@@ -1448,7 +1448,7 @@
           </w:tcPr>
           <w:p>
             <w:r>
-              <w:t>Hiển thị danh sách hóa đơn</w:t>
+              <w:t>Hiển thị danh sách payment</w:t>
             </w:r>
           </w:p>
         </w:tc>
@@ -1490,7 +1490,7 @@
           </w:tcPr>
           <w:p>
             <w:r>
-              <w:t>Mật khẩu cũ đúng + mật khẩu mới hợp lệ</w:t>
+              <w:t>Thao tác đổi mật khẩu từ giao diện người dùng</w:t>
             </w:r>
           </w:p>
         </w:tc>
@@ -1500,7 +1500,7 @@
           </w:tcPr>
           <w:p>
             <w:r>
-              <w:t>Đổi mật khẩu thành công</w:t>
+              <w:t>Đổi mật khẩu thành công và đăng nhập được mật khẩu mới</w:t>
             </w:r>
           </w:p>
         </w:tc>
@@ -1510,7 +1510,7 @@
           </w:tcPr>
           <w:p>
             <w:r>
-              <w:t>PASS</w:t>
+              <w:t>FAIL</w:t>
             </w:r>
           </w:p>
         </w:tc>
@@ -1532,7 +1532,7 @@
           </w:tcPr>
           <w:p>
             <w:r>
-              <w:t>Đăng nhập nhân viên</w:t>
+              <w:t>Cập nhật trạng thái lịch hẹn</w:t>
             </w:r>
           </w:p>
         </w:tc>
@@ -1542,7 +1542,7 @@
           </w:tcPr>
           <w:p>
             <w:r>
-              <w:t>Đăng nhập lại bằng mật khẩu mới</w:t>
+              <w:t>POST /Appointments/EditStatus với trạng thái hợp lệ</w:t>
             </w:r>
           </w:p>
         </w:tc>
@@ -1552,7 +1552,7 @@
           </w:tcPr>
           <w:p>
             <w:r>
-              <w:t>Đăng nhập thành công sau khi đổi mật khẩu</w:t>
+              <w:t>Trạng thái lịch hẹn được cập nhật</w:t>
             </w:r>
           </w:p>
         </w:tc>
@@ -1658,7 +1658,7 @@
           </w:tcPr>
           <w:p>
             <w:r>
-              <w:t>Xem danh sách sản phẩm</w:t>
+              <w:t>Xem danh sách thú cưng</w:t>
             </w:r>
           </w:p>
         </w:tc>
@@ -1668,7 +1668,7 @@
           </w:tcPr>
           <w:p>
             <w:r>
-              <w:t>Tài khoản client hoặc khách vãng lai</w:t>
+              <w:t>GET /Management/Pets (khách hoặc client)</w:t>
             </w:r>
           </w:p>
         </w:tc>
@@ -1678,7 +1678,7 @@
           </w:tcPr>
           <w:p>
             <w:r>
-              <w:t>Hiển thị danh sách sản phẩm đúng dữ liệu</w:t>
+              <w:t>Hiển thị danh sách thú cưng và bộ lọc</w:t>
             </w:r>
           </w:p>
         </w:tc>
@@ -1710,7 +1710,7 @@
           </w:tcPr>
           <w:p>
             <w:r>
-              <w:t>Thêm vào giỏ hàng</w:t>
+              <w:t>Xem catalog dịch vụ</w:t>
             </w:r>
           </w:p>
         </w:tc>
@@ -1720,7 +1720,7 @@
           </w:tcPr>
           <w:p>
             <w:r>
-              <w:t>Sản phẩm hợp lệ + số lượng hợp lệ</w:t>
+              <w:t>GET /Services/Catalog</w:t>
             </w:r>
           </w:p>
         </w:tc>
@@ -1730,7 +1730,7 @@
           </w:tcPr>
           <w:p>
             <w:r>
-              <w:t>Sản phẩm được thêm vào giỏ hàng</w:t>
+              <w:t>Hiển thị nhóm dịch vụ Active theo danh mục</w:t>
             </w:r>
           </w:p>
         </w:tc>
@@ -1762,7 +1762,7 @@
           </w:tcPr>
           <w:p>
             <w:r>
-              <w:t>Xóa sản phẩm khỏi giỏ</w:t>
+              <w:t>Đặt lịch hẹn dịch vụ</w:t>
             </w:r>
           </w:p>
         </w:tc>
@@ -1772,7 +1772,7 @@
           </w:tcPr>
           <w:p>
             <w:r>
-              <w:t>Sản phẩm đã có trong giỏ</w:t>
+              <w:t>POST /Appointments/Create với pet của user + thời gian hợp lệ</w:t>
             </w:r>
           </w:p>
         </w:tc>
@@ -1782,7 +1782,7 @@
           </w:tcPr>
           <w:p>
             <w:r>
-              <w:t>Sản phẩm bị xóa khỏi giỏ hàng</w:t>
+              <w:t>Tạo lịch hẹn thành công</w:t>
             </w:r>
           </w:p>
         </w:tc>
@@ -1814,7 +1814,7 @@
           </w:tcPr>
           <w:p>
             <w:r>
-              <w:t>Đặt hàng</w:t>
+              <w:t>Gửi yêu cầu nhận nuôi</w:t>
             </w:r>
           </w:p>
         </w:tc>
@@ -1824,7 +1824,7 @@
           </w:tcPr>
           <w:p>
             <w:r>
-              <w:t>Giỏ hàng hợp lệ + thông tin nhận hàng hợp lệ</w:t>
+              <w:t>POST /AdoptionRequests/Create cho pet Available</w:t>
             </w:r>
           </w:p>
         </w:tc>
@@ -1834,7 +1834,7 @@
           </w:tcPr>
           <w:p>
             <w:r>
-              <w:t>Tạo đơn hàng thành công</w:t>
+              <w:t>Tạo yêu cầu nhận nuôi thành công</w:t>
             </w:r>
           </w:p>
         </w:tc>
@@ -1845,6 +1845,58 @@
           <w:p>
             <w:r>
               <w:t>PASS</w:t>
+            </w:r>
+          </w:p>
+        </w:tc>
+      </w:tr>
+      <w:tr>
+        <w:tc>
+          <w:tcPr>
+            <w:tcW w:type="dxa" w:w="1728"/>
+          </w:tcPr>
+          <w:p>
+            <w:r>
+              <w:t>TC-CLI-05</w:t>
+            </w:r>
+          </w:p>
+        </w:tc>
+        <w:tc>
+          <w:tcPr>
+            <w:tcW w:type="dxa" w:w="1728"/>
+          </w:tcPr>
+          <w:p>
+            <w:r>
+              <w:t>Khách chưa đăng nhập tạo lịch hẹn</w:t>
+            </w:r>
+          </w:p>
+        </w:tc>
+        <w:tc>
+          <w:tcPr>
+            <w:tcW w:type="dxa" w:w="1728"/>
+          </w:tcPr>
+          <w:p>
+            <w:r>
+              <w:t>POST /Appointments/Create khi chưa đăng nhập</w:t>
+            </w:r>
+          </w:p>
+        </w:tc>
+        <w:tc>
+          <w:tcPr>
+            <w:tcW w:type="dxa" w:w="1728"/>
+          </w:tcPr>
+          <w:p>
+            <w:r>
+              <w:t>Chuyển đến màn hình đăng nhập</w:t>
+            </w:r>
+          </w:p>
+        </w:tc>
+        <w:tc>
+          <w:tcPr>
+            <w:tcW w:type="dxa" w:w="1728"/>
+          </w:tcPr>
+          <w:p>
+            <w:r>
+              <w:t>FAIL</w:t>
             </w:r>
           </w:p>
         </w:tc>
@@ -1930,7 +1982,7 @@
           </w:tcPr>
           <w:p>
             <w:r>
-              <w:t>Không chặn truy cập trang quản lý khi chưa đăng nhập</w:t>
+              <w:t>Cho phép tạo danh mục dịch vụ trùng tên</w:t>
             </w:r>
           </w:p>
         </w:tc>
@@ -1940,7 +1992,7 @@
           </w:tcPr>
           <w:p>
             <w:r>
-              <w:t>Staging</w:t>
+              <w:t>Local + SQL Server (Dev)</w:t>
             </w:r>
           </w:p>
         </w:tc>
@@ -1950,7 +2002,7 @@
           </w:tcPr>
           <w:p>
             <w:r>
-              <w:t>Thiếu kiểm tra xác thực ở action quản trị</w:t>
+              <w:t>ServiceCategoriesController chưa kiểm tra unique CategoryName trước khi lưu</w:t>
             </w:r>
           </w:p>
         </w:tc>
@@ -1960,7 +2012,7 @@
           </w:tcPr>
           <w:p>
             <w:r>
-              <w:t>Bổ sung Authorize và kiểm tra quyền ở controller</w:t>
+              <w:t>Bổ sung kiểm tra trùng tên (case-insensitive) trước SaveChanges</w:t>
             </w:r>
           </w:p>
         </w:tc>
@@ -1970,7 +2022,7 @@
           </w:tcPr>
           <w:p>
             <w:r>
-              <w:t>Đã chặn truy cập trái phép</w:t>
+              <w:t>Đã xác nhận chặn tạo danh mục trùng</w:t>
             </w:r>
           </w:p>
         </w:tc>
@@ -1982,7 +2034,7 @@
           </w:tcPr>
           <w:p>
             <w:r>
-              <w:t>Cho phép thêm danh mục trùng tên</w:t>
+              <w:t>Chưa có chức năng đổi mật khẩu cho tài khoản nội bộ</w:t>
             </w:r>
           </w:p>
         </w:tc>
@@ -1992,7 +2044,7 @@
           </w:tcPr>
           <w:p>
             <w:r>
-              <w:t>Local/Staging</w:t>
+              <w:t>UAT</w:t>
             </w:r>
           </w:p>
         </w:tc>
@@ -2002,7 +2054,7 @@
           </w:tcPr>
           <w:p>
             <w:r>
-              <w:t>Thiếu validate unique theo tên danh mục</w:t>
+              <w:t>Thiếu màn hình + API xử lý cập nhật PasswordHash</w:t>
             </w:r>
           </w:p>
         </w:tc>
@@ -2012,7 +2064,7 @@
           </w:tcPr>
           <w:p>
             <w:r>
-              <w:t>Thêm kiểm tra trùng trước khi insert</w:t>
+              <w:t>Thiết kế luồng Change Password (xác thực mật khẩu cũ, hash mật khẩu mới)</w:t>
             </w:r>
           </w:p>
         </w:tc>
@@ -2022,7 +2074,7 @@
           </w:tcPr>
           <w:p>
             <w:r>
-              <w:t>Không thể thêm danh mục trùng</w:t>
+              <w:t>Sau khi bổ sung, test đổi mật khẩu PASS</w:t>
             </w:r>
           </w:p>
         </w:tc>
@@ -2034,7 +2086,7 @@
           </w:tcPr>
           <w:p>
             <w:r>
-              <w:t>API lấy sản phẩm theo ID không tồn tại trả mã chưa đúng</w:t>
+              <w:t>Thông báo khi khách vãng lai tạo lịch hẹn chưa thân thiện</w:t>
             </w:r>
           </w:p>
         </w:tc>
@@ -2044,7 +2096,7 @@
           </w:tcPr>
           <w:p>
             <w:r>
-              <w:t>Staging</w:t>
+              <w:t>UAT</w:t>
             </w:r>
           </w:p>
         </w:tc>
@@ -2054,7 +2106,7 @@
           </w:tcPr>
           <w:p>
             <w:r>
-              <w:t>Xử lý NotFound chưa thống nhất</w:t>
+              <w:t>Luồng hiện tại trả Challenge/redirect mặc định, chưa có message hướng dẫn</w:t>
             </w:r>
           </w:p>
         </w:tc>
@@ -2064,7 +2116,7 @@
           </w:tcPr>
           <w:p>
             <w:r>
-              <w:t>Chuẩn hóa trả về 404/NotFound</w:t>
+              <w:t>Thêm thông báo rõ ràng yêu cầu đăng nhập trước khi đặt lịch</w:t>
             </w:r>
           </w:p>
         </w:tc>
@@ -2074,7 +2126,7 @@
           </w:tcPr>
           <w:p>
             <w:r>
-              <w:t>API trả mã lỗi đúng chuẩn</w:t>
+              <w:t>Người dùng nhận thông báo rõ ràng, không còn phản hồi mơ hồ</w:t>
             </w:r>
           </w:p>
         </w:tc>

</xml_diff>